<commit_message>
Reconcile NBU internal rating to sA+ throughout
- Section 5.1: GCMS-derived internal rating sAA -> sA+ (pending approval)
- Section 6.1: internal-rating equivalent A- -> sA+ (pending approval)
  Now consistent with Sections 1.4

https://claude.ai/code/session_01PYCr32b9wrx828YEvdHCJ2
</commit_message>
<xml_diff>
--- a/NBU_Credit_Limit_Report_Jun_26.docx
+++ b/NBU_Credit_Limit_Report_Jun_26.docx
@@ -18231,7 +18231,7 @@
         <w:rPr>
           <w:color w:val="1A1A1A"/>
         </w:rPr>
-        <w:t>Internally, the bank's GCMS-derived rating is classified at sAA (investment-grade internal band), reflecting its sovereign link, stable financial trajectory, and systemic importance.</w:t>
+        <w:t>Internally, the bank's GCMS-derived rating is expected to be classified at sA+ (investment-grade internal band), pending final approval, reflecting its sovereign link, stable financial trajectory, and systemic importance.</w:t>
       </w:r>
     </w:p>
     <w:p>
@@ -19360,7 +19360,7 @@
                 <w:sz w:val="18"/>
                 <w:szCs w:val="18"/>
               </w:rPr>
-              <w:t>Ba3 / BB is equivalent to A- internal rating. Per ICBC internal rule, risk factor weight a = 18%.</w:t>
+              <w:t>Ba3 / BB corresponds to an internal rating of sA+ (pending final approval). Per ICBC internal rule, risk factor weight a = 18%.</w:t>
             </w:r>
           </w:p>
         </w:tc>

</xml_diff>

<commit_message>
Remove 2.4 asset-quality detail block and 2024 peer comparison table
- Section 2.4: remove the 'Asset quality and regulatory capital (detail)'
  subsection (heading, intro and detail table)
- Section 2.5: remove the '2024 KPI comparison (full year)' table,
  its intro and footnote

https://claude.ai/code/session_01PYCr32b9wrx828YEvdHCJ2
</commit_message>
<xml_diff>
--- a/NBU_Credit_Limit_Report_Jun_26.docx
+++ b/NBU_Credit_Limit_Report_Jun_26.docx
@@ -10679,1133 +10679,6 @@
     </w:p>
     <w:p>
       <w:pPr>
-        <w:spacing w:before="140" w:after="20"/>
-      </w:pPr>
-      <w:r>
-        <w:rPr>
-          <w:b/>
-          <w:bCs/>
-          <w:color w:val="1A3A5C"/>
-        </w:rPr>
-        <w:t>Asset quality and regulatory capital (detail)</w:t>
-      </w:r>
-    </w:p>
-    <w:p>
-      <w:pPr>
-        <w:spacing w:before="60" w:after="80"/>
-      </w:pPr>
-      <w:r>
-        <w:rPr>
-          <w:color w:val="1A1A1A"/>
-        </w:rPr>
-        <w:t>The table below sets out NBU’s asset-quality and regulatory-capital indicators in detail (the content previously shown in Section 2.5, now consolidated here). The non-performing loan (NPL) ratio is stated on the regulatory basis reported to the Central Bank of Uzbekistan (CBU) as of 1 January 2026. Where a 1 January 2026 bank-level figure is not separately published, the indicator is drawn from the reviewed IFRS interim financial statements for 2025 1H (30 June 2025) or the latest available CBU sector data, and is footnoted accordingly.</w:t>
-      </w:r>
-    </w:p>
-    <w:tbl>
-      <w:tblPr>
-        <w:tblW w:w="10080" w:type="dxa"/>
-        <w:tblBorders>
-          <w:top w:val="single" w:sz="4" w:space="0" w:color="2E4057"/>
-          <w:left w:val="single" w:sz="4" w:space="0" w:color="2E4057"/>
-          <w:bottom w:val="single" w:sz="4" w:space="0" w:color="2E4057"/>
-          <w:right w:val="single" w:sz="4" w:space="0" w:color="2E4057"/>
-          <w:insideH w:val="single" w:sz="4" w:space="0" w:color="2E4057"/>
-          <w:insideV w:val="single" w:sz="4" w:space="0" w:color="2E4057"/>
-        </w:tblBorders>
-        <w:tblLook w:val="04A0" w:firstRow="1" w:lastRow="0" w:firstColumn="1" w:lastColumn="0" w:noHBand="0" w:noVBand="1"/>
-      </w:tblPr>
-      <w:tblGrid>
-        <w:gridCol w:w="4680"/>
-        <w:gridCol w:w="1800"/>
-        <w:gridCol w:w="3600"/>
-      </w:tblGrid>
-      <w:tr>
-        <w:tc>
-          <w:tcPr>
-            <w:tcW w:w="4680" w:type="dxa"/>
-            <w:shd w:val="clear" w:color="auto" w:fill="2E4057"/>
-            <w:tcMar>
-              <w:top w:w="40" w:type="dxa"/>
-              <w:left w:w="100" w:type="dxa"/>
-              <w:bottom w:w="40" w:type="dxa"/>
-              <w:right w:w="100" w:type="dxa"/>
-            </w:tcMar>
-            <w:vAlign w:val="center"/>
-          </w:tcPr>
-          <w:p>
-            <w:pPr>
-              <w:spacing w:before="20" w:after="20"/>
-            </w:pPr>
-            <w:r>
-              <w:rPr>
-                <w:b/>
-                <w:bCs/>
-                <w:color w:val="FFFFFF"/>
-                <w:sz w:val="18"/>
-                <w:szCs w:val="18"/>
-              </w:rPr>
-              <w:t>Indicator</w:t>
-            </w:r>
-          </w:p>
-        </w:tc>
-        <w:tc>
-          <w:tcPr>
-            <w:tcW w:w="1800" w:type="dxa"/>
-            <w:shd w:val="clear" w:color="auto" w:fill="2E4057"/>
-            <w:tcMar>
-              <w:top w:w="40" w:type="dxa"/>
-              <w:left w:w="100" w:type="dxa"/>
-              <w:bottom w:w="40" w:type="dxa"/>
-              <w:right w:w="100" w:type="dxa"/>
-            </w:tcMar>
-            <w:vAlign w:val="center"/>
-          </w:tcPr>
-          <w:p>
-            <w:pPr>
-              <w:spacing w:before="20" w:after="20"/>
-              <w:jc w:val="right"/>
-            </w:pPr>
-            <w:r>
-              <w:rPr>
-                <w:b/>
-                <w:bCs/>
-                <w:color w:val="FFFFFF"/>
-                <w:sz w:val="18"/>
-                <w:szCs w:val="18"/>
-              </w:rPr>
-              <w:t>Value</w:t>
-            </w:r>
-          </w:p>
-        </w:tc>
-        <w:tc>
-          <w:tcPr>
-            <w:tcW w:w="3600" w:type="dxa"/>
-            <w:shd w:val="clear" w:color="auto" w:fill="2E4057"/>
-            <w:tcMar>
-              <w:top w:w="40" w:type="dxa"/>
-              <w:left w:w="100" w:type="dxa"/>
-              <w:bottom w:w="40" w:type="dxa"/>
-              <w:right w:w="100" w:type="dxa"/>
-            </w:tcMar>
-            <w:vAlign w:val="center"/>
-          </w:tcPr>
-          <w:p>
-            <w:pPr>
-              <w:spacing w:before="20" w:after="20"/>
-            </w:pPr>
-            <w:r>
-              <w:rPr>
-                <w:b/>
-                <w:bCs/>
-                <w:color w:val="FFFFFF"/>
-                <w:sz w:val="18"/>
-                <w:szCs w:val="18"/>
-              </w:rPr>
-              <w:t>Basis / source</w:t>
-            </w:r>
-          </w:p>
-        </w:tc>
-      </w:tr>
-      <w:tr>
-        <w:tc>
-          <w:tcPr>
-            <w:tcW w:w="4680" w:type="dxa"/>
-            <w:shd w:val="clear" w:color="auto" w:fill="FFFFFF"/>
-            <w:tcMar>
-              <w:top w:w="40" w:type="dxa"/>
-              <w:left w:w="100" w:type="dxa"/>
-              <w:bottom w:w="40" w:type="dxa"/>
-              <w:right w:w="100" w:type="dxa"/>
-            </w:tcMar>
-            <w:vAlign w:val="center"/>
-          </w:tcPr>
-          <w:p>
-            <w:pPr>
-              <w:spacing w:before="20" w:after="20"/>
-            </w:pPr>
-            <w:r>
-              <w:rPr>
-                <w:color w:val="1A1A1A"/>
-                <w:sz w:val="18"/>
-                <w:szCs w:val="18"/>
-              </w:rPr>
-              <w:lastRenderedPageBreak/>
-              <w:t>NPL ratio (regulatory basis)</w:t>
-            </w:r>
-          </w:p>
-        </w:tc>
-        <w:tc>
-          <w:tcPr>
-            <w:tcW w:w="1800" w:type="dxa"/>
-            <w:shd w:val="clear" w:color="auto" w:fill="FFFFFF"/>
-            <w:tcMar>
-              <w:top w:w="40" w:type="dxa"/>
-              <w:left w:w="100" w:type="dxa"/>
-              <w:bottom w:w="40" w:type="dxa"/>
-              <w:right w:w="100" w:type="dxa"/>
-            </w:tcMar>
-            <w:vAlign w:val="center"/>
-          </w:tcPr>
-          <w:p>
-            <w:pPr>
-              <w:spacing w:before="20" w:after="20"/>
-              <w:jc w:val="right"/>
-            </w:pPr>
-            <w:r>
-              <w:rPr>
-                <w:b/>
-                <w:bCs/>
-                <w:color w:val="1A1A1A"/>
-                <w:sz w:val="18"/>
-                <w:szCs w:val="18"/>
-              </w:rPr>
-              <w:t>2.8%</w:t>
-            </w:r>
-          </w:p>
-        </w:tc>
-        <w:tc>
-          <w:tcPr>
-            <w:tcW w:w="3600" w:type="dxa"/>
-            <w:shd w:val="clear" w:color="auto" w:fill="FFFFFF"/>
-            <w:tcMar>
-              <w:top w:w="40" w:type="dxa"/>
-              <w:left w:w="100" w:type="dxa"/>
-              <w:bottom w:w="40" w:type="dxa"/>
-              <w:right w:w="100" w:type="dxa"/>
-            </w:tcMar>
-            <w:vAlign w:val="center"/>
-          </w:tcPr>
-          <w:p>
-            <w:pPr>
-              <w:spacing w:before="20" w:after="20"/>
-            </w:pPr>
-            <w:r>
-              <w:rPr>
-                <w:color w:val="1A1A1A"/>
-                <w:sz w:val="18"/>
-                <w:szCs w:val="18"/>
-              </w:rPr>
-              <w:t>CBU; NBU-specific; as of 1 Jan 2026</w:t>
-            </w:r>
-          </w:p>
-        </w:tc>
-      </w:tr>
-      <w:tr>
-        <w:tc>
-          <w:tcPr>
-            <w:tcW w:w="4680" w:type="dxa"/>
-            <w:shd w:val="clear" w:color="auto" w:fill="FFFFFF"/>
-            <w:tcMar>
-              <w:top w:w="40" w:type="dxa"/>
-              <w:left w:w="100" w:type="dxa"/>
-              <w:bottom w:w="40" w:type="dxa"/>
-              <w:right w:w="100" w:type="dxa"/>
-            </w:tcMar>
-            <w:vAlign w:val="center"/>
-          </w:tcPr>
-          <w:p>
-            <w:pPr>
-              <w:spacing w:before="20" w:after="20"/>
-            </w:pPr>
-            <w:r>
-              <w:rPr>
-                <w:color w:val="1A1A1A"/>
-                <w:sz w:val="18"/>
-                <w:szCs w:val="18"/>
-              </w:rPr>
-              <w:t>Banking-sector NPL (memo)</w:t>
-            </w:r>
-          </w:p>
-        </w:tc>
-        <w:tc>
-          <w:tcPr>
-            <w:tcW w:w="1800" w:type="dxa"/>
-            <w:shd w:val="clear" w:color="auto" w:fill="FFFFFF"/>
-            <w:tcMar>
-              <w:top w:w="40" w:type="dxa"/>
-              <w:left w:w="100" w:type="dxa"/>
-              <w:bottom w:w="40" w:type="dxa"/>
-              <w:right w:w="100" w:type="dxa"/>
-            </w:tcMar>
-            <w:vAlign w:val="center"/>
-          </w:tcPr>
-          <w:p>
-            <w:pPr>
-              <w:spacing w:before="20" w:after="20"/>
-              <w:jc w:val="right"/>
-            </w:pPr>
-            <w:r>
-              <w:rPr>
-                <w:b/>
-                <w:bCs/>
-                <w:color w:val="1A1A1A"/>
-                <w:sz w:val="18"/>
-                <w:szCs w:val="18"/>
-              </w:rPr>
-              <w:t>4.1%</w:t>
-            </w:r>
-          </w:p>
-        </w:tc>
-        <w:tc>
-          <w:tcPr>
-            <w:tcW w:w="3600" w:type="dxa"/>
-            <w:shd w:val="clear" w:color="auto" w:fill="FFFFFF"/>
-            <w:tcMar>
-              <w:top w:w="40" w:type="dxa"/>
-              <w:left w:w="100" w:type="dxa"/>
-              <w:bottom w:w="40" w:type="dxa"/>
-              <w:right w:w="100" w:type="dxa"/>
-            </w:tcMar>
-            <w:vAlign w:val="center"/>
-          </w:tcPr>
-          <w:p>
-            <w:pPr>
-              <w:spacing w:before="20" w:after="20"/>
-            </w:pPr>
-            <w:r>
-              <w:rPr>
-                <w:color w:val="1A1A1A"/>
-                <w:sz w:val="18"/>
-                <w:szCs w:val="18"/>
-              </w:rPr>
-              <w:t>CBU; banking system; Dec 2025</w:t>
-            </w:r>
-          </w:p>
-        </w:tc>
-      </w:tr>
-      <w:tr>
-        <w:tc>
-          <w:tcPr>
-            <w:tcW w:w="4680" w:type="dxa"/>
-            <w:shd w:val="clear" w:color="auto" w:fill="FFFFFF"/>
-            <w:tcMar>
-              <w:top w:w="40" w:type="dxa"/>
-              <w:left w:w="100" w:type="dxa"/>
-              <w:bottom w:w="40" w:type="dxa"/>
-              <w:right w:w="100" w:type="dxa"/>
-            </w:tcMar>
-            <w:vAlign w:val="center"/>
-          </w:tcPr>
-          <w:p>
-            <w:pPr>
-              <w:spacing w:before="20" w:after="20"/>
-            </w:pPr>
-            <w:r>
-              <w:rPr>
-                <w:color w:val="1A1A1A"/>
-                <w:sz w:val="18"/>
-                <w:szCs w:val="18"/>
-              </w:rPr>
-              <w:t>IFRS Stage 3 loans / gross loans</w:t>
-            </w:r>
-          </w:p>
-        </w:tc>
-        <w:tc>
-          <w:tcPr>
-            <w:tcW w:w="1800" w:type="dxa"/>
-            <w:shd w:val="clear" w:color="auto" w:fill="FFFFFF"/>
-            <w:tcMar>
-              <w:top w:w="40" w:type="dxa"/>
-              <w:left w:w="100" w:type="dxa"/>
-              <w:bottom w:w="40" w:type="dxa"/>
-              <w:right w:w="100" w:type="dxa"/>
-            </w:tcMar>
-            <w:vAlign w:val="center"/>
-          </w:tcPr>
-          <w:p>
-            <w:pPr>
-              <w:spacing w:before="20" w:after="20"/>
-              <w:jc w:val="right"/>
-            </w:pPr>
-            <w:r>
-              <w:rPr>
-                <w:b/>
-                <w:bCs/>
-                <w:color w:val="1A1A1A"/>
-                <w:sz w:val="18"/>
-                <w:szCs w:val="18"/>
-              </w:rPr>
-              <w:t>4.2%</w:t>
-            </w:r>
-          </w:p>
-        </w:tc>
-        <w:tc>
-          <w:tcPr>
-            <w:tcW w:w="3600" w:type="dxa"/>
-            <w:shd w:val="clear" w:color="auto" w:fill="FFFFFF"/>
-            <w:tcMar>
-              <w:top w:w="40" w:type="dxa"/>
-              <w:left w:w="100" w:type="dxa"/>
-              <w:bottom w:w="40" w:type="dxa"/>
-              <w:right w:w="100" w:type="dxa"/>
-            </w:tcMar>
-            <w:vAlign w:val="center"/>
-          </w:tcPr>
-          <w:p>
-            <w:pPr>
-              <w:spacing w:before="20" w:after="20"/>
-            </w:pPr>
-            <w:r>
-              <w:rPr>
-                <w:color w:val="1A1A1A"/>
-                <w:sz w:val="18"/>
-                <w:szCs w:val="18"/>
-              </w:rPr>
-              <w:t>IFRS; reviewed 2025 1H (30 Jun 2025)</w:t>
-            </w:r>
-          </w:p>
-        </w:tc>
-      </w:tr>
-      <w:tr>
-        <w:tc>
-          <w:tcPr>
-            <w:tcW w:w="4680" w:type="dxa"/>
-            <w:shd w:val="clear" w:color="auto" w:fill="FFFFFF"/>
-            <w:tcMar>
-              <w:top w:w="40" w:type="dxa"/>
-              <w:left w:w="100" w:type="dxa"/>
-              <w:bottom w:w="40" w:type="dxa"/>
-              <w:right w:w="100" w:type="dxa"/>
-            </w:tcMar>
-            <w:vAlign w:val="center"/>
-          </w:tcPr>
-          <w:p>
-            <w:pPr>
-              <w:spacing w:before="20" w:after="20"/>
-            </w:pPr>
-            <w:r>
-              <w:rPr>
-                <w:color w:val="1A1A1A"/>
-                <w:sz w:val="18"/>
-                <w:szCs w:val="18"/>
-              </w:rPr>
-              <w:t>Loan-loss provision coverage</w:t>
-            </w:r>
-          </w:p>
-        </w:tc>
-        <w:tc>
-          <w:tcPr>
-            <w:tcW w:w="1800" w:type="dxa"/>
-            <w:shd w:val="clear" w:color="auto" w:fill="FFFFFF"/>
-            <w:tcMar>
-              <w:top w:w="40" w:type="dxa"/>
-              <w:left w:w="100" w:type="dxa"/>
-              <w:bottom w:w="40" w:type="dxa"/>
-              <w:right w:w="100" w:type="dxa"/>
-            </w:tcMar>
-            <w:vAlign w:val="center"/>
-          </w:tcPr>
-          <w:p>
-            <w:pPr>
-              <w:spacing w:before="20" w:after="20"/>
-              <w:jc w:val="right"/>
-            </w:pPr>
-            <w:r>
-              <w:rPr>
-                <w:b/>
-                <w:bCs/>
-                <w:color w:val="1A1A1A"/>
-                <w:sz w:val="18"/>
-                <w:szCs w:val="18"/>
-              </w:rPr>
-              <w:t>5.6%</w:t>
-            </w:r>
-          </w:p>
-        </w:tc>
-        <w:tc>
-          <w:tcPr>
-            <w:tcW w:w="3600" w:type="dxa"/>
-            <w:shd w:val="clear" w:color="auto" w:fill="FFFFFF"/>
-            <w:tcMar>
-              <w:top w:w="40" w:type="dxa"/>
-              <w:left w:w="100" w:type="dxa"/>
-              <w:bottom w:w="40" w:type="dxa"/>
-              <w:right w:w="100" w:type="dxa"/>
-            </w:tcMar>
-            <w:vAlign w:val="center"/>
-          </w:tcPr>
-          <w:p>
-            <w:pPr>
-              <w:spacing w:before="20" w:after="20"/>
-            </w:pPr>
-            <w:r>
-              <w:rPr>
-                <w:color w:val="1A1A1A"/>
-                <w:sz w:val="18"/>
-                <w:szCs w:val="18"/>
-              </w:rPr>
-              <w:t>Provisions / gross loans; statutory; FY2025</w:t>
-            </w:r>
-          </w:p>
-        </w:tc>
-      </w:tr>
-      <w:tr>
-        <w:tc>
-          <w:tcPr>
-            <w:tcW w:w="4680" w:type="dxa"/>
-            <w:shd w:val="clear" w:color="auto" w:fill="FFFFFF"/>
-            <w:tcMar>
-              <w:top w:w="40" w:type="dxa"/>
-              <w:left w:w="100" w:type="dxa"/>
-              <w:bottom w:w="40" w:type="dxa"/>
-              <w:right w:w="100" w:type="dxa"/>
-            </w:tcMar>
-            <w:vAlign w:val="center"/>
-          </w:tcPr>
-          <w:p>
-            <w:pPr>
-              <w:spacing w:before="20" w:after="20"/>
-            </w:pPr>
-            <w:r>
-              <w:rPr>
-                <w:color w:val="1A1A1A"/>
-                <w:sz w:val="18"/>
-                <w:szCs w:val="18"/>
-              </w:rPr>
-              <w:t>Total capital / total assets</w:t>
-            </w:r>
-          </w:p>
-        </w:tc>
-        <w:tc>
-          <w:tcPr>
-            <w:tcW w:w="1800" w:type="dxa"/>
-            <w:shd w:val="clear" w:color="auto" w:fill="FFFFFF"/>
-            <w:tcMar>
-              <w:top w:w="40" w:type="dxa"/>
-              <w:left w:w="100" w:type="dxa"/>
-              <w:bottom w:w="40" w:type="dxa"/>
-              <w:right w:w="100" w:type="dxa"/>
-            </w:tcMar>
-            <w:vAlign w:val="center"/>
-          </w:tcPr>
-          <w:p>
-            <w:pPr>
-              <w:spacing w:before="20" w:after="20"/>
-              <w:jc w:val="right"/>
-            </w:pPr>
-            <w:r>
-              <w:rPr>
-                <w:b/>
-                <w:bCs/>
-                <w:color w:val="1A1A1A"/>
-                <w:sz w:val="18"/>
-                <w:szCs w:val="18"/>
-              </w:rPr>
-              <w:t>14.5%</w:t>
-            </w:r>
-          </w:p>
-        </w:tc>
-        <w:tc>
-          <w:tcPr>
-            <w:tcW w:w="3600" w:type="dxa"/>
-            <w:shd w:val="clear" w:color="auto" w:fill="FFFFFF"/>
-            <w:tcMar>
-              <w:top w:w="40" w:type="dxa"/>
-              <w:left w:w="100" w:type="dxa"/>
-              <w:bottom w:w="40" w:type="dxa"/>
-              <w:right w:w="100" w:type="dxa"/>
-            </w:tcMar>
-            <w:vAlign w:val="center"/>
-          </w:tcPr>
-          <w:p>
-            <w:pPr>
-              <w:spacing w:before="20" w:after="20"/>
-            </w:pPr>
-            <w:r>
-              <w:rPr>
-                <w:color w:val="1A1A1A"/>
-                <w:sz w:val="18"/>
-                <w:szCs w:val="18"/>
-              </w:rPr>
-              <w:t>IFRS; 30 Jun 2025 (NBU-specific)</w:t>
-            </w:r>
-          </w:p>
-        </w:tc>
-      </w:tr>
-      <w:tr>
-        <w:tc>
-          <w:tcPr>
-            <w:tcW w:w="4680" w:type="dxa"/>
-            <w:shd w:val="clear" w:color="auto" w:fill="FFFFFF"/>
-            <w:tcMar>
-              <w:top w:w="40" w:type="dxa"/>
-              <w:left w:w="100" w:type="dxa"/>
-              <w:bottom w:w="40" w:type="dxa"/>
-              <w:right w:w="100" w:type="dxa"/>
-            </w:tcMar>
-            <w:vAlign w:val="center"/>
-          </w:tcPr>
-          <w:p>
-            <w:pPr>
-              <w:spacing w:before="20" w:after="20"/>
-            </w:pPr>
-            <w:r>
-              <w:rPr>
-                <w:color w:val="1A1A1A"/>
-                <w:sz w:val="18"/>
-                <w:szCs w:val="18"/>
-              </w:rPr>
-              <w:t>Fitch Core Capital ratio</w:t>
-            </w:r>
-          </w:p>
-        </w:tc>
-        <w:tc>
-          <w:tcPr>
-            <w:tcW w:w="1800" w:type="dxa"/>
-            <w:shd w:val="clear" w:color="auto" w:fill="FFFFFF"/>
-            <w:tcMar>
-              <w:top w:w="40" w:type="dxa"/>
-              <w:left w:w="100" w:type="dxa"/>
-              <w:bottom w:w="40" w:type="dxa"/>
-              <w:right w:w="100" w:type="dxa"/>
-            </w:tcMar>
-            <w:vAlign w:val="center"/>
-          </w:tcPr>
-          <w:p>
-            <w:pPr>
-              <w:spacing w:before="20" w:after="20"/>
-              <w:jc w:val="right"/>
-            </w:pPr>
-            <w:r>
-              <w:rPr>
-                <w:b/>
-                <w:bCs/>
-                <w:color w:val="1A1A1A"/>
-                <w:sz w:val="18"/>
-                <w:szCs w:val="18"/>
-              </w:rPr>
-              <w:t>&gt;20%</w:t>
-            </w:r>
-          </w:p>
-        </w:tc>
-        <w:tc>
-          <w:tcPr>
-            <w:tcW w:w="3600" w:type="dxa"/>
-            <w:shd w:val="clear" w:color="auto" w:fill="FFFFFF"/>
-            <w:tcMar>
-              <w:top w:w="40" w:type="dxa"/>
-              <w:left w:w="100" w:type="dxa"/>
-              <w:bottom w:w="40" w:type="dxa"/>
-              <w:right w:w="100" w:type="dxa"/>
-            </w:tcMar>
-            <w:vAlign w:val="center"/>
-          </w:tcPr>
-          <w:p>
-            <w:pPr>
-              <w:spacing w:before="20" w:after="20"/>
-            </w:pPr>
-            <w:r>
-              <w:rPr>
-                <w:color w:val="1A1A1A"/>
-                <w:sz w:val="18"/>
-                <w:szCs w:val="18"/>
-              </w:rPr>
-              <w:t>Fitch estimate; 2024-2025 (NBU-specific)</w:t>
-            </w:r>
-          </w:p>
-        </w:tc>
-      </w:tr>
-      <w:tr>
-        <w:tc>
-          <w:tcPr>
-            <w:tcW w:w="4680" w:type="dxa"/>
-            <w:shd w:val="clear" w:color="auto" w:fill="FFFFFF"/>
-            <w:tcMar>
-              <w:top w:w="40" w:type="dxa"/>
-              <w:left w:w="100" w:type="dxa"/>
-              <w:bottom w:w="40" w:type="dxa"/>
-              <w:right w:w="100" w:type="dxa"/>
-            </w:tcMar>
-            <w:vAlign w:val="center"/>
-          </w:tcPr>
-          <w:p>
-            <w:pPr>
-              <w:spacing w:before="20" w:after="20"/>
-            </w:pPr>
-            <w:r>
-              <w:rPr>
-                <w:color w:val="1A1A1A"/>
-                <w:sz w:val="18"/>
-                <w:szCs w:val="18"/>
-              </w:rPr>
-              <w:t>NBU CAR / Tier 1 (FID estimate)</w:t>
-            </w:r>
-          </w:p>
-        </w:tc>
-        <w:tc>
-          <w:tcPr>
-            <w:tcW w:w="1800" w:type="dxa"/>
-            <w:shd w:val="clear" w:color="auto" w:fill="FFFFFF"/>
-            <w:tcMar>
-              <w:top w:w="40" w:type="dxa"/>
-              <w:left w:w="100" w:type="dxa"/>
-              <w:bottom w:w="40" w:type="dxa"/>
-              <w:right w:w="100" w:type="dxa"/>
-            </w:tcMar>
-            <w:vAlign w:val="center"/>
-          </w:tcPr>
-          <w:p>
-            <w:pPr>
-              <w:spacing w:before="20" w:after="20"/>
-              <w:jc w:val="right"/>
-            </w:pPr>
-            <w:r>
-              <w:rPr>
-                <w:b/>
-                <w:bCs/>
-                <w:color w:val="1A1A1A"/>
-                <w:sz w:val="18"/>
-                <w:szCs w:val="18"/>
-              </w:rPr>
-              <w:t>18.2% / 16.9%</w:t>
-            </w:r>
-          </w:p>
-        </w:tc>
-        <w:tc>
-          <w:tcPr>
-            <w:tcW w:w="3600" w:type="dxa"/>
-            <w:shd w:val="clear" w:color="auto" w:fill="FFFFFF"/>
-            <w:tcMar>
-              <w:top w:w="40" w:type="dxa"/>
-              <w:left w:w="100" w:type="dxa"/>
-              <w:bottom w:w="40" w:type="dxa"/>
-              <w:right w:w="100" w:type="dxa"/>
-            </w:tcMar>
-            <w:vAlign w:val="center"/>
-          </w:tcPr>
-          <w:p>
-            <w:pPr>
-              <w:spacing w:before="20" w:after="20"/>
-            </w:pPr>
-            <w:r>
-              <w:rPr>
-                <w:color w:val="1A1A1A"/>
-                <w:sz w:val="18"/>
-                <w:szCs w:val="18"/>
-              </w:rPr>
-              <w:t>FID estimate per Section 2.5 methodology; CBU returns to confirm</w:t>
-            </w:r>
-          </w:p>
-        </w:tc>
-      </w:tr>
-      <w:tr>
-        <w:tc>
-          <w:tcPr>
-            <w:tcW w:w="4680" w:type="dxa"/>
-            <w:shd w:val="clear" w:color="auto" w:fill="FFFFFF"/>
-            <w:tcMar>
-              <w:top w:w="40" w:type="dxa"/>
-              <w:left w:w="100" w:type="dxa"/>
-              <w:bottom w:w="40" w:type="dxa"/>
-              <w:right w:w="100" w:type="dxa"/>
-            </w:tcMar>
-            <w:vAlign w:val="center"/>
-          </w:tcPr>
-          <w:p>
-            <w:pPr>
-              <w:spacing w:before="20" w:after="20"/>
-            </w:pPr>
-            <w:r>
-              <w:rPr>
-                <w:color w:val="1A1A1A"/>
-                <w:sz w:val="18"/>
-                <w:szCs w:val="18"/>
-              </w:rPr>
-              <w:t>NBU LCR / NSFR (FID estimate)</w:t>
-            </w:r>
-          </w:p>
-        </w:tc>
-        <w:tc>
-          <w:tcPr>
-            <w:tcW w:w="1800" w:type="dxa"/>
-            <w:shd w:val="clear" w:color="auto" w:fill="FFFFFF"/>
-            <w:tcMar>
-              <w:top w:w="40" w:type="dxa"/>
-              <w:left w:w="100" w:type="dxa"/>
-              <w:bottom w:w="40" w:type="dxa"/>
-              <w:right w:w="100" w:type="dxa"/>
-            </w:tcMar>
-            <w:vAlign w:val="center"/>
-          </w:tcPr>
-          <w:p>
-            <w:pPr>
-              <w:spacing w:before="20" w:after="20"/>
-              <w:jc w:val="right"/>
-            </w:pPr>
-            <w:r>
-              <w:rPr>
-                <w:b/>
-                <w:bCs/>
-                <w:color w:val="1A1A1A"/>
-                <w:sz w:val="18"/>
-                <w:szCs w:val="18"/>
-              </w:rPr>
-              <w:t>~520% / ~115%</w:t>
-            </w:r>
-          </w:p>
-        </w:tc>
-        <w:tc>
-          <w:tcPr>
-            <w:tcW w:w="3600" w:type="dxa"/>
-            <w:shd w:val="clear" w:color="auto" w:fill="FFFFFF"/>
-            <w:tcMar>
-              <w:top w:w="40" w:type="dxa"/>
-              <w:left w:w="100" w:type="dxa"/>
-              <w:bottom w:w="40" w:type="dxa"/>
-              <w:right w:w="100" w:type="dxa"/>
-            </w:tcMar>
-            <w:vAlign w:val="center"/>
-          </w:tcPr>
-          <w:p>
-            <w:pPr>
-              <w:spacing w:before="20" w:after="20"/>
-            </w:pPr>
-            <w:r>
-              <w:rPr>
-                <w:color w:val="1A1A1A"/>
-                <w:sz w:val="18"/>
-                <w:szCs w:val="18"/>
-              </w:rPr>
-              <w:t>FID estimate; CBU bank-level returns to confirm</w:t>
-            </w:r>
-          </w:p>
-        </w:tc>
-      </w:tr>
-      <w:tr>
-        <w:tc>
-          <w:tcPr>
-            <w:tcW w:w="4680" w:type="dxa"/>
-            <w:shd w:val="clear" w:color="auto" w:fill="FFFFFF"/>
-            <w:tcMar>
-              <w:top w:w="40" w:type="dxa"/>
-              <w:left w:w="100" w:type="dxa"/>
-              <w:bottom w:w="40" w:type="dxa"/>
-              <w:right w:w="100" w:type="dxa"/>
-            </w:tcMar>
-            <w:vAlign w:val="center"/>
-          </w:tcPr>
-          <w:p>
-            <w:pPr>
-              <w:spacing w:before="20" w:after="20"/>
-            </w:pPr>
-            <w:r>
-              <w:rPr>
-                <w:color w:val="1A1A1A"/>
-                <w:sz w:val="18"/>
-                <w:szCs w:val="18"/>
-              </w:rPr>
-              <w:t>Return on assets (ROA)</w:t>
-            </w:r>
-          </w:p>
-        </w:tc>
-        <w:tc>
-          <w:tcPr>
-            <w:tcW w:w="1800" w:type="dxa"/>
-            <w:shd w:val="clear" w:color="auto" w:fill="FFFFFF"/>
-            <w:tcMar>
-              <w:top w:w="40" w:type="dxa"/>
-              <w:left w:w="100" w:type="dxa"/>
-              <w:bottom w:w="40" w:type="dxa"/>
-              <w:right w:w="100" w:type="dxa"/>
-            </w:tcMar>
-            <w:vAlign w:val="center"/>
-          </w:tcPr>
-          <w:p>
-            <w:pPr>
-              <w:spacing w:before="20" w:after="20"/>
-              <w:jc w:val="right"/>
-            </w:pPr>
-            <w:r>
-              <w:rPr>
-                <w:b/>
-                <w:bCs/>
-                <w:color w:val="1A1A1A"/>
-                <w:sz w:val="18"/>
-                <w:szCs w:val="18"/>
-              </w:rPr>
-              <w:t>1.3%</w:t>
-            </w:r>
-          </w:p>
-        </w:tc>
-        <w:tc>
-          <w:tcPr>
-            <w:tcW w:w="3600" w:type="dxa"/>
-            <w:shd w:val="clear" w:color="auto" w:fill="FFFFFF"/>
-            <w:tcMar>
-              <w:top w:w="40" w:type="dxa"/>
-              <w:left w:w="100" w:type="dxa"/>
-              <w:bottom w:w="40" w:type="dxa"/>
-              <w:right w:w="100" w:type="dxa"/>
-            </w:tcMar>
-            <w:vAlign w:val="center"/>
-          </w:tcPr>
-          <w:p>
-            <w:pPr>
-              <w:spacing w:before="20" w:after="20"/>
-            </w:pPr>
-            <w:r>
-              <w:rPr>
-                <w:color w:val="1A1A1A"/>
-                <w:sz w:val="18"/>
-                <w:szCs w:val="18"/>
-              </w:rPr>
-              <w:t>NBU; FY2025 (statutory net profit / assets)</w:t>
-            </w:r>
-          </w:p>
-        </w:tc>
-      </w:tr>
-      <w:tr>
-        <w:tc>
-          <w:tcPr>
-            <w:tcW w:w="4680" w:type="dxa"/>
-            <w:shd w:val="clear" w:color="auto" w:fill="FFFFFF"/>
-            <w:tcMar>
-              <w:top w:w="40" w:type="dxa"/>
-              <w:left w:w="100" w:type="dxa"/>
-              <w:bottom w:w="40" w:type="dxa"/>
-              <w:right w:w="100" w:type="dxa"/>
-            </w:tcMar>
-            <w:vAlign w:val="center"/>
-          </w:tcPr>
-          <w:p>
-            <w:pPr>
-              <w:spacing w:before="20" w:after="20"/>
-            </w:pPr>
-            <w:r>
-              <w:rPr>
-                <w:color w:val="1A1A1A"/>
-                <w:sz w:val="18"/>
-                <w:szCs w:val="18"/>
-              </w:rPr>
-              <w:t>Return on equity (ROE)</w:t>
-            </w:r>
-          </w:p>
-        </w:tc>
-        <w:tc>
-          <w:tcPr>
-            <w:tcW w:w="1800" w:type="dxa"/>
-            <w:shd w:val="clear" w:color="auto" w:fill="FFFFFF"/>
-            <w:tcMar>
-              <w:top w:w="40" w:type="dxa"/>
-              <w:left w:w="100" w:type="dxa"/>
-              <w:bottom w:w="40" w:type="dxa"/>
-              <w:right w:w="100" w:type="dxa"/>
-            </w:tcMar>
-            <w:vAlign w:val="center"/>
-          </w:tcPr>
-          <w:p>
-            <w:pPr>
-              <w:spacing w:before="20" w:after="20"/>
-              <w:jc w:val="right"/>
-            </w:pPr>
-            <w:r>
-              <w:rPr>
-                <w:b/>
-                <w:bCs/>
-                <w:color w:val="1A1A1A"/>
-                <w:sz w:val="18"/>
-                <w:szCs w:val="18"/>
-              </w:rPr>
-              <w:t>9.6%</w:t>
-            </w:r>
-          </w:p>
-        </w:tc>
-        <w:tc>
-          <w:tcPr>
-            <w:tcW w:w="3600" w:type="dxa"/>
-            <w:shd w:val="clear" w:color="auto" w:fill="FFFFFF"/>
-            <w:tcMar>
-              <w:top w:w="40" w:type="dxa"/>
-              <w:left w:w="100" w:type="dxa"/>
-              <w:bottom w:w="40" w:type="dxa"/>
-              <w:right w:w="100" w:type="dxa"/>
-            </w:tcMar>
-            <w:vAlign w:val="center"/>
-          </w:tcPr>
-          <w:p>
-            <w:pPr>
-              <w:spacing w:before="20" w:after="20"/>
-            </w:pPr>
-            <w:r>
-              <w:rPr>
-                <w:color w:val="1A1A1A"/>
-                <w:sz w:val="18"/>
-                <w:szCs w:val="18"/>
-              </w:rPr>
-              <w:t>NBU; FY2025 (statutory net profit / equity)</w:t>
-            </w:r>
-          </w:p>
-        </w:tc>
-      </w:tr>
-      <w:tr>
-        <w:tc>
-          <w:tcPr>
-            <w:tcW w:w="4680" w:type="dxa"/>
-            <w:shd w:val="clear" w:color="auto" w:fill="FFFFFF"/>
-            <w:tcMar>
-              <w:top w:w="40" w:type="dxa"/>
-              <w:left w:w="100" w:type="dxa"/>
-              <w:bottom w:w="40" w:type="dxa"/>
-              <w:right w:w="100" w:type="dxa"/>
-            </w:tcMar>
-            <w:vAlign w:val="center"/>
-          </w:tcPr>
-          <w:p>
-            <w:pPr>
-              <w:spacing w:before="20" w:after="20"/>
-            </w:pPr>
-            <w:r>
-              <w:rPr>
-                <w:color w:val="1A1A1A"/>
-                <w:sz w:val="18"/>
-                <w:szCs w:val="18"/>
-              </w:rPr>
-              <w:t>Banking-sector ROA (memo)</w:t>
-            </w:r>
-          </w:p>
-        </w:tc>
-        <w:tc>
-          <w:tcPr>
-            <w:tcW w:w="1800" w:type="dxa"/>
-            <w:shd w:val="clear" w:color="auto" w:fill="FFFFFF"/>
-            <w:tcMar>
-              <w:top w:w="40" w:type="dxa"/>
-              <w:left w:w="100" w:type="dxa"/>
-              <w:bottom w:w="40" w:type="dxa"/>
-              <w:right w:w="100" w:type="dxa"/>
-            </w:tcMar>
-            <w:vAlign w:val="center"/>
-          </w:tcPr>
-          <w:p>
-            <w:pPr>
-              <w:spacing w:before="20" w:after="20"/>
-              <w:jc w:val="right"/>
-            </w:pPr>
-            <w:r>
-              <w:rPr>
-                <w:b/>
-                <w:bCs/>
-                <w:color w:val="1A1A1A"/>
-                <w:sz w:val="18"/>
-                <w:szCs w:val="18"/>
-              </w:rPr>
-              <w:t>2.2%</w:t>
-            </w:r>
-          </w:p>
-        </w:tc>
-        <w:tc>
-          <w:tcPr>
-            <w:tcW w:w="3600" w:type="dxa"/>
-            <w:shd w:val="clear" w:color="auto" w:fill="FFFFFF"/>
-            <w:tcMar>
-              <w:top w:w="40" w:type="dxa"/>
-              <w:left w:w="100" w:type="dxa"/>
-              <w:bottom w:w="40" w:type="dxa"/>
-              <w:right w:w="100" w:type="dxa"/>
-            </w:tcMar>
-            <w:vAlign w:val="center"/>
-          </w:tcPr>
-          <w:p>
-            <w:pPr>
-              <w:spacing w:before="20" w:after="20"/>
-            </w:pPr>
-            <w:r>
-              <w:rPr>
-                <w:color w:val="1A1A1A"/>
-                <w:sz w:val="18"/>
-                <w:szCs w:val="18"/>
-              </w:rPr>
-              <w:t>CBU; banking system; as of 1 Jan 2026</w:t>
-            </w:r>
-          </w:p>
-        </w:tc>
-      </w:tr>
-      <w:tr>
-        <w:tc>
-          <w:tcPr>
-            <w:tcW w:w="4680" w:type="dxa"/>
-            <w:shd w:val="clear" w:color="auto" w:fill="FFFFFF"/>
-            <w:tcMar>
-              <w:top w:w="40" w:type="dxa"/>
-              <w:left w:w="100" w:type="dxa"/>
-              <w:bottom w:w="40" w:type="dxa"/>
-              <w:right w:w="100" w:type="dxa"/>
-            </w:tcMar>
-            <w:vAlign w:val="center"/>
-          </w:tcPr>
-          <w:p>
-            <w:pPr>
-              <w:spacing w:before="20" w:after="20"/>
-            </w:pPr>
-            <w:r>
-              <w:rPr>
-                <w:color w:val="1A1A1A"/>
-                <w:sz w:val="18"/>
-                <w:szCs w:val="18"/>
-              </w:rPr>
-              <w:t>Sector CAR / Tier 1 / CET1 (memo)</w:t>
-            </w:r>
-          </w:p>
-        </w:tc>
-        <w:tc>
-          <w:tcPr>
-            <w:tcW w:w="1800" w:type="dxa"/>
-            <w:shd w:val="clear" w:color="auto" w:fill="FFFFFF"/>
-            <w:tcMar>
-              <w:top w:w="40" w:type="dxa"/>
-              <w:left w:w="100" w:type="dxa"/>
-              <w:bottom w:w="40" w:type="dxa"/>
-              <w:right w:w="100" w:type="dxa"/>
-            </w:tcMar>
-            <w:vAlign w:val="center"/>
-          </w:tcPr>
-          <w:p>
-            <w:pPr>
-              <w:spacing w:before="20" w:after="20"/>
-              <w:jc w:val="right"/>
-            </w:pPr>
-            <w:r>
-              <w:rPr>
-                <w:b/>
-                <w:bCs/>
-                <w:color w:val="1A1A1A"/>
-                <w:sz w:val="18"/>
-                <w:szCs w:val="18"/>
-              </w:rPr>
-              <w:t>18.3% / 15.2% / 14.7%</w:t>
-            </w:r>
-          </w:p>
-        </w:tc>
-        <w:tc>
-          <w:tcPr>
-            <w:tcW w:w="3600" w:type="dxa"/>
-            <w:shd w:val="clear" w:color="auto" w:fill="FFFFFF"/>
-            <w:tcMar>
-              <w:top w:w="40" w:type="dxa"/>
-              <w:left w:w="100" w:type="dxa"/>
-              <w:bottom w:w="40" w:type="dxa"/>
-              <w:right w:w="100" w:type="dxa"/>
-            </w:tcMar>
-            <w:vAlign w:val="center"/>
-          </w:tcPr>
-          <w:p>
-            <w:pPr>
-              <w:spacing w:before="20" w:after="20"/>
-            </w:pPr>
-            <w:r>
-              <w:rPr>
-                <w:color w:val="1A1A1A"/>
-                <w:sz w:val="18"/>
-                <w:szCs w:val="18"/>
-              </w:rPr>
-              <w:t>CBU; banking system; Dec 2025</w:t>
-            </w:r>
-          </w:p>
-        </w:tc>
-      </w:tr>
-    </w:tbl>
-    <w:p>
-      <w:pPr>
         <w:spacing w:before="60" w:after="80"/>
       </w:pPr>
       <w:r>
@@ -14845,2336 +13718,6 @@
           <w:szCs w:val="16"/>
         </w:rPr>
         <w:t>¹ NBU NPL is shown on the IFRS Stage 3 / gross-loans basis (4.2%) for comparability with peers; NBU’s regulatory NPL reported to the CBU is 2.8%, and the 5.6% figure cited elsewhere is the provision-to-gross-loans coverage ratio (not an NPL ratio). ² Agrobank reported-period net interest income is not reliably disclosed and is marked n.a. * LCR/NSFR are FID estimates derived from maturity-analysis disclosures; actual CBU-calculated ratios may differ. Basis: all three banks are shown on a 2025 1H basis as at 30 June 2025 — NBU = reviewed interim IFRS FS (six months to 30 June 2025); SQB = 2025 H1 (internal accounting); Agrobank = 2025 H1 IFRS (EY-reviewed, 30 Jun 2025). NBU net profit and net interest income are six-month figures; the annualised net-profit line and the ROE, ROA and NIM ratios annualise the six-month result (×2) for a like-for-like comparison with the peers’ annualised figures. NBU’s YoY loan portfolio growth is shown as the movement over the six months from 31 December 2024. FX uniform at USD/UZS = 12,150. Source: attached Peer Comparison KPI workbook; Central Bank of Uzbekistan; banks’ financial statements.</w:t>
-      </w:r>
-    </w:p>
-    <w:p>
-      <w:pPr>
-        <w:spacing w:before="160" w:after="20"/>
-      </w:pPr>
-      <w:r>
-        <w:rPr>
-          <w:b/>
-          <w:bCs/>
-          <w:color w:val="1A3A5C"/>
-        </w:rPr>
-        <w:t>2024 KPI comparison (full year)</w:t>
-      </w:r>
-    </w:p>
-    <w:p>
-      <w:pPr>
-        <w:spacing w:before="60" w:after="80"/>
-      </w:pPr>
-      <w:r>
-        <w:rPr>
-          <w:color w:val="1A1A1A"/>
-        </w:rPr>
-        <w:lastRenderedPageBreak/>
-        <w:t>The table below provides the corresponding full-year 2024 comparison across the three banks. Several peer prudential metrics (NPL, capital ratios, NIM and liquidity ratios) are not uniformly disclosed for FY2024 and are marked n.a.; profitability, scale and selected ratios are shown where reliably available.</w:t>
-      </w:r>
-    </w:p>
-    <w:tbl>
-      <w:tblPr>
-        <w:tblW w:w="10080" w:type="dxa"/>
-        <w:tblBorders>
-          <w:top w:val="single" w:sz="4" w:space="0" w:color="2E4057"/>
-          <w:left w:val="single" w:sz="4" w:space="0" w:color="2E4057"/>
-          <w:bottom w:val="single" w:sz="4" w:space="0" w:color="2E4057"/>
-          <w:right w:val="single" w:sz="4" w:space="0" w:color="2E4057"/>
-          <w:insideH w:val="single" w:sz="4" w:space="0" w:color="2E4057"/>
-          <w:insideV w:val="single" w:sz="4" w:space="0" w:color="2E4057"/>
-        </w:tblBorders>
-        <w:tblLook w:val="04A0" w:firstRow="1" w:lastRow="0" w:firstColumn="1" w:lastColumn="0" w:noHBand="0" w:noVBand="1"/>
-      </w:tblPr>
-      <w:tblGrid>
-        <w:gridCol w:w="3480"/>
-        <w:gridCol w:w="2200"/>
-        <w:gridCol w:w="2200"/>
-        <w:gridCol w:w="2200"/>
-      </w:tblGrid>
-      <w:tr>
-        <w:tc>
-          <w:tcPr>
-            <w:tcW w:w="3480" w:type="dxa"/>
-            <w:shd w:val="clear" w:color="auto" w:fill="2E4057"/>
-            <w:tcMar>
-              <w:top w:w="40" w:type="dxa"/>
-              <w:left w:w="100" w:type="dxa"/>
-              <w:bottom w:w="40" w:type="dxa"/>
-              <w:right w:w="100" w:type="dxa"/>
-            </w:tcMar>
-            <w:vAlign w:val="center"/>
-          </w:tcPr>
-          <w:p>
-            <w:pPr>
-              <w:spacing w:before="20" w:after="20"/>
-            </w:pPr>
-            <w:r>
-              <w:rPr>
-                <w:b/>
-                <w:bCs/>
-                <w:color w:val="FFFFFF"/>
-                <w:sz w:val="18"/>
-                <w:szCs w:val="18"/>
-              </w:rPr>
-              <w:t>Indicator</w:t>
-            </w:r>
-          </w:p>
-        </w:tc>
-        <w:tc>
-          <w:tcPr>
-            <w:tcW w:w="2200" w:type="dxa"/>
-            <w:shd w:val="clear" w:color="auto" w:fill="2E4057"/>
-            <w:tcMar>
-              <w:top w:w="40" w:type="dxa"/>
-              <w:left w:w="100" w:type="dxa"/>
-              <w:bottom w:w="40" w:type="dxa"/>
-              <w:right w:w="100" w:type="dxa"/>
-            </w:tcMar>
-            <w:vAlign w:val="center"/>
-          </w:tcPr>
-          <w:p>
-            <w:pPr>
-              <w:spacing w:before="20" w:after="20"/>
-              <w:jc w:val="right"/>
-            </w:pPr>
-            <w:r>
-              <w:rPr>
-                <w:b/>
-                <w:bCs/>
-                <w:color w:val="FFFFFF"/>
-                <w:sz w:val="18"/>
-                <w:szCs w:val="18"/>
-              </w:rPr>
-              <w:t>NBU (FY2024)</w:t>
-            </w:r>
-          </w:p>
-        </w:tc>
-        <w:tc>
-          <w:tcPr>
-            <w:tcW w:w="2200" w:type="dxa"/>
-            <w:shd w:val="clear" w:color="auto" w:fill="2E4057"/>
-            <w:tcMar>
-              <w:top w:w="40" w:type="dxa"/>
-              <w:left w:w="100" w:type="dxa"/>
-              <w:bottom w:w="40" w:type="dxa"/>
-              <w:right w:w="100" w:type="dxa"/>
-            </w:tcMar>
-            <w:vAlign w:val="center"/>
-          </w:tcPr>
-          <w:p>
-            <w:pPr>
-              <w:spacing w:before="20" w:after="20"/>
-              <w:jc w:val="right"/>
-            </w:pPr>
-            <w:r>
-              <w:rPr>
-                <w:b/>
-                <w:bCs/>
-                <w:color w:val="FFFFFF"/>
-                <w:sz w:val="18"/>
-                <w:szCs w:val="18"/>
-              </w:rPr>
-              <w:t>SQB (FY2024)</w:t>
-            </w:r>
-          </w:p>
-        </w:tc>
-        <w:tc>
-          <w:tcPr>
-            <w:tcW w:w="2200" w:type="dxa"/>
-            <w:shd w:val="clear" w:color="auto" w:fill="2E4057"/>
-            <w:tcMar>
-              <w:top w:w="40" w:type="dxa"/>
-              <w:left w:w="100" w:type="dxa"/>
-              <w:bottom w:w="40" w:type="dxa"/>
-              <w:right w:w="100" w:type="dxa"/>
-            </w:tcMar>
-            <w:vAlign w:val="center"/>
-          </w:tcPr>
-          <w:p>
-            <w:pPr>
-              <w:spacing w:before="20" w:after="20"/>
-              <w:jc w:val="right"/>
-            </w:pPr>
-            <w:r>
-              <w:rPr>
-                <w:b/>
-                <w:bCs/>
-                <w:color w:val="FFFFFF"/>
-                <w:sz w:val="18"/>
-                <w:szCs w:val="18"/>
-              </w:rPr>
-              <w:t>Agrobank (FY2024)</w:t>
-            </w:r>
-          </w:p>
-        </w:tc>
-      </w:tr>
-      <w:tr>
-        <w:tc>
-          <w:tcPr>
-            <w:tcW w:w="10080" w:type="dxa"/>
-            <w:gridSpan w:val="4"/>
-            <w:shd w:val="clear" w:color="auto" w:fill="EDF2F7"/>
-            <w:tcMar>
-              <w:top w:w="40" w:type="dxa"/>
-              <w:left w:w="100" w:type="dxa"/>
-              <w:bottom w:w="40" w:type="dxa"/>
-              <w:right w:w="100" w:type="dxa"/>
-            </w:tcMar>
-            <w:vAlign w:val="center"/>
-          </w:tcPr>
-          <w:p>
-            <w:pPr>
-              <w:spacing w:before="20" w:after="20"/>
-            </w:pPr>
-            <w:r>
-              <w:rPr>
-                <w:b/>
-                <w:bCs/>
-                <w:color w:val="1A3A5C"/>
-                <w:sz w:val="18"/>
-                <w:szCs w:val="18"/>
-              </w:rPr>
-              <w:t>Profitability</w:t>
-            </w:r>
-          </w:p>
-        </w:tc>
-      </w:tr>
-      <w:tr>
-        <w:tc>
-          <w:tcPr>
-            <w:tcW w:w="3480" w:type="dxa"/>
-            <w:shd w:val="clear" w:color="auto" w:fill="FFFFFF"/>
-            <w:tcMar>
-              <w:top w:w="40" w:type="dxa"/>
-              <w:left w:w="100" w:type="dxa"/>
-              <w:bottom w:w="40" w:type="dxa"/>
-              <w:right w:w="100" w:type="dxa"/>
-            </w:tcMar>
-            <w:vAlign w:val="center"/>
-          </w:tcPr>
-          <w:p>
-            <w:pPr>
-              <w:spacing w:before="20" w:after="20"/>
-            </w:pPr>
-            <w:r>
-              <w:rPr>
-                <w:color w:val="1A1A1A"/>
-                <w:sz w:val="18"/>
-                <w:szCs w:val="18"/>
-              </w:rPr>
-              <w:t>Net Profit (USD M)</w:t>
-            </w:r>
-          </w:p>
-        </w:tc>
-        <w:tc>
-          <w:tcPr>
-            <w:tcW w:w="2200" w:type="dxa"/>
-            <w:shd w:val="clear" w:color="auto" w:fill="FFFFFF"/>
-            <w:tcMar>
-              <w:top w:w="40" w:type="dxa"/>
-              <w:left w:w="100" w:type="dxa"/>
-              <w:bottom w:w="40" w:type="dxa"/>
-              <w:right w:w="100" w:type="dxa"/>
-            </w:tcMar>
-            <w:vAlign w:val="center"/>
-          </w:tcPr>
-          <w:p>
-            <w:pPr>
-              <w:spacing w:before="20" w:after="20"/>
-              <w:jc w:val="right"/>
-            </w:pPr>
-            <w:r>
-              <w:rPr>
-                <w:b/>
-                <w:bCs/>
-                <w:color w:val="1A1A1A"/>
-                <w:sz w:val="18"/>
-                <w:szCs w:val="18"/>
-              </w:rPr>
-              <w:t>~142</w:t>
-            </w:r>
-          </w:p>
-        </w:tc>
-        <w:tc>
-          <w:tcPr>
-            <w:tcW w:w="2200" w:type="dxa"/>
-            <w:shd w:val="clear" w:color="auto" w:fill="FFFFFF"/>
-            <w:tcMar>
-              <w:top w:w="40" w:type="dxa"/>
-              <w:left w:w="100" w:type="dxa"/>
-              <w:bottom w:w="40" w:type="dxa"/>
-              <w:right w:w="100" w:type="dxa"/>
-            </w:tcMar>
-            <w:vAlign w:val="center"/>
-          </w:tcPr>
-          <w:p>
-            <w:pPr>
-              <w:spacing w:before="20" w:after="20"/>
-              <w:jc w:val="right"/>
-            </w:pPr>
-            <w:r>
-              <w:rPr>
-                <w:color w:val="1A1A1A"/>
-                <w:sz w:val="18"/>
-                <w:szCs w:val="18"/>
-              </w:rPr>
-              <w:t>~67</w:t>
-            </w:r>
-          </w:p>
-        </w:tc>
-        <w:tc>
-          <w:tcPr>
-            <w:tcW w:w="2200" w:type="dxa"/>
-            <w:shd w:val="clear" w:color="auto" w:fill="FFFFFF"/>
-            <w:tcMar>
-              <w:top w:w="40" w:type="dxa"/>
-              <w:left w:w="100" w:type="dxa"/>
-              <w:bottom w:w="40" w:type="dxa"/>
-              <w:right w:w="100" w:type="dxa"/>
-            </w:tcMar>
-            <w:vAlign w:val="center"/>
-          </w:tcPr>
-          <w:p>
-            <w:pPr>
-              <w:spacing w:before="20" w:after="20"/>
-              <w:jc w:val="right"/>
-            </w:pPr>
-            <w:r>
-              <w:rPr>
-                <w:color w:val="1A1A1A"/>
-                <w:sz w:val="18"/>
-                <w:szCs w:val="18"/>
-              </w:rPr>
-              <w:t>~3</w:t>
-            </w:r>
-          </w:p>
-        </w:tc>
-      </w:tr>
-      <w:tr>
-        <w:tc>
-          <w:tcPr>
-            <w:tcW w:w="3480" w:type="dxa"/>
-            <w:shd w:val="clear" w:color="auto" w:fill="FFFFFF"/>
-            <w:tcMar>
-              <w:top w:w="40" w:type="dxa"/>
-              <w:left w:w="100" w:type="dxa"/>
-              <w:bottom w:w="40" w:type="dxa"/>
-              <w:right w:w="100" w:type="dxa"/>
-            </w:tcMar>
-            <w:vAlign w:val="center"/>
-          </w:tcPr>
-          <w:p>
-            <w:pPr>
-              <w:spacing w:before="20" w:after="20"/>
-            </w:pPr>
-            <w:r>
-              <w:rPr>
-                <w:color w:val="1A1A1A"/>
-                <w:sz w:val="18"/>
-                <w:szCs w:val="18"/>
-              </w:rPr>
-              <w:t>Net Interest Income (USD M)</w:t>
-            </w:r>
-          </w:p>
-        </w:tc>
-        <w:tc>
-          <w:tcPr>
-            <w:tcW w:w="2200" w:type="dxa"/>
-            <w:shd w:val="clear" w:color="auto" w:fill="FFFFFF"/>
-            <w:tcMar>
-              <w:top w:w="40" w:type="dxa"/>
-              <w:left w:w="100" w:type="dxa"/>
-              <w:bottom w:w="40" w:type="dxa"/>
-              <w:right w:w="100" w:type="dxa"/>
-            </w:tcMar>
-            <w:vAlign w:val="center"/>
-          </w:tcPr>
-          <w:p>
-            <w:pPr>
-              <w:spacing w:before="20" w:after="20"/>
-              <w:jc w:val="right"/>
-            </w:pPr>
-            <w:r>
-              <w:rPr>
-                <w:b/>
-                <w:bCs/>
-                <w:color w:val="1A1A1A"/>
-                <w:sz w:val="18"/>
-                <w:szCs w:val="18"/>
-              </w:rPr>
-              <w:t>442</w:t>
-            </w:r>
-          </w:p>
-        </w:tc>
-        <w:tc>
-          <w:tcPr>
-            <w:tcW w:w="2200" w:type="dxa"/>
-            <w:shd w:val="clear" w:color="auto" w:fill="FFFFFF"/>
-            <w:tcMar>
-              <w:top w:w="40" w:type="dxa"/>
-              <w:left w:w="100" w:type="dxa"/>
-              <w:bottom w:w="40" w:type="dxa"/>
-              <w:right w:w="100" w:type="dxa"/>
-            </w:tcMar>
-            <w:vAlign w:val="center"/>
-          </w:tcPr>
-          <w:p>
-            <w:pPr>
-              <w:spacing w:before="20" w:after="20"/>
-              <w:jc w:val="right"/>
-            </w:pPr>
-            <w:r>
-              <w:rPr>
-                <w:color w:val="1A1A1A"/>
-                <w:sz w:val="18"/>
-                <w:szCs w:val="18"/>
-              </w:rPr>
-              <w:t>n.a.</w:t>
-            </w:r>
-          </w:p>
-        </w:tc>
-        <w:tc>
-          <w:tcPr>
-            <w:tcW w:w="2200" w:type="dxa"/>
-            <w:shd w:val="clear" w:color="auto" w:fill="FFFFFF"/>
-            <w:tcMar>
-              <w:top w:w="40" w:type="dxa"/>
-              <w:left w:w="100" w:type="dxa"/>
-              <w:bottom w:w="40" w:type="dxa"/>
-              <w:right w:w="100" w:type="dxa"/>
-            </w:tcMar>
-            <w:vAlign w:val="center"/>
-          </w:tcPr>
-          <w:p>
-            <w:pPr>
-              <w:spacing w:before="20" w:after="20"/>
-              <w:jc w:val="right"/>
-            </w:pPr>
-            <w:r>
-              <w:rPr>
-                <w:color w:val="1A1A1A"/>
-                <w:sz w:val="18"/>
-                <w:szCs w:val="18"/>
-              </w:rPr>
-              <w:t>n.a.</w:t>
-            </w:r>
-          </w:p>
-        </w:tc>
-      </w:tr>
-      <w:tr>
-        <w:tc>
-          <w:tcPr>
-            <w:tcW w:w="3480" w:type="dxa"/>
-            <w:shd w:val="clear" w:color="auto" w:fill="FFFFFF"/>
-            <w:tcMar>
-              <w:top w:w="40" w:type="dxa"/>
-              <w:left w:w="100" w:type="dxa"/>
-              <w:bottom w:w="40" w:type="dxa"/>
-              <w:right w:w="100" w:type="dxa"/>
-            </w:tcMar>
-            <w:vAlign w:val="center"/>
-          </w:tcPr>
-          <w:p>
-            <w:pPr>
-              <w:spacing w:before="20" w:after="20"/>
-            </w:pPr>
-            <w:r>
-              <w:rPr>
-                <w:color w:val="1A1A1A"/>
-                <w:sz w:val="18"/>
-                <w:szCs w:val="18"/>
-              </w:rPr>
-              <w:t>Net Interest Margin (NIM)</w:t>
-            </w:r>
-          </w:p>
-        </w:tc>
-        <w:tc>
-          <w:tcPr>
-            <w:tcW w:w="2200" w:type="dxa"/>
-            <w:shd w:val="clear" w:color="auto" w:fill="FFFFFF"/>
-            <w:tcMar>
-              <w:top w:w="40" w:type="dxa"/>
-              <w:left w:w="100" w:type="dxa"/>
-              <w:bottom w:w="40" w:type="dxa"/>
-              <w:right w:w="100" w:type="dxa"/>
-            </w:tcMar>
-            <w:vAlign w:val="center"/>
-          </w:tcPr>
-          <w:p>
-            <w:pPr>
-              <w:spacing w:before="20" w:after="20"/>
-              <w:jc w:val="right"/>
-            </w:pPr>
-            <w:r>
-              <w:rPr>
-                <w:b/>
-                <w:bCs/>
-                <w:color w:val="1A1A1A"/>
-                <w:sz w:val="18"/>
-                <w:szCs w:val="18"/>
-              </w:rPr>
-              <w:t>~4.1%*</w:t>
-            </w:r>
-          </w:p>
-        </w:tc>
-        <w:tc>
-          <w:tcPr>
-            <w:tcW w:w="2200" w:type="dxa"/>
-            <w:shd w:val="clear" w:color="auto" w:fill="FFFFFF"/>
-            <w:tcMar>
-              <w:top w:w="40" w:type="dxa"/>
-              <w:left w:w="100" w:type="dxa"/>
-              <w:bottom w:w="40" w:type="dxa"/>
-              <w:right w:w="100" w:type="dxa"/>
-            </w:tcMar>
-            <w:vAlign w:val="center"/>
-          </w:tcPr>
-          <w:p>
-            <w:pPr>
-              <w:spacing w:before="20" w:after="20"/>
-              <w:jc w:val="right"/>
-            </w:pPr>
-            <w:r>
-              <w:rPr>
-                <w:color w:val="1A1A1A"/>
-                <w:sz w:val="18"/>
-                <w:szCs w:val="18"/>
-              </w:rPr>
-              <w:t>n.a.</w:t>
-            </w:r>
-          </w:p>
-        </w:tc>
-        <w:tc>
-          <w:tcPr>
-            <w:tcW w:w="2200" w:type="dxa"/>
-            <w:shd w:val="clear" w:color="auto" w:fill="FFFFFF"/>
-            <w:tcMar>
-              <w:top w:w="40" w:type="dxa"/>
-              <w:left w:w="100" w:type="dxa"/>
-              <w:bottom w:w="40" w:type="dxa"/>
-              <w:right w:w="100" w:type="dxa"/>
-            </w:tcMar>
-            <w:vAlign w:val="center"/>
-          </w:tcPr>
-          <w:p>
-            <w:pPr>
-              <w:spacing w:before="20" w:after="20"/>
-              <w:jc w:val="right"/>
-            </w:pPr>
-            <w:r>
-              <w:rPr>
-                <w:color w:val="1A1A1A"/>
-                <w:sz w:val="18"/>
-                <w:szCs w:val="18"/>
-              </w:rPr>
-              <w:t>n.a.</w:t>
-            </w:r>
-          </w:p>
-        </w:tc>
-      </w:tr>
-      <w:tr>
-        <w:tc>
-          <w:tcPr>
-            <w:tcW w:w="3480" w:type="dxa"/>
-            <w:shd w:val="clear" w:color="auto" w:fill="FFFFFF"/>
-            <w:tcMar>
-              <w:top w:w="40" w:type="dxa"/>
-              <w:left w:w="100" w:type="dxa"/>
-              <w:bottom w:w="40" w:type="dxa"/>
-              <w:right w:w="100" w:type="dxa"/>
-            </w:tcMar>
-            <w:vAlign w:val="center"/>
-          </w:tcPr>
-          <w:p>
-            <w:pPr>
-              <w:spacing w:before="20" w:after="20"/>
-            </w:pPr>
-            <w:r>
-              <w:rPr>
-                <w:color w:val="1A1A1A"/>
-                <w:sz w:val="18"/>
-                <w:szCs w:val="18"/>
-              </w:rPr>
-              <w:t>Cost-to-Income Ratio (CIR)</w:t>
-            </w:r>
-          </w:p>
-        </w:tc>
-        <w:tc>
-          <w:tcPr>
-            <w:tcW w:w="2200" w:type="dxa"/>
-            <w:shd w:val="clear" w:color="auto" w:fill="FFFFFF"/>
-            <w:tcMar>
-              <w:top w:w="40" w:type="dxa"/>
-              <w:left w:w="100" w:type="dxa"/>
-              <w:bottom w:w="40" w:type="dxa"/>
-              <w:right w:w="100" w:type="dxa"/>
-            </w:tcMar>
-            <w:vAlign w:val="center"/>
-          </w:tcPr>
-          <w:p>
-            <w:pPr>
-              <w:spacing w:before="20" w:after="20"/>
-              <w:jc w:val="right"/>
-            </w:pPr>
-            <w:r>
-              <w:rPr>
-                <w:b/>
-                <w:bCs/>
-                <w:color w:val="1A1A1A"/>
-                <w:sz w:val="18"/>
-                <w:szCs w:val="18"/>
-              </w:rPr>
-              <w:t>~35%</w:t>
-            </w:r>
-          </w:p>
-        </w:tc>
-        <w:tc>
-          <w:tcPr>
-            <w:tcW w:w="2200" w:type="dxa"/>
-            <w:shd w:val="clear" w:color="auto" w:fill="FFFFFF"/>
-            <w:tcMar>
-              <w:top w:w="40" w:type="dxa"/>
-              <w:left w:w="100" w:type="dxa"/>
-              <w:bottom w:w="40" w:type="dxa"/>
-              <w:right w:w="100" w:type="dxa"/>
-            </w:tcMar>
-            <w:vAlign w:val="center"/>
-          </w:tcPr>
-          <w:p>
-            <w:pPr>
-              <w:spacing w:before="20" w:after="20"/>
-              <w:jc w:val="right"/>
-            </w:pPr>
-            <w:r>
-              <w:rPr>
-                <w:color w:val="1A1A1A"/>
-                <w:sz w:val="18"/>
-                <w:szCs w:val="18"/>
-              </w:rPr>
-              <w:t>n.a.</w:t>
-            </w:r>
-          </w:p>
-        </w:tc>
-        <w:tc>
-          <w:tcPr>
-            <w:tcW w:w="2200" w:type="dxa"/>
-            <w:shd w:val="clear" w:color="auto" w:fill="FFFFFF"/>
-            <w:tcMar>
-              <w:top w:w="40" w:type="dxa"/>
-              <w:left w:w="100" w:type="dxa"/>
-              <w:bottom w:w="40" w:type="dxa"/>
-              <w:right w:w="100" w:type="dxa"/>
-            </w:tcMar>
-            <w:vAlign w:val="center"/>
-          </w:tcPr>
-          <w:p>
-            <w:pPr>
-              <w:spacing w:before="20" w:after="20"/>
-              <w:jc w:val="right"/>
-            </w:pPr>
-            <w:r>
-              <w:rPr>
-                <w:color w:val="1A1A1A"/>
-                <w:sz w:val="18"/>
-                <w:szCs w:val="18"/>
-              </w:rPr>
-              <w:t>n.a.</w:t>
-            </w:r>
-          </w:p>
-        </w:tc>
-      </w:tr>
-      <w:tr>
-        <w:tc>
-          <w:tcPr>
-            <w:tcW w:w="3480" w:type="dxa"/>
-            <w:shd w:val="clear" w:color="auto" w:fill="FFFFFF"/>
-            <w:tcMar>
-              <w:top w:w="40" w:type="dxa"/>
-              <w:left w:w="100" w:type="dxa"/>
-              <w:bottom w:w="40" w:type="dxa"/>
-              <w:right w:w="100" w:type="dxa"/>
-            </w:tcMar>
-            <w:vAlign w:val="center"/>
-          </w:tcPr>
-          <w:p>
-            <w:pPr>
-              <w:spacing w:before="20" w:after="20"/>
-            </w:pPr>
-            <w:r>
-              <w:rPr>
-                <w:color w:val="1A1A1A"/>
-                <w:sz w:val="18"/>
-                <w:szCs w:val="18"/>
-              </w:rPr>
-              <w:t>Return on Equity (ROE)</w:t>
-            </w:r>
-          </w:p>
-        </w:tc>
-        <w:tc>
-          <w:tcPr>
-            <w:tcW w:w="2200" w:type="dxa"/>
-            <w:shd w:val="clear" w:color="auto" w:fill="FFFFFF"/>
-            <w:tcMar>
-              <w:top w:w="40" w:type="dxa"/>
-              <w:left w:w="100" w:type="dxa"/>
-              <w:bottom w:w="40" w:type="dxa"/>
-              <w:right w:w="100" w:type="dxa"/>
-            </w:tcMar>
-            <w:vAlign w:val="center"/>
-          </w:tcPr>
-          <w:p>
-            <w:pPr>
-              <w:spacing w:before="20" w:after="20"/>
-              <w:jc w:val="right"/>
-            </w:pPr>
-            <w:r>
-              <w:rPr>
-                <w:b/>
-                <w:bCs/>
-                <w:color w:val="1A1A1A"/>
-                <w:sz w:val="18"/>
-                <w:szCs w:val="18"/>
-              </w:rPr>
-              <w:t>~9.1%</w:t>
-            </w:r>
-          </w:p>
-        </w:tc>
-        <w:tc>
-          <w:tcPr>
-            <w:tcW w:w="2200" w:type="dxa"/>
-            <w:shd w:val="clear" w:color="auto" w:fill="FFFFFF"/>
-            <w:tcMar>
-              <w:top w:w="40" w:type="dxa"/>
-              <w:left w:w="100" w:type="dxa"/>
-              <w:bottom w:w="40" w:type="dxa"/>
-              <w:right w:w="100" w:type="dxa"/>
-            </w:tcMar>
-            <w:vAlign w:val="center"/>
-          </w:tcPr>
-          <w:p>
-            <w:pPr>
-              <w:spacing w:before="20" w:after="20"/>
-              <w:jc w:val="right"/>
-            </w:pPr>
-            <w:r>
-              <w:rPr>
-                <w:color w:val="1A1A1A"/>
-                <w:sz w:val="18"/>
-                <w:szCs w:val="18"/>
-              </w:rPr>
-              <w:t>~7.5%</w:t>
-            </w:r>
-          </w:p>
-        </w:tc>
-        <w:tc>
-          <w:tcPr>
-            <w:tcW w:w="2200" w:type="dxa"/>
-            <w:shd w:val="clear" w:color="auto" w:fill="FFFFFF"/>
-            <w:tcMar>
-              <w:top w:w="40" w:type="dxa"/>
-              <w:left w:w="100" w:type="dxa"/>
-              <w:bottom w:w="40" w:type="dxa"/>
-              <w:right w:w="100" w:type="dxa"/>
-            </w:tcMar>
-            <w:vAlign w:val="center"/>
-          </w:tcPr>
-          <w:p>
-            <w:pPr>
-              <w:spacing w:before="20" w:after="20"/>
-              <w:jc w:val="right"/>
-            </w:pPr>
-            <w:r>
-              <w:rPr>
-                <w:color w:val="1A1A1A"/>
-                <w:sz w:val="18"/>
-                <w:szCs w:val="18"/>
-              </w:rPr>
-              <w:t>~0.3%</w:t>
-            </w:r>
-          </w:p>
-        </w:tc>
-      </w:tr>
-      <w:tr>
-        <w:tc>
-          <w:tcPr>
-            <w:tcW w:w="3480" w:type="dxa"/>
-            <w:shd w:val="clear" w:color="auto" w:fill="FFFFFF"/>
-            <w:tcMar>
-              <w:top w:w="40" w:type="dxa"/>
-              <w:left w:w="100" w:type="dxa"/>
-              <w:bottom w:w="40" w:type="dxa"/>
-              <w:right w:w="100" w:type="dxa"/>
-            </w:tcMar>
-            <w:vAlign w:val="center"/>
-          </w:tcPr>
-          <w:p>
-            <w:pPr>
-              <w:spacing w:before="20" w:after="20"/>
-            </w:pPr>
-            <w:r>
-              <w:rPr>
-                <w:color w:val="1A1A1A"/>
-                <w:sz w:val="18"/>
-                <w:szCs w:val="18"/>
-              </w:rPr>
-              <w:t>Return on Assets (ROA)</w:t>
-            </w:r>
-          </w:p>
-        </w:tc>
-        <w:tc>
-          <w:tcPr>
-            <w:tcW w:w="2200" w:type="dxa"/>
-            <w:shd w:val="clear" w:color="auto" w:fill="FFFFFF"/>
-            <w:tcMar>
-              <w:top w:w="40" w:type="dxa"/>
-              <w:left w:w="100" w:type="dxa"/>
-              <w:bottom w:w="40" w:type="dxa"/>
-              <w:right w:w="100" w:type="dxa"/>
-            </w:tcMar>
-            <w:vAlign w:val="center"/>
-          </w:tcPr>
-          <w:p>
-            <w:pPr>
-              <w:spacing w:before="20" w:after="20"/>
-              <w:jc w:val="right"/>
-            </w:pPr>
-            <w:r>
-              <w:rPr>
-                <w:b/>
-                <w:bCs/>
-                <w:color w:val="1A1A1A"/>
-                <w:sz w:val="18"/>
-                <w:szCs w:val="18"/>
-              </w:rPr>
-              <w:t>~1.3%</w:t>
-            </w:r>
-          </w:p>
-        </w:tc>
-        <w:tc>
-          <w:tcPr>
-            <w:tcW w:w="2200" w:type="dxa"/>
-            <w:shd w:val="clear" w:color="auto" w:fill="FFFFFF"/>
-            <w:tcMar>
-              <w:top w:w="40" w:type="dxa"/>
-              <w:left w:w="100" w:type="dxa"/>
-              <w:bottom w:w="40" w:type="dxa"/>
-              <w:right w:w="100" w:type="dxa"/>
-            </w:tcMar>
-            <w:vAlign w:val="center"/>
-          </w:tcPr>
-          <w:p>
-            <w:pPr>
-              <w:spacing w:before="20" w:after="20"/>
-              <w:jc w:val="right"/>
-            </w:pPr>
-            <w:r>
-              <w:rPr>
-                <w:color w:val="1A1A1A"/>
-                <w:sz w:val="18"/>
-                <w:szCs w:val="18"/>
-              </w:rPr>
-              <w:t>~0.8%</w:t>
-            </w:r>
-          </w:p>
-        </w:tc>
-        <w:tc>
-          <w:tcPr>
-            <w:tcW w:w="2200" w:type="dxa"/>
-            <w:shd w:val="clear" w:color="auto" w:fill="FFFFFF"/>
-            <w:tcMar>
-              <w:top w:w="40" w:type="dxa"/>
-              <w:left w:w="100" w:type="dxa"/>
-              <w:bottom w:w="40" w:type="dxa"/>
-              <w:right w:w="100" w:type="dxa"/>
-            </w:tcMar>
-            <w:vAlign w:val="center"/>
-          </w:tcPr>
-          <w:p>
-            <w:pPr>
-              <w:spacing w:before="20" w:after="20"/>
-              <w:jc w:val="right"/>
-            </w:pPr>
-            <w:r>
-              <w:rPr>
-                <w:color w:val="1A1A1A"/>
-                <w:sz w:val="18"/>
-                <w:szCs w:val="18"/>
-              </w:rPr>
-              <w:t>~0.04%</w:t>
-            </w:r>
-          </w:p>
-        </w:tc>
-      </w:tr>
-      <w:tr>
-        <w:tc>
-          <w:tcPr>
-            <w:tcW w:w="10080" w:type="dxa"/>
-            <w:gridSpan w:val="4"/>
-            <w:shd w:val="clear" w:color="auto" w:fill="EDF2F7"/>
-            <w:tcMar>
-              <w:top w:w="40" w:type="dxa"/>
-              <w:left w:w="100" w:type="dxa"/>
-              <w:bottom w:w="40" w:type="dxa"/>
-              <w:right w:w="100" w:type="dxa"/>
-            </w:tcMar>
-            <w:vAlign w:val="center"/>
-          </w:tcPr>
-          <w:p>
-            <w:pPr>
-              <w:spacing w:before="20" w:after="20"/>
-            </w:pPr>
-            <w:r>
-              <w:rPr>
-                <w:b/>
-                <w:bCs/>
-                <w:color w:val="1A3A5C"/>
-                <w:sz w:val="18"/>
-                <w:szCs w:val="18"/>
-              </w:rPr>
-              <w:t>Asset Quality &amp; Capital</w:t>
-            </w:r>
-          </w:p>
-        </w:tc>
-      </w:tr>
-      <w:tr>
-        <w:tc>
-          <w:tcPr>
-            <w:tcW w:w="3480" w:type="dxa"/>
-            <w:shd w:val="clear" w:color="auto" w:fill="FFFFFF"/>
-            <w:tcMar>
-              <w:top w:w="40" w:type="dxa"/>
-              <w:left w:w="100" w:type="dxa"/>
-              <w:bottom w:w="40" w:type="dxa"/>
-              <w:right w:w="100" w:type="dxa"/>
-            </w:tcMar>
-            <w:vAlign w:val="center"/>
-          </w:tcPr>
-          <w:p>
-            <w:pPr>
-              <w:spacing w:before="20" w:after="20"/>
-            </w:pPr>
-            <w:r>
-              <w:rPr>
-                <w:color w:val="1A1A1A"/>
-                <w:sz w:val="18"/>
-                <w:szCs w:val="18"/>
-              </w:rPr>
-              <w:t>NPL ratio</w:t>
-            </w:r>
-          </w:p>
-        </w:tc>
-        <w:tc>
-          <w:tcPr>
-            <w:tcW w:w="2200" w:type="dxa"/>
-            <w:shd w:val="clear" w:color="auto" w:fill="FFFFFF"/>
-            <w:tcMar>
-              <w:top w:w="40" w:type="dxa"/>
-              <w:left w:w="100" w:type="dxa"/>
-              <w:bottom w:w="40" w:type="dxa"/>
-              <w:right w:w="100" w:type="dxa"/>
-            </w:tcMar>
-            <w:vAlign w:val="center"/>
-          </w:tcPr>
-          <w:p>
-            <w:pPr>
-              <w:spacing w:before="20" w:after="20"/>
-              <w:jc w:val="right"/>
-            </w:pPr>
-            <w:r>
-              <w:rPr>
-                <w:b/>
-                <w:bCs/>
-                <w:color w:val="1A1A1A"/>
-                <w:sz w:val="18"/>
-                <w:szCs w:val="18"/>
-              </w:rPr>
-              <w:t>n.a.</w:t>
-            </w:r>
-          </w:p>
-        </w:tc>
-        <w:tc>
-          <w:tcPr>
-            <w:tcW w:w="2200" w:type="dxa"/>
-            <w:shd w:val="clear" w:color="auto" w:fill="FFFFFF"/>
-            <w:tcMar>
-              <w:top w:w="40" w:type="dxa"/>
-              <w:left w:w="100" w:type="dxa"/>
-              <w:bottom w:w="40" w:type="dxa"/>
-              <w:right w:w="100" w:type="dxa"/>
-            </w:tcMar>
-            <w:vAlign w:val="center"/>
-          </w:tcPr>
-          <w:p>
-            <w:pPr>
-              <w:spacing w:before="20" w:after="20"/>
-              <w:jc w:val="right"/>
-            </w:pPr>
-            <w:r>
-              <w:rPr>
-                <w:color w:val="1A1A1A"/>
-                <w:sz w:val="18"/>
-                <w:szCs w:val="18"/>
-              </w:rPr>
-              <w:t>n.a.</w:t>
-            </w:r>
-          </w:p>
-        </w:tc>
-        <w:tc>
-          <w:tcPr>
-            <w:tcW w:w="2200" w:type="dxa"/>
-            <w:shd w:val="clear" w:color="auto" w:fill="FFFFFF"/>
-            <w:tcMar>
-              <w:top w:w="40" w:type="dxa"/>
-              <w:left w:w="100" w:type="dxa"/>
-              <w:bottom w:w="40" w:type="dxa"/>
-              <w:right w:w="100" w:type="dxa"/>
-            </w:tcMar>
-            <w:vAlign w:val="center"/>
-          </w:tcPr>
-          <w:p>
-            <w:pPr>
-              <w:spacing w:before="20" w:after="20"/>
-              <w:jc w:val="right"/>
-            </w:pPr>
-            <w:r>
-              <w:rPr>
-                <w:color w:val="1A1A1A"/>
-                <w:sz w:val="18"/>
-                <w:szCs w:val="18"/>
-              </w:rPr>
-              <w:t>n.a.</w:t>
-            </w:r>
-          </w:p>
-        </w:tc>
-      </w:tr>
-      <w:tr>
-        <w:tc>
-          <w:tcPr>
-            <w:tcW w:w="3480" w:type="dxa"/>
-            <w:shd w:val="clear" w:color="auto" w:fill="FFFFFF"/>
-            <w:tcMar>
-              <w:top w:w="40" w:type="dxa"/>
-              <w:left w:w="100" w:type="dxa"/>
-              <w:bottom w:w="40" w:type="dxa"/>
-              <w:right w:w="100" w:type="dxa"/>
-            </w:tcMar>
-            <w:vAlign w:val="center"/>
-          </w:tcPr>
-          <w:p>
-            <w:pPr>
-              <w:spacing w:before="20" w:after="20"/>
-            </w:pPr>
-            <w:r>
-              <w:rPr>
-                <w:color w:val="1A1A1A"/>
-                <w:sz w:val="18"/>
-                <w:szCs w:val="18"/>
-              </w:rPr>
-              <w:t>Total Capital Adequacy Ratio (CAR)</w:t>
-            </w:r>
-          </w:p>
-        </w:tc>
-        <w:tc>
-          <w:tcPr>
-            <w:tcW w:w="2200" w:type="dxa"/>
-            <w:shd w:val="clear" w:color="auto" w:fill="FFFFFF"/>
-            <w:tcMar>
-              <w:top w:w="40" w:type="dxa"/>
-              <w:left w:w="100" w:type="dxa"/>
-              <w:bottom w:w="40" w:type="dxa"/>
-              <w:right w:w="100" w:type="dxa"/>
-            </w:tcMar>
-            <w:vAlign w:val="center"/>
-          </w:tcPr>
-          <w:p>
-            <w:pPr>
-              <w:spacing w:before="20" w:after="20"/>
-              <w:jc w:val="right"/>
-            </w:pPr>
-            <w:r>
-              <w:rPr>
-                <w:b/>
-                <w:bCs/>
-                <w:color w:val="1A1A1A"/>
-                <w:sz w:val="18"/>
-                <w:szCs w:val="18"/>
-              </w:rPr>
-              <w:t>n.a.</w:t>
-            </w:r>
-          </w:p>
-        </w:tc>
-        <w:tc>
-          <w:tcPr>
-            <w:tcW w:w="2200" w:type="dxa"/>
-            <w:shd w:val="clear" w:color="auto" w:fill="FFFFFF"/>
-            <w:tcMar>
-              <w:top w:w="40" w:type="dxa"/>
-              <w:left w:w="100" w:type="dxa"/>
-              <w:bottom w:w="40" w:type="dxa"/>
-              <w:right w:w="100" w:type="dxa"/>
-            </w:tcMar>
-            <w:vAlign w:val="center"/>
-          </w:tcPr>
-          <w:p>
-            <w:pPr>
-              <w:spacing w:before="20" w:after="20"/>
-              <w:jc w:val="right"/>
-            </w:pPr>
-            <w:r>
-              <w:rPr>
-                <w:color w:val="1A1A1A"/>
-                <w:sz w:val="18"/>
-                <w:szCs w:val="18"/>
-              </w:rPr>
-              <w:t>n.a.</w:t>
-            </w:r>
-          </w:p>
-        </w:tc>
-        <w:tc>
-          <w:tcPr>
-            <w:tcW w:w="2200" w:type="dxa"/>
-            <w:shd w:val="clear" w:color="auto" w:fill="FFFFFF"/>
-            <w:tcMar>
-              <w:top w:w="40" w:type="dxa"/>
-              <w:left w:w="100" w:type="dxa"/>
-              <w:bottom w:w="40" w:type="dxa"/>
-              <w:right w:w="100" w:type="dxa"/>
-            </w:tcMar>
-            <w:vAlign w:val="center"/>
-          </w:tcPr>
-          <w:p>
-            <w:pPr>
-              <w:spacing w:before="20" w:after="20"/>
-              <w:jc w:val="right"/>
-            </w:pPr>
-            <w:r>
-              <w:rPr>
-                <w:color w:val="1A1A1A"/>
-                <w:sz w:val="18"/>
-                <w:szCs w:val="18"/>
-              </w:rPr>
-              <w:t>n.a.</w:t>
-            </w:r>
-          </w:p>
-        </w:tc>
-      </w:tr>
-      <w:tr>
-        <w:tc>
-          <w:tcPr>
-            <w:tcW w:w="3480" w:type="dxa"/>
-            <w:shd w:val="clear" w:color="auto" w:fill="FFFFFF"/>
-            <w:tcMar>
-              <w:top w:w="40" w:type="dxa"/>
-              <w:left w:w="100" w:type="dxa"/>
-              <w:bottom w:w="40" w:type="dxa"/>
-              <w:right w:w="100" w:type="dxa"/>
-            </w:tcMar>
-            <w:vAlign w:val="center"/>
-          </w:tcPr>
-          <w:p>
-            <w:pPr>
-              <w:spacing w:before="20" w:after="20"/>
-            </w:pPr>
-            <w:r>
-              <w:rPr>
-                <w:color w:val="1A1A1A"/>
-                <w:sz w:val="18"/>
-                <w:szCs w:val="18"/>
-              </w:rPr>
-              <w:t>Tier 1 Capital Ratio</w:t>
-            </w:r>
-          </w:p>
-        </w:tc>
-        <w:tc>
-          <w:tcPr>
-            <w:tcW w:w="2200" w:type="dxa"/>
-            <w:shd w:val="clear" w:color="auto" w:fill="FFFFFF"/>
-            <w:tcMar>
-              <w:top w:w="40" w:type="dxa"/>
-              <w:left w:w="100" w:type="dxa"/>
-              <w:bottom w:w="40" w:type="dxa"/>
-              <w:right w:w="100" w:type="dxa"/>
-            </w:tcMar>
-            <w:vAlign w:val="center"/>
-          </w:tcPr>
-          <w:p>
-            <w:pPr>
-              <w:spacing w:before="20" w:after="20"/>
-              <w:jc w:val="right"/>
-            </w:pPr>
-            <w:r>
-              <w:rPr>
-                <w:b/>
-                <w:bCs/>
-                <w:color w:val="1A1A1A"/>
-                <w:sz w:val="18"/>
-                <w:szCs w:val="18"/>
-              </w:rPr>
-              <w:t>n.a.</w:t>
-            </w:r>
-          </w:p>
-        </w:tc>
-        <w:tc>
-          <w:tcPr>
-            <w:tcW w:w="2200" w:type="dxa"/>
-            <w:shd w:val="clear" w:color="auto" w:fill="FFFFFF"/>
-            <w:tcMar>
-              <w:top w:w="40" w:type="dxa"/>
-              <w:left w:w="100" w:type="dxa"/>
-              <w:bottom w:w="40" w:type="dxa"/>
-              <w:right w:w="100" w:type="dxa"/>
-            </w:tcMar>
-            <w:vAlign w:val="center"/>
-          </w:tcPr>
-          <w:p>
-            <w:pPr>
-              <w:spacing w:before="20" w:after="20"/>
-              <w:jc w:val="right"/>
-            </w:pPr>
-            <w:r>
-              <w:rPr>
-                <w:color w:val="1A1A1A"/>
-                <w:sz w:val="18"/>
-                <w:szCs w:val="18"/>
-              </w:rPr>
-              <w:t>n.a.</w:t>
-            </w:r>
-          </w:p>
-        </w:tc>
-        <w:tc>
-          <w:tcPr>
-            <w:tcW w:w="2200" w:type="dxa"/>
-            <w:shd w:val="clear" w:color="auto" w:fill="FFFFFF"/>
-            <w:tcMar>
-              <w:top w:w="40" w:type="dxa"/>
-              <w:left w:w="100" w:type="dxa"/>
-              <w:bottom w:w="40" w:type="dxa"/>
-              <w:right w:w="100" w:type="dxa"/>
-            </w:tcMar>
-            <w:vAlign w:val="center"/>
-          </w:tcPr>
-          <w:p>
-            <w:pPr>
-              <w:spacing w:before="20" w:after="20"/>
-              <w:jc w:val="right"/>
-            </w:pPr>
-            <w:r>
-              <w:rPr>
-                <w:color w:val="1A1A1A"/>
-                <w:sz w:val="18"/>
-                <w:szCs w:val="18"/>
-              </w:rPr>
-              <w:t>n.a.</w:t>
-            </w:r>
-          </w:p>
-        </w:tc>
-      </w:tr>
-      <w:tr>
-        <w:tc>
-          <w:tcPr>
-            <w:tcW w:w="10080" w:type="dxa"/>
-            <w:gridSpan w:val="4"/>
-            <w:shd w:val="clear" w:color="auto" w:fill="EDF2F7"/>
-            <w:tcMar>
-              <w:top w:w="40" w:type="dxa"/>
-              <w:left w:w="100" w:type="dxa"/>
-              <w:bottom w:w="40" w:type="dxa"/>
-              <w:right w:w="100" w:type="dxa"/>
-            </w:tcMar>
-            <w:vAlign w:val="center"/>
-          </w:tcPr>
-          <w:p>
-            <w:pPr>
-              <w:spacing w:before="20" w:after="20"/>
-            </w:pPr>
-            <w:r>
-              <w:rPr>
-                <w:b/>
-                <w:bCs/>
-                <w:color w:val="1A3A5C"/>
-                <w:sz w:val="18"/>
-                <w:szCs w:val="18"/>
-              </w:rPr>
-              <w:t>Liquidity</w:t>
-            </w:r>
-          </w:p>
-        </w:tc>
-      </w:tr>
-      <w:tr>
-        <w:tc>
-          <w:tcPr>
-            <w:tcW w:w="3480" w:type="dxa"/>
-            <w:shd w:val="clear" w:color="auto" w:fill="FFFFFF"/>
-            <w:tcMar>
-              <w:top w:w="40" w:type="dxa"/>
-              <w:left w:w="100" w:type="dxa"/>
-              <w:bottom w:w="40" w:type="dxa"/>
-              <w:right w:w="100" w:type="dxa"/>
-            </w:tcMar>
-            <w:vAlign w:val="center"/>
-          </w:tcPr>
-          <w:p>
-            <w:pPr>
-              <w:spacing w:before="20" w:after="20"/>
-            </w:pPr>
-            <w:r>
-              <w:rPr>
-                <w:color w:val="1A1A1A"/>
-                <w:sz w:val="18"/>
-                <w:szCs w:val="18"/>
-              </w:rPr>
-              <w:t>Loan-to-Deposit Ratio (LDR)</w:t>
-            </w:r>
-          </w:p>
-        </w:tc>
-        <w:tc>
-          <w:tcPr>
-            <w:tcW w:w="2200" w:type="dxa"/>
-            <w:shd w:val="clear" w:color="auto" w:fill="FFFFFF"/>
-            <w:tcMar>
-              <w:top w:w="40" w:type="dxa"/>
-              <w:left w:w="100" w:type="dxa"/>
-              <w:bottom w:w="40" w:type="dxa"/>
-              <w:right w:w="100" w:type="dxa"/>
-            </w:tcMar>
-            <w:vAlign w:val="center"/>
-          </w:tcPr>
-          <w:p>
-            <w:pPr>
-              <w:spacing w:before="20" w:after="20"/>
-              <w:jc w:val="right"/>
-            </w:pPr>
-            <w:r>
-              <w:rPr>
-                <w:b/>
-                <w:bCs/>
-                <w:color w:val="1A1A1A"/>
-                <w:sz w:val="18"/>
-                <w:szCs w:val="18"/>
-              </w:rPr>
-              <w:t>273%</w:t>
-            </w:r>
-          </w:p>
-        </w:tc>
-        <w:tc>
-          <w:tcPr>
-            <w:tcW w:w="2200" w:type="dxa"/>
-            <w:shd w:val="clear" w:color="auto" w:fill="FFFFFF"/>
-            <w:tcMar>
-              <w:top w:w="40" w:type="dxa"/>
-              <w:left w:w="100" w:type="dxa"/>
-              <w:bottom w:w="40" w:type="dxa"/>
-              <w:right w:w="100" w:type="dxa"/>
-            </w:tcMar>
-            <w:vAlign w:val="center"/>
-          </w:tcPr>
-          <w:p>
-            <w:pPr>
-              <w:spacing w:before="20" w:after="20"/>
-              <w:jc w:val="right"/>
-            </w:pPr>
-            <w:r>
-              <w:rPr>
-                <w:color w:val="1A1A1A"/>
-                <w:sz w:val="18"/>
-                <w:szCs w:val="18"/>
-              </w:rPr>
-              <w:t>266%</w:t>
-            </w:r>
-          </w:p>
-        </w:tc>
-        <w:tc>
-          <w:tcPr>
-            <w:tcW w:w="2200" w:type="dxa"/>
-            <w:shd w:val="clear" w:color="auto" w:fill="FFFFFF"/>
-            <w:tcMar>
-              <w:top w:w="40" w:type="dxa"/>
-              <w:left w:w="100" w:type="dxa"/>
-              <w:bottom w:w="40" w:type="dxa"/>
-              <w:right w:w="100" w:type="dxa"/>
-            </w:tcMar>
-            <w:vAlign w:val="center"/>
-          </w:tcPr>
-          <w:p>
-            <w:pPr>
-              <w:spacing w:before="20" w:after="20"/>
-              <w:jc w:val="right"/>
-            </w:pPr>
-            <w:r>
-              <w:rPr>
-                <w:color w:val="1A1A1A"/>
-                <w:sz w:val="18"/>
-                <w:szCs w:val="18"/>
-              </w:rPr>
-              <w:t>283%</w:t>
-            </w:r>
-          </w:p>
-        </w:tc>
-      </w:tr>
-      <w:tr>
-        <w:tc>
-          <w:tcPr>
-            <w:tcW w:w="10080" w:type="dxa"/>
-            <w:gridSpan w:val="4"/>
-            <w:shd w:val="clear" w:color="auto" w:fill="EDF2F7"/>
-            <w:tcMar>
-              <w:top w:w="40" w:type="dxa"/>
-              <w:left w:w="100" w:type="dxa"/>
-              <w:bottom w:w="40" w:type="dxa"/>
-              <w:right w:w="100" w:type="dxa"/>
-            </w:tcMar>
-            <w:vAlign w:val="center"/>
-          </w:tcPr>
-          <w:p>
-            <w:pPr>
-              <w:spacing w:before="20" w:after="20"/>
-            </w:pPr>
-            <w:r>
-              <w:rPr>
-                <w:b/>
-                <w:bCs/>
-                <w:color w:val="1A3A5C"/>
-                <w:sz w:val="18"/>
-                <w:szCs w:val="18"/>
-              </w:rPr>
-              <w:t>Scale (USD Million @ 12,150)</w:t>
-            </w:r>
-          </w:p>
-        </w:tc>
-      </w:tr>
-      <w:tr>
-        <w:tc>
-          <w:tcPr>
-            <w:tcW w:w="3480" w:type="dxa"/>
-            <w:shd w:val="clear" w:color="auto" w:fill="FFFFFF"/>
-            <w:tcMar>
-              <w:top w:w="40" w:type="dxa"/>
-              <w:left w:w="100" w:type="dxa"/>
-              <w:bottom w:w="40" w:type="dxa"/>
-              <w:right w:w="100" w:type="dxa"/>
-            </w:tcMar>
-            <w:vAlign w:val="center"/>
-          </w:tcPr>
-          <w:p>
-            <w:pPr>
-              <w:spacing w:before="20" w:after="20"/>
-            </w:pPr>
-            <w:r>
-              <w:rPr>
-                <w:color w:val="1A1A1A"/>
-                <w:sz w:val="18"/>
-                <w:szCs w:val="18"/>
-              </w:rPr>
-              <w:t>Total Assets</w:t>
-            </w:r>
-          </w:p>
-        </w:tc>
-        <w:tc>
-          <w:tcPr>
-            <w:tcW w:w="2200" w:type="dxa"/>
-            <w:shd w:val="clear" w:color="auto" w:fill="FFFFFF"/>
-            <w:tcMar>
-              <w:top w:w="40" w:type="dxa"/>
-              <w:left w:w="100" w:type="dxa"/>
-              <w:bottom w:w="40" w:type="dxa"/>
-              <w:right w:w="100" w:type="dxa"/>
-            </w:tcMar>
-            <w:vAlign w:val="center"/>
-          </w:tcPr>
-          <w:p>
-            <w:pPr>
-              <w:spacing w:before="20" w:after="20"/>
-              <w:jc w:val="right"/>
-            </w:pPr>
-            <w:r>
-              <w:rPr>
-                <w:b/>
-                <w:bCs/>
-                <w:color w:val="1A1A1A"/>
-                <w:sz w:val="18"/>
-                <w:szCs w:val="18"/>
-              </w:rPr>
-              <w:t>11,118</w:t>
-            </w:r>
-          </w:p>
-        </w:tc>
-        <w:tc>
-          <w:tcPr>
-            <w:tcW w:w="2200" w:type="dxa"/>
-            <w:shd w:val="clear" w:color="auto" w:fill="FFFFFF"/>
-            <w:tcMar>
-              <w:top w:w="40" w:type="dxa"/>
-              <w:left w:w="100" w:type="dxa"/>
-              <w:bottom w:w="40" w:type="dxa"/>
-              <w:right w:w="100" w:type="dxa"/>
-            </w:tcMar>
-            <w:vAlign w:val="center"/>
-          </w:tcPr>
-          <w:p>
-            <w:pPr>
-              <w:spacing w:before="20" w:after="20"/>
-              <w:jc w:val="right"/>
-            </w:pPr>
-            <w:r>
-              <w:rPr>
-                <w:color w:val="1A1A1A"/>
-                <w:sz w:val="18"/>
-                <w:szCs w:val="18"/>
-              </w:rPr>
-              <w:t>8,000</w:t>
-            </w:r>
-          </w:p>
-        </w:tc>
-        <w:tc>
-          <w:tcPr>
-            <w:tcW w:w="2200" w:type="dxa"/>
-            <w:shd w:val="clear" w:color="auto" w:fill="FFFFFF"/>
-            <w:tcMar>
-              <w:top w:w="40" w:type="dxa"/>
-              <w:left w:w="100" w:type="dxa"/>
-              <w:bottom w:w="40" w:type="dxa"/>
-              <w:right w:w="100" w:type="dxa"/>
-            </w:tcMar>
-            <w:vAlign w:val="center"/>
-          </w:tcPr>
-          <w:p>
-            <w:pPr>
-              <w:spacing w:before="20" w:after="20"/>
-              <w:jc w:val="right"/>
-            </w:pPr>
-            <w:r>
-              <w:rPr>
-                <w:color w:val="1A1A1A"/>
-                <w:sz w:val="18"/>
-                <w:szCs w:val="18"/>
-              </w:rPr>
-              <w:t>7,877</w:t>
-            </w:r>
-          </w:p>
-        </w:tc>
-      </w:tr>
-      <w:tr>
-        <w:tc>
-          <w:tcPr>
-            <w:tcW w:w="3480" w:type="dxa"/>
-            <w:shd w:val="clear" w:color="auto" w:fill="FFFFFF"/>
-            <w:tcMar>
-              <w:top w:w="40" w:type="dxa"/>
-              <w:left w:w="100" w:type="dxa"/>
-              <w:bottom w:w="40" w:type="dxa"/>
-              <w:right w:w="100" w:type="dxa"/>
-            </w:tcMar>
-            <w:vAlign w:val="center"/>
-          </w:tcPr>
-          <w:p>
-            <w:pPr>
-              <w:spacing w:before="20" w:after="20"/>
-            </w:pPr>
-            <w:r>
-              <w:rPr>
-                <w:color w:val="1A1A1A"/>
-                <w:sz w:val="18"/>
-                <w:szCs w:val="18"/>
-              </w:rPr>
-              <w:t>Net Loan Portfolio</w:t>
-            </w:r>
-          </w:p>
-        </w:tc>
-        <w:tc>
-          <w:tcPr>
-            <w:tcW w:w="2200" w:type="dxa"/>
-            <w:shd w:val="clear" w:color="auto" w:fill="FFFFFF"/>
-            <w:tcMar>
-              <w:top w:w="40" w:type="dxa"/>
-              <w:left w:w="100" w:type="dxa"/>
-              <w:bottom w:w="40" w:type="dxa"/>
-              <w:right w:w="100" w:type="dxa"/>
-            </w:tcMar>
-            <w:vAlign w:val="center"/>
-          </w:tcPr>
-          <w:p>
-            <w:pPr>
-              <w:spacing w:before="20" w:after="20"/>
-              <w:jc w:val="right"/>
-            </w:pPr>
-            <w:r>
-              <w:rPr>
-                <w:b/>
-                <w:bCs/>
-                <w:color w:val="1A1A1A"/>
-                <w:sz w:val="18"/>
-                <w:szCs w:val="18"/>
-              </w:rPr>
-              <w:t>8,272</w:t>
-            </w:r>
-          </w:p>
-        </w:tc>
-        <w:tc>
-          <w:tcPr>
-            <w:tcW w:w="2200" w:type="dxa"/>
-            <w:shd w:val="clear" w:color="auto" w:fill="FFFFFF"/>
-            <w:tcMar>
-              <w:top w:w="40" w:type="dxa"/>
-              <w:left w:w="100" w:type="dxa"/>
-              <w:bottom w:w="40" w:type="dxa"/>
-              <w:right w:w="100" w:type="dxa"/>
-            </w:tcMar>
-            <w:vAlign w:val="center"/>
-          </w:tcPr>
-          <w:p>
-            <w:pPr>
-              <w:spacing w:before="20" w:after="20"/>
-              <w:jc w:val="right"/>
-            </w:pPr>
-            <w:r>
-              <w:rPr>
-                <w:color w:val="1A1A1A"/>
-                <w:sz w:val="18"/>
-                <w:szCs w:val="18"/>
-              </w:rPr>
-              <w:t>5,597</w:t>
-            </w:r>
-          </w:p>
-        </w:tc>
-        <w:tc>
-          <w:tcPr>
-            <w:tcW w:w="2200" w:type="dxa"/>
-            <w:shd w:val="clear" w:color="auto" w:fill="FFFFFF"/>
-            <w:tcMar>
-              <w:top w:w="40" w:type="dxa"/>
-              <w:left w:w="100" w:type="dxa"/>
-              <w:bottom w:w="40" w:type="dxa"/>
-              <w:right w:w="100" w:type="dxa"/>
-            </w:tcMar>
-            <w:vAlign w:val="center"/>
-          </w:tcPr>
-          <w:p>
-            <w:pPr>
-              <w:spacing w:before="20" w:after="20"/>
-              <w:jc w:val="right"/>
-            </w:pPr>
-            <w:r>
-              <w:rPr>
-                <w:color w:val="1A1A1A"/>
-                <w:sz w:val="18"/>
-                <w:szCs w:val="18"/>
-              </w:rPr>
-              <w:t>6,247</w:t>
-            </w:r>
-          </w:p>
-        </w:tc>
-      </w:tr>
-      <w:tr>
-        <w:tc>
-          <w:tcPr>
-            <w:tcW w:w="3480" w:type="dxa"/>
-            <w:shd w:val="clear" w:color="auto" w:fill="FFFFFF"/>
-            <w:tcMar>
-              <w:top w:w="40" w:type="dxa"/>
-              <w:left w:w="100" w:type="dxa"/>
-              <w:bottom w:w="40" w:type="dxa"/>
-              <w:right w:w="100" w:type="dxa"/>
-            </w:tcMar>
-            <w:vAlign w:val="center"/>
-          </w:tcPr>
-          <w:p>
-            <w:pPr>
-              <w:spacing w:before="20" w:after="20"/>
-            </w:pPr>
-            <w:r>
-              <w:rPr>
-                <w:color w:val="1A1A1A"/>
-                <w:sz w:val="18"/>
-                <w:szCs w:val="18"/>
-              </w:rPr>
-              <w:t>Customer Deposits</w:t>
-            </w:r>
-          </w:p>
-        </w:tc>
-        <w:tc>
-          <w:tcPr>
-            <w:tcW w:w="2200" w:type="dxa"/>
-            <w:shd w:val="clear" w:color="auto" w:fill="FFFFFF"/>
-            <w:tcMar>
-              <w:top w:w="40" w:type="dxa"/>
-              <w:left w:w="100" w:type="dxa"/>
-              <w:bottom w:w="40" w:type="dxa"/>
-              <w:right w:w="100" w:type="dxa"/>
-            </w:tcMar>
-            <w:vAlign w:val="center"/>
-          </w:tcPr>
-          <w:p>
-            <w:pPr>
-              <w:spacing w:before="20" w:after="20"/>
-              <w:jc w:val="right"/>
-            </w:pPr>
-            <w:r>
-              <w:rPr>
-                <w:b/>
-                <w:bCs/>
-                <w:color w:val="1A1A1A"/>
-                <w:sz w:val="18"/>
-                <w:szCs w:val="18"/>
-              </w:rPr>
-              <w:t>3,029</w:t>
-            </w:r>
-          </w:p>
-        </w:tc>
-        <w:tc>
-          <w:tcPr>
-            <w:tcW w:w="2200" w:type="dxa"/>
-            <w:shd w:val="clear" w:color="auto" w:fill="FFFFFF"/>
-            <w:tcMar>
-              <w:top w:w="40" w:type="dxa"/>
-              <w:left w:w="100" w:type="dxa"/>
-              <w:bottom w:w="40" w:type="dxa"/>
-              <w:right w:w="100" w:type="dxa"/>
-            </w:tcMar>
-            <w:vAlign w:val="center"/>
-          </w:tcPr>
-          <w:p>
-            <w:pPr>
-              <w:spacing w:before="20" w:after="20"/>
-              <w:jc w:val="right"/>
-            </w:pPr>
-            <w:r>
-              <w:rPr>
-                <w:color w:val="1A1A1A"/>
-                <w:sz w:val="18"/>
-                <w:szCs w:val="18"/>
-              </w:rPr>
-              <w:t>2,107</w:t>
-            </w:r>
-          </w:p>
-        </w:tc>
-        <w:tc>
-          <w:tcPr>
-            <w:tcW w:w="2200" w:type="dxa"/>
-            <w:shd w:val="clear" w:color="auto" w:fill="FFFFFF"/>
-            <w:tcMar>
-              <w:top w:w="40" w:type="dxa"/>
-              <w:left w:w="100" w:type="dxa"/>
-              <w:bottom w:w="40" w:type="dxa"/>
-              <w:right w:w="100" w:type="dxa"/>
-            </w:tcMar>
-            <w:vAlign w:val="center"/>
-          </w:tcPr>
-          <w:p>
-            <w:pPr>
-              <w:spacing w:before="20" w:after="20"/>
-              <w:jc w:val="right"/>
-            </w:pPr>
-            <w:r>
-              <w:rPr>
-                <w:color w:val="1A1A1A"/>
-                <w:sz w:val="18"/>
-                <w:szCs w:val="18"/>
-              </w:rPr>
-              <w:t>2,206</w:t>
-            </w:r>
-          </w:p>
-        </w:tc>
-      </w:tr>
-      <w:tr>
-        <w:tc>
-          <w:tcPr>
-            <w:tcW w:w="3480" w:type="dxa"/>
-            <w:shd w:val="clear" w:color="auto" w:fill="FFFFFF"/>
-            <w:tcMar>
-              <w:top w:w="40" w:type="dxa"/>
-              <w:left w:w="100" w:type="dxa"/>
-              <w:bottom w:w="40" w:type="dxa"/>
-              <w:right w:w="100" w:type="dxa"/>
-            </w:tcMar>
-            <w:vAlign w:val="center"/>
-          </w:tcPr>
-          <w:p>
-            <w:pPr>
-              <w:spacing w:before="20" w:after="20"/>
-            </w:pPr>
-            <w:r>
-              <w:rPr>
-                <w:color w:val="1A1A1A"/>
-                <w:sz w:val="18"/>
-                <w:szCs w:val="18"/>
-              </w:rPr>
-              <w:t>Total Equity</w:t>
-            </w:r>
-          </w:p>
-        </w:tc>
-        <w:tc>
-          <w:tcPr>
-            <w:tcW w:w="2200" w:type="dxa"/>
-            <w:shd w:val="clear" w:color="auto" w:fill="FFFFFF"/>
-            <w:tcMar>
-              <w:top w:w="40" w:type="dxa"/>
-              <w:left w:w="100" w:type="dxa"/>
-              <w:bottom w:w="40" w:type="dxa"/>
-              <w:right w:w="100" w:type="dxa"/>
-            </w:tcMar>
-            <w:vAlign w:val="center"/>
-          </w:tcPr>
-          <w:p>
-            <w:pPr>
-              <w:spacing w:before="20" w:after="20"/>
-              <w:jc w:val="right"/>
-            </w:pPr>
-            <w:r>
-              <w:rPr>
-                <w:b/>
-                <w:bCs/>
-                <w:color w:val="1A1A1A"/>
-                <w:sz w:val="18"/>
-                <w:szCs w:val="18"/>
-              </w:rPr>
-              <w:t>1,556</w:t>
-            </w:r>
-          </w:p>
-        </w:tc>
-        <w:tc>
-          <w:tcPr>
-            <w:tcW w:w="2200" w:type="dxa"/>
-            <w:shd w:val="clear" w:color="auto" w:fill="FFFFFF"/>
-            <w:tcMar>
-              <w:top w:w="40" w:type="dxa"/>
-              <w:left w:w="100" w:type="dxa"/>
-              <w:bottom w:w="40" w:type="dxa"/>
-              <w:right w:w="100" w:type="dxa"/>
-            </w:tcMar>
-            <w:vAlign w:val="center"/>
-          </w:tcPr>
-          <w:p>
-            <w:pPr>
-              <w:spacing w:before="20" w:after="20"/>
-              <w:jc w:val="right"/>
-            </w:pPr>
-            <w:r>
-              <w:rPr>
-                <w:color w:val="1A1A1A"/>
-                <w:sz w:val="18"/>
-                <w:szCs w:val="18"/>
-              </w:rPr>
-              <w:t>889</w:t>
-            </w:r>
-          </w:p>
-        </w:tc>
-        <w:tc>
-          <w:tcPr>
-            <w:tcW w:w="2200" w:type="dxa"/>
-            <w:shd w:val="clear" w:color="auto" w:fill="FFFFFF"/>
-            <w:tcMar>
-              <w:top w:w="40" w:type="dxa"/>
-              <w:left w:w="100" w:type="dxa"/>
-              <w:bottom w:w="40" w:type="dxa"/>
-              <w:right w:w="100" w:type="dxa"/>
-            </w:tcMar>
-            <w:vAlign w:val="center"/>
-          </w:tcPr>
-          <w:p>
-            <w:pPr>
-              <w:spacing w:before="20" w:after="20"/>
-              <w:jc w:val="right"/>
-            </w:pPr>
-            <w:r>
-              <w:rPr>
-                <w:color w:val="1A1A1A"/>
-                <w:sz w:val="18"/>
-                <w:szCs w:val="18"/>
-              </w:rPr>
-              <w:t>1,128</w:t>
-            </w:r>
-          </w:p>
-        </w:tc>
-      </w:tr>
-      <w:tr>
-        <w:tc>
-          <w:tcPr>
-            <w:tcW w:w="3480" w:type="dxa"/>
-            <w:shd w:val="clear" w:color="auto" w:fill="FFFFFF"/>
-            <w:tcMar>
-              <w:top w:w="40" w:type="dxa"/>
-              <w:left w:w="100" w:type="dxa"/>
-              <w:bottom w:w="40" w:type="dxa"/>
-              <w:right w:w="100" w:type="dxa"/>
-            </w:tcMar>
-            <w:vAlign w:val="center"/>
-          </w:tcPr>
-          <w:p>
-            <w:pPr>
-              <w:spacing w:before="20" w:after="20"/>
-            </w:pPr>
-            <w:r>
-              <w:rPr>
-                <w:color w:val="1A1A1A"/>
-                <w:sz w:val="18"/>
-                <w:szCs w:val="18"/>
-              </w:rPr>
-              <w:t>YoY Loan Portfolio Growth</w:t>
-            </w:r>
-          </w:p>
-        </w:tc>
-        <w:tc>
-          <w:tcPr>
-            <w:tcW w:w="2200" w:type="dxa"/>
-            <w:shd w:val="clear" w:color="auto" w:fill="FFFFFF"/>
-            <w:tcMar>
-              <w:top w:w="40" w:type="dxa"/>
-              <w:left w:w="100" w:type="dxa"/>
-              <w:bottom w:w="40" w:type="dxa"/>
-              <w:right w:w="100" w:type="dxa"/>
-            </w:tcMar>
-            <w:vAlign w:val="center"/>
-          </w:tcPr>
-          <w:p>
-            <w:pPr>
-              <w:spacing w:before="20" w:after="20"/>
-              <w:jc w:val="right"/>
-            </w:pPr>
-            <w:r>
-              <w:rPr>
-                <w:b/>
-                <w:bCs/>
-                <w:color w:val="1A1A1A"/>
-                <w:sz w:val="18"/>
-                <w:szCs w:val="18"/>
-              </w:rPr>
-              <w:t>+8.8%</w:t>
-            </w:r>
-          </w:p>
-        </w:tc>
-        <w:tc>
-          <w:tcPr>
-            <w:tcW w:w="2200" w:type="dxa"/>
-            <w:shd w:val="clear" w:color="auto" w:fill="FFFFFF"/>
-            <w:tcMar>
-              <w:top w:w="40" w:type="dxa"/>
-              <w:left w:w="100" w:type="dxa"/>
-              <w:bottom w:w="40" w:type="dxa"/>
-              <w:right w:w="100" w:type="dxa"/>
-            </w:tcMar>
-            <w:vAlign w:val="center"/>
-          </w:tcPr>
-          <w:p>
-            <w:pPr>
-              <w:spacing w:before="20" w:after="20"/>
-              <w:jc w:val="right"/>
-            </w:pPr>
-            <w:r>
-              <w:rPr>
-                <w:color w:val="1A1A1A"/>
-                <w:sz w:val="18"/>
-                <w:szCs w:val="18"/>
-              </w:rPr>
-              <w:t>n.a.</w:t>
-            </w:r>
-          </w:p>
-        </w:tc>
-        <w:tc>
-          <w:tcPr>
-            <w:tcW w:w="2200" w:type="dxa"/>
-            <w:shd w:val="clear" w:color="auto" w:fill="FFFFFF"/>
-            <w:tcMar>
-              <w:top w:w="40" w:type="dxa"/>
-              <w:left w:w="100" w:type="dxa"/>
-              <w:bottom w:w="40" w:type="dxa"/>
-              <w:right w:w="100" w:type="dxa"/>
-            </w:tcMar>
-            <w:vAlign w:val="center"/>
-          </w:tcPr>
-          <w:p>
-            <w:pPr>
-              <w:spacing w:before="20" w:after="20"/>
-              <w:jc w:val="right"/>
-            </w:pPr>
-            <w:r>
-              <w:rPr>
-                <w:color w:val="1A1A1A"/>
-                <w:sz w:val="18"/>
-                <w:szCs w:val="18"/>
-              </w:rPr>
-              <w:t>n.a.</w:t>
-            </w:r>
-          </w:p>
-        </w:tc>
-      </w:tr>
-      <w:tr>
-        <w:tc>
-          <w:tcPr>
-            <w:tcW w:w="10080" w:type="dxa"/>
-            <w:gridSpan w:val="4"/>
-            <w:shd w:val="clear" w:color="auto" w:fill="EDF2F7"/>
-            <w:tcMar>
-              <w:top w:w="40" w:type="dxa"/>
-              <w:left w:w="100" w:type="dxa"/>
-              <w:bottom w:w="40" w:type="dxa"/>
-              <w:right w:w="100" w:type="dxa"/>
-            </w:tcMar>
-            <w:vAlign w:val="center"/>
-          </w:tcPr>
-          <w:p>
-            <w:pPr>
-              <w:spacing w:before="20" w:after="20"/>
-            </w:pPr>
-            <w:r>
-              <w:rPr>
-                <w:b/>
-                <w:bCs/>
-                <w:color w:val="1A3A5C"/>
-                <w:sz w:val="18"/>
-                <w:szCs w:val="18"/>
-              </w:rPr>
-              <w:t>Credit Ratings</w:t>
-            </w:r>
-          </w:p>
-        </w:tc>
-      </w:tr>
-      <w:tr>
-        <w:tc>
-          <w:tcPr>
-            <w:tcW w:w="3480" w:type="dxa"/>
-            <w:shd w:val="clear" w:color="auto" w:fill="FFFFFF"/>
-            <w:tcMar>
-              <w:top w:w="40" w:type="dxa"/>
-              <w:left w:w="100" w:type="dxa"/>
-              <w:bottom w:w="40" w:type="dxa"/>
-              <w:right w:w="100" w:type="dxa"/>
-            </w:tcMar>
-            <w:vAlign w:val="center"/>
-          </w:tcPr>
-          <w:p>
-            <w:pPr>
-              <w:spacing w:before="20" w:after="20"/>
-            </w:pPr>
-            <w:r>
-              <w:rPr>
-                <w:color w:val="1A1A1A"/>
-                <w:sz w:val="18"/>
-                <w:szCs w:val="18"/>
-              </w:rPr>
-              <w:t>Moody’s</w:t>
-            </w:r>
-          </w:p>
-        </w:tc>
-        <w:tc>
-          <w:tcPr>
-            <w:tcW w:w="2200" w:type="dxa"/>
-            <w:shd w:val="clear" w:color="auto" w:fill="FFFFFF"/>
-            <w:tcMar>
-              <w:top w:w="40" w:type="dxa"/>
-              <w:left w:w="100" w:type="dxa"/>
-              <w:bottom w:w="40" w:type="dxa"/>
-              <w:right w:w="100" w:type="dxa"/>
-            </w:tcMar>
-            <w:vAlign w:val="center"/>
-          </w:tcPr>
-          <w:p>
-            <w:pPr>
-              <w:spacing w:before="20" w:after="20"/>
-              <w:jc w:val="right"/>
-            </w:pPr>
-            <w:r>
-              <w:rPr>
-                <w:b/>
-                <w:bCs/>
-                <w:color w:val="1A1A1A"/>
-                <w:sz w:val="18"/>
-                <w:szCs w:val="18"/>
-              </w:rPr>
-              <w:t>Ba3/Stable</w:t>
-            </w:r>
-          </w:p>
-        </w:tc>
-        <w:tc>
-          <w:tcPr>
-            <w:tcW w:w="2200" w:type="dxa"/>
-            <w:shd w:val="clear" w:color="auto" w:fill="FFFFFF"/>
-            <w:tcMar>
-              <w:top w:w="40" w:type="dxa"/>
-              <w:left w:w="100" w:type="dxa"/>
-              <w:bottom w:w="40" w:type="dxa"/>
-              <w:right w:w="100" w:type="dxa"/>
-            </w:tcMar>
-            <w:vAlign w:val="center"/>
-          </w:tcPr>
-          <w:p>
-            <w:pPr>
-              <w:spacing w:before="20" w:after="20"/>
-              <w:jc w:val="right"/>
-            </w:pPr>
-            <w:r>
-              <w:rPr>
-                <w:color w:val="1A1A1A"/>
-                <w:sz w:val="18"/>
-                <w:szCs w:val="18"/>
-              </w:rPr>
-              <w:t>n.a.</w:t>
-            </w:r>
-          </w:p>
-        </w:tc>
-        <w:tc>
-          <w:tcPr>
-            <w:tcW w:w="2200" w:type="dxa"/>
-            <w:shd w:val="clear" w:color="auto" w:fill="FFFFFF"/>
-            <w:tcMar>
-              <w:top w:w="40" w:type="dxa"/>
-              <w:left w:w="100" w:type="dxa"/>
-              <w:bottom w:w="40" w:type="dxa"/>
-              <w:right w:w="100" w:type="dxa"/>
-            </w:tcMar>
-            <w:vAlign w:val="center"/>
-          </w:tcPr>
-          <w:p>
-            <w:pPr>
-              <w:spacing w:before="20" w:after="20"/>
-              <w:jc w:val="right"/>
-            </w:pPr>
-            <w:r>
-              <w:rPr>
-                <w:color w:val="1A1A1A"/>
-                <w:sz w:val="18"/>
-                <w:szCs w:val="18"/>
-              </w:rPr>
-              <w:t>n.a.</w:t>
-            </w:r>
-          </w:p>
-        </w:tc>
-      </w:tr>
-      <w:tr>
-        <w:tc>
-          <w:tcPr>
-            <w:tcW w:w="3480" w:type="dxa"/>
-            <w:shd w:val="clear" w:color="auto" w:fill="FFFFFF"/>
-            <w:tcMar>
-              <w:top w:w="40" w:type="dxa"/>
-              <w:left w:w="100" w:type="dxa"/>
-              <w:bottom w:w="40" w:type="dxa"/>
-              <w:right w:w="100" w:type="dxa"/>
-            </w:tcMar>
-            <w:vAlign w:val="center"/>
-          </w:tcPr>
-          <w:p>
-            <w:pPr>
-              <w:spacing w:before="20" w:after="20"/>
-            </w:pPr>
-            <w:r>
-              <w:rPr>
-                <w:color w:val="1A1A1A"/>
-                <w:sz w:val="18"/>
-                <w:szCs w:val="18"/>
-              </w:rPr>
-              <w:t>Fitch</w:t>
-            </w:r>
-          </w:p>
-        </w:tc>
-        <w:tc>
-          <w:tcPr>
-            <w:tcW w:w="2200" w:type="dxa"/>
-            <w:shd w:val="clear" w:color="auto" w:fill="FFFFFF"/>
-            <w:tcMar>
-              <w:top w:w="40" w:type="dxa"/>
-              <w:left w:w="100" w:type="dxa"/>
-              <w:bottom w:w="40" w:type="dxa"/>
-              <w:right w:w="100" w:type="dxa"/>
-            </w:tcMar>
-            <w:vAlign w:val="center"/>
-          </w:tcPr>
-          <w:p>
-            <w:pPr>
-              <w:spacing w:before="20" w:after="20"/>
-              <w:jc w:val="right"/>
-            </w:pPr>
-            <w:r>
-              <w:rPr>
-                <w:b/>
-                <w:bCs/>
-                <w:color w:val="1A1A1A"/>
-                <w:sz w:val="18"/>
-                <w:szCs w:val="18"/>
-              </w:rPr>
-              <w:t>BB-/Stable</w:t>
-            </w:r>
-          </w:p>
-        </w:tc>
-        <w:tc>
-          <w:tcPr>
-            <w:tcW w:w="2200" w:type="dxa"/>
-            <w:shd w:val="clear" w:color="auto" w:fill="FFFFFF"/>
-            <w:tcMar>
-              <w:top w:w="40" w:type="dxa"/>
-              <w:left w:w="100" w:type="dxa"/>
-              <w:bottom w:w="40" w:type="dxa"/>
-              <w:right w:w="100" w:type="dxa"/>
-            </w:tcMar>
-            <w:vAlign w:val="center"/>
-          </w:tcPr>
-          <w:p>
-            <w:pPr>
-              <w:spacing w:before="20" w:after="20"/>
-              <w:jc w:val="right"/>
-            </w:pPr>
-            <w:r>
-              <w:rPr>
-                <w:color w:val="1A1A1A"/>
-                <w:sz w:val="18"/>
-                <w:szCs w:val="18"/>
-              </w:rPr>
-              <w:t>BB-/Stable</w:t>
-            </w:r>
-          </w:p>
-        </w:tc>
-        <w:tc>
-          <w:tcPr>
-            <w:tcW w:w="2200" w:type="dxa"/>
-            <w:shd w:val="clear" w:color="auto" w:fill="FFFFFF"/>
-            <w:tcMar>
-              <w:top w:w="40" w:type="dxa"/>
-              <w:left w:w="100" w:type="dxa"/>
-              <w:bottom w:w="40" w:type="dxa"/>
-              <w:right w:w="100" w:type="dxa"/>
-            </w:tcMar>
-            <w:vAlign w:val="center"/>
-          </w:tcPr>
-          <w:p>
-            <w:pPr>
-              <w:spacing w:before="20" w:after="20"/>
-              <w:jc w:val="right"/>
-            </w:pPr>
-            <w:r>
-              <w:rPr>
-                <w:color w:val="1A1A1A"/>
-                <w:sz w:val="18"/>
-                <w:szCs w:val="18"/>
-              </w:rPr>
-              <w:t>BB/Stable</w:t>
-            </w:r>
-          </w:p>
-        </w:tc>
-      </w:tr>
-      <w:tr>
-        <w:tc>
-          <w:tcPr>
-            <w:tcW w:w="3480" w:type="dxa"/>
-            <w:shd w:val="clear" w:color="auto" w:fill="FFFFFF"/>
-            <w:tcMar>
-              <w:top w:w="40" w:type="dxa"/>
-              <w:left w:w="100" w:type="dxa"/>
-              <w:bottom w:w="40" w:type="dxa"/>
-              <w:right w:w="100" w:type="dxa"/>
-            </w:tcMar>
-            <w:vAlign w:val="center"/>
-          </w:tcPr>
-          <w:p>
-            <w:pPr>
-              <w:spacing w:before="20" w:after="20"/>
-            </w:pPr>
-            <w:r>
-              <w:rPr>
-                <w:color w:val="1A1A1A"/>
-                <w:sz w:val="18"/>
-                <w:szCs w:val="18"/>
-              </w:rPr>
-              <w:t>S&amp;P</w:t>
-            </w:r>
-          </w:p>
-        </w:tc>
-        <w:tc>
-          <w:tcPr>
-            <w:tcW w:w="2200" w:type="dxa"/>
-            <w:shd w:val="clear" w:color="auto" w:fill="FFFFFF"/>
-            <w:tcMar>
-              <w:top w:w="40" w:type="dxa"/>
-              <w:left w:w="100" w:type="dxa"/>
-              <w:bottom w:w="40" w:type="dxa"/>
-              <w:right w:w="100" w:type="dxa"/>
-            </w:tcMar>
-            <w:vAlign w:val="center"/>
-          </w:tcPr>
-          <w:p>
-            <w:pPr>
-              <w:spacing w:before="20" w:after="20"/>
-              <w:jc w:val="right"/>
-            </w:pPr>
-            <w:r>
-              <w:rPr>
-                <w:b/>
-                <w:bCs/>
-                <w:color w:val="1A1A1A"/>
-                <w:sz w:val="18"/>
-                <w:szCs w:val="18"/>
-              </w:rPr>
-              <w:t>BB-/Stable</w:t>
-            </w:r>
-          </w:p>
-        </w:tc>
-        <w:tc>
-          <w:tcPr>
-            <w:tcW w:w="2200" w:type="dxa"/>
-            <w:shd w:val="clear" w:color="auto" w:fill="FFFFFF"/>
-            <w:tcMar>
-              <w:top w:w="40" w:type="dxa"/>
-              <w:left w:w="100" w:type="dxa"/>
-              <w:bottom w:w="40" w:type="dxa"/>
-              <w:right w:w="100" w:type="dxa"/>
-            </w:tcMar>
-            <w:vAlign w:val="center"/>
-          </w:tcPr>
-          <w:p>
-            <w:pPr>
-              <w:spacing w:before="20" w:after="20"/>
-              <w:jc w:val="right"/>
-            </w:pPr>
-            <w:r>
-              <w:rPr>
-                <w:color w:val="1A1A1A"/>
-                <w:sz w:val="18"/>
-                <w:szCs w:val="18"/>
-              </w:rPr>
-              <w:t>n.a.</w:t>
-            </w:r>
-          </w:p>
-        </w:tc>
-        <w:tc>
-          <w:tcPr>
-            <w:tcW w:w="2200" w:type="dxa"/>
-            <w:shd w:val="clear" w:color="auto" w:fill="FFFFFF"/>
-            <w:tcMar>
-              <w:top w:w="40" w:type="dxa"/>
-              <w:left w:w="100" w:type="dxa"/>
-              <w:bottom w:w="40" w:type="dxa"/>
-              <w:right w:w="100" w:type="dxa"/>
-            </w:tcMar>
-            <w:vAlign w:val="center"/>
-          </w:tcPr>
-          <w:p>
-            <w:pPr>
-              <w:spacing w:before="20" w:after="20"/>
-              <w:jc w:val="right"/>
-            </w:pPr>
-            <w:r>
-              <w:rPr>
-                <w:color w:val="1A1A1A"/>
-                <w:sz w:val="18"/>
-                <w:szCs w:val="18"/>
-              </w:rPr>
-              <w:t>—</w:t>
-            </w:r>
-          </w:p>
-        </w:tc>
-      </w:tr>
-    </w:tbl>
-    <w:p>
-      <w:pPr>
-        <w:spacing w:before="60" w:after="120"/>
-      </w:pPr>
-      <w:r>
-        <w:rPr>
-          <w:i/>
-          <w:iCs/>
-          <w:color w:val="777777"/>
-          <w:sz w:val="16"/>
-          <w:szCs w:val="16"/>
-        </w:rPr>
-        <w:t>FY2024 figures, or the latest available full-year figures for the peers. * = FID estimate. Peer prudential metrics (NPL, CAR, Tier 1, NIM, LCR/NSFR) are not uniformly disclosed for FY2024 and are marked n.a. ROE, ROA and LDR are computed from reported balances. FX uniform at USD/UZS = 12,150. Source: Central Bank of Uzbekistan and the banks’ published full-year financial statements; NBU FY2024 statutory accounts.</w:t>
       </w:r>
     </w:p>
     <w:p>

</xml_diff>

<commit_message>
Add Kazakhstan peers (Halyk, Kaspi) to 2.5 peer table; annualize only ROE/ROA
- Rebuild Section 2.5 peer comparison with five banks: NBU, SQB,
  Agrobank, Halyk Bank and Kaspi.kz, all on a 2025 1H (30 Jun 2025) basis
- Remove the separate annualised net-profit row; annualise only ROE and
  ROA; show net profit/NII as six-month figures and NIM as published
- Convert Kazakh figures at USD/KZT 519.73; update intro and footnote
  with sources, FX and estimate/disclosure caveats
</commit_message>
<xml_diff>
--- a/NBU_Credit_Limit_Report_Jun_26.docx
+++ b/NBU_Credit_Limit_Report_Jun_26.docx
@@ -10714,7 +10714,7 @@
         <w:rPr>
           <w:color w:val="1A1A1A"/>
         </w:rPr>
-        <w:t>The tables below benchmark NBU against the next two largest banks in Uzbekistan - Uzpromstroybank (SQB) and Agrobank - across the same extended set of key performance indicators used in Section 2.4 (profitability, asset quality, capital adequacy, liquidity, scale and ratings). To make the comparison meaningful, all three banks are shown on a consistent 2025 1H (H1 2025) basis as at 30 June 2025, using a uniform exchange rate of USD/UZS = 12,150. NBU’s figures are taken from its reviewed interim IFRS financial statements for the six months ended 30 June 2025, consistent with the 2025 1H column in Section 2.4: net profit and net interest income are stated for the six-month period, while a separate annualised net-profit line and annualised return ratios (ROE, ROA, NIM) are shown so that half-year earnings can be compared on a full-year-equivalent basis. A 2024 full-year comparison follows. Monetary KPIs are in USD million unless stated; ratios are in per cent.</w:t>
+        <w:t>The table below benchmarks NBU against the two next-largest banks in Uzbekistan — Uzpromstroybank (SQB) and Agrobank — and the two largest banks in Kazakhstan — Halyk Bank (Halyk Savings Bank of Kazakhstan) and Kaspi.kz — across the same extended set of key performance indicators used in Section 2.4 (profitability, asset quality, capital adequacy, liquidity, scale and ratings). To make the comparison meaningful, all five banks are shown on a consistent 2025 1H basis as at 30 June 2025, using uniform exchange rates of USD/UZS = 12,150 and USD/KZT = 519.73 (period-end). Net profit and net interest income are stated for the six-month period; in line with the agreed basis, only the return ratios (ROE and ROA) are annualised (six-month result × 2) so that half-year earnings can be compared on a full-year-equivalent basis, while NIM is each bank’s published period margin. Monetary KPIs are in USD million unless stated; ratios are in per cent. Halyk and Kaspi are materially larger than the Uzbek banks and are included to position NBU against the leading Central Asian banking franchises; Kaspi.kz reports as a diversified payments and fintech group and does not disclose several bank-prudential ratios, which are accordingly marked n.a.</w:t>
       </w:r>
     </w:p>
     <w:tbl>
@@ -10731,15 +10731,17 @@
         <w:tblLook w:val="04A0" w:firstRow="1" w:lastRow="0" w:firstColumn="1" w:lastColumn="0" w:noHBand="0" w:noVBand="1"/>
       </w:tblPr>
       <w:tblGrid>
-        <w:gridCol w:w="3480"/>
-        <w:gridCol w:w="2200"/>
-        <w:gridCol w:w="2200"/>
-        <w:gridCol w:w="2200"/>
+        <w:gridCol w:w="2880"/>
+        <w:gridCol w:w="1440"/>
+        <w:gridCol w:w="1440"/>
+        <w:gridCol w:w="1440"/>
+        <w:gridCol w:w="1440"/>
+        <w:gridCol w:w="1440"/>
       </w:tblGrid>
       <w:tr>
         <w:tc>
           <w:tcPr>
-            <w:tcW w:w="3480" w:type="dxa"/>
+            <w:tcW w:w="2880" w:type="dxa"/>
             <w:shd w:val="clear" w:color="auto" w:fill="2E4057"/>
             <w:tcMar>
               <w:top w:w="40" w:type="dxa"/>
@@ -10767,7 +10769,7 @@
         </w:tc>
         <w:tc>
           <w:tcPr>
-            <w:tcW w:w="2200" w:type="dxa"/>
+            <w:tcW w:w="1440" w:type="dxa"/>
             <w:shd w:val="clear" w:color="auto" w:fill="2E4057"/>
             <w:tcMar>
               <w:top w:w="40" w:type="dxa"/>
@@ -10796,7 +10798,7 @@
         </w:tc>
         <w:tc>
           <w:tcPr>
-            <w:tcW w:w="2200" w:type="dxa"/>
+            <w:tcW w:w="1440" w:type="dxa"/>
             <w:shd w:val="clear" w:color="auto" w:fill="2E4057"/>
             <w:tcMar>
               <w:top w:w="40" w:type="dxa"/>
@@ -10819,13 +10821,13 @@
                 <w:sz w:val="18"/>
                 <w:szCs w:val="18"/>
               </w:rPr>
-              <w:t>SQB (H1 2025)</w:t>
-            </w:r>
-          </w:p>
-        </w:tc>
-        <w:tc>
-          <w:tcPr>
-            <w:tcW w:w="2200" w:type="dxa"/>
+              <w:t>SQB (2025 1H)</w:t>
+            </w:r>
+          </w:p>
+        </w:tc>
+        <w:tc>
+          <w:tcPr>
+            <w:tcW w:w="1440" w:type="dxa"/>
             <w:shd w:val="clear" w:color="auto" w:fill="2E4057"/>
             <w:tcMar>
               <w:top w:w="40" w:type="dxa"/>
@@ -10848,7 +10850,65 @@
                 <w:sz w:val="18"/>
                 <w:szCs w:val="18"/>
               </w:rPr>
-              <w:t>Agrobank (H1 2025)</w:t>
+              <w:t>Agrobank (2025 1H)</w:t>
+            </w:r>
+          </w:p>
+        </w:tc>
+        <w:tc>
+          <w:tcPr>
+            <w:tcW w:w="1440" w:type="dxa"/>
+            <w:shd w:val="clear" w:color="auto" w:fill="2E4057"/>
+            <w:tcMar>
+              <w:top w:w="40" w:type="dxa"/>
+              <w:left w:w="100" w:type="dxa"/>
+              <w:bottom w:w="40" w:type="dxa"/>
+              <w:right w:w="100" w:type="dxa"/>
+            </w:tcMar>
+            <w:vAlign w:val="center"/>
+          </w:tcPr>
+          <w:p>
+            <w:pPr>
+              <w:spacing w:before="20" w:after="20"/>
+              <w:jc w:val="right"/>
+            </w:pPr>
+            <w:r>
+              <w:rPr>
+                <w:b/>
+                <w:bCs/>
+                <w:color w:val="FFFFFF"/>
+                <w:sz w:val="18"/>
+                <w:szCs w:val="18"/>
+              </w:rPr>
+              <w:t>Halyk (2025 1H)</w:t>
+            </w:r>
+          </w:p>
+        </w:tc>
+        <w:tc>
+          <w:tcPr>
+            <w:tcW w:w="1440" w:type="dxa"/>
+            <w:shd w:val="clear" w:color="auto" w:fill="2E4057"/>
+            <w:tcMar>
+              <w:top w:w="40" w:type="dxa"/>
+              <w:left w:w="100" w:type="dxa"/>
+              <w:bottom w:w="40" w:type="dxa"/>
+              <w:right w:w="100" w:type="dxa"/>
+            </w:tcMar>
+            <w:vAlign w:val="center"/>
+          </w:tcPr>
+          <w:p>
+            <w:pPr>
+              <w:spacing w:before="20" w:after="20"/>
+              <w:jc w:val="right"/>
+            </w:pPr>
+            <w:r>
+              <w:rPr>
+                <w:b/>
+                <w:bCs/>
+                <w:color w:val="FFFFFF"/>
+                <w:sz w:val="18"/>
+                <w:szCs w:val="18"/>
+              </w:rPr>
+              <w:t>Kaspi.kz (2025 1H)</w:t>
             </w:r>
           </w:p>
         </w:tc>
@@ -10857,7 +10917,7 @@
         <w:tc>
           <w:tcPr>
             <w:tcW w:w="10080" w:type="dxa"/>
-            <w:gridSpan w:val="4"/>
+            <w:gridSpan w:val="6"/>
             <w:shd w:val="clear" w:color="auto" w:fill="EDF2F7"/>
             <w:tcMar>
               <w:top w:w="40" w:type="dxa"/>
@@ -10879,7 +10939,6 @@
                 <w:sz w:val="18"/>
                 <w:szCs w:val="18"/>
               </w:rPr>
-              <w:lastRenderedPageBreak/>
               <w:t>Profitability</w:t>
             </w:r>
           </w:p>
@@ -10888,7 +10947,7 @@
       <w:tr>
         <w:tc>
           <w:tcPr>
-            <w:tcW w:w="3480" w:type="dxa"/>
+            <w:tcW w:w="2880" w:type="dxa"/>
             <w:shd w:val="clear" w:color="auto" w:fill="FFFFFF"/>
             <w:tcMar>
               <w:top w:w="40" w:type="dxa"/>
@@ -10914,7 +10973,7 @@
         </w:tc>
         <w:tc>
           <w:tcPr>
-            <w:tcW w:w="2200" w:type="dxa"/>
+            <w:tcW w:w="1440" w:type="dxa"/>
             <w:shd w:val="clear" w:color="auto" w:fill="FFFFFF"/>
             <w:tcMar>
               <w:top w:w="40" w:type="dxa"/>
@@ -10943,7 +11002,7 @@
         </w:tc>
         <w:tc>
           <w:tcPr>
-            <w:tcW w:w="2200" w:type="dxa"/>
+            <w:tcW w:w="1440" w:type="dxa"/>
             <w:shd w:val="clear" w:color="auto" w:fill="FFFFFF"/>
             <w:tcMar>
               <w:top w:w="40" w:type="dxa"/>
@@ -10970,7 +11029,7 @@
         </w:tc>
         <w:tc>
           <w:tcPr>
-            <w:tcW w:w="2200" w:type="dxa"/>
+            <w:tcW w:w="1440" w:type="dxa"/>
             <w:shd w:val="clear" w:color="auto" w:fill="FFFFFF"/>
             <w:tcMar>
               <w:top w:w="40" w:type="dxa"/>
@@ -10992,6 +11051,60 @@
                 <w:szCs w:val="18"/>
               </w:rPr>
               <w:t>4.7</w:t>
+            </w:r>
+          </w:p>
+        </w:tc>
+        <w:tc>
+          <w:tcPr>
+            <w:tcW w:w="1440" w:type="dxa"/>
+            <w:shd w:val="clear" w:color="auto" w:fill="FFFFFF"/>
+            <w:tcMar>
+              <w:top w:w="40" w:type="dxa"/>
+              <w:left w:w="100" w:type="dxa"/>
+              <w:bottom w:w="40" w:type="dxa"/>
+              <w:right w:w="100" w:type="dxa"/>
+            </w:tcMar>
+            <w:vAlign w:val="center"/>
+          </w:tcPr>
+          <w:p>
+            <w:pPr>
+              <w:spacing w:before="20" w:after="20"/>
+              <w:jc w:val="right"/>
+            </w:pPr>
+            <w:r>
+              <w:rPr>
+                <w:color w:val="1A1A1A"/>
+                <w:sz w:val="18"/>
+                <w:szCs w:val="18"/>
+              </w:rPr>
+              <w:t>~1,017</w:t>
+            </w:r>
+          </w:p>
+        </w:tc>
+        <w:tc>
+          <w:tcPr>
+            <w:tcW w:w="1440" w:type="dxa"/>
+            <w:shd w:val="clear" w:color="auto" w:fill="FFFFFF"/>
+            <w:tcMar>
+              <w:top w:w="40" w:type="dxa"/>
+              <w:left w:w="100" w:type="dxa"/>
+              <w:bottom w:w="40" w:type="dxa"/>
+              <w:right w:w="100" w:type="dxa"/>
+            </w:tcMar>
+            <w:vAlign w:val="center"/>
+          </w:tcPr>
+          <w:p>
+            <w:pPr>
+              <w:spacing w:before="20" w:after="20"/>
+              <w:jc w:val="right"/>
+            </w:pPr>
+            <w:r>
+              <w:rPr>
+                <w:color w:val="1A1A1A"/>
+                <w:sz w:val="18"/>
+                <w:szCs w:val="18"/>
+              </w:rPr>
+              <w:t>~987</w:t>
             </w:r>
           </w:p>
         </w:tc>
@@ -10999,33 +11112,33 @@
       <w:tr>
         <w:tc>
           <w:tcPr>
-            <w:tcW w:w="3480" w:type="dxa"/>
-            <w:shd w:val="clear" w:color="auto" w:fill="FFFFFF"/>
-            <w:tcMar>
-              <w:top w:w="40" w:type="dxa"/>
-              <w:left w:w="100" w:type="dxa"/>
-              <w:bottom w:w="40" w:type="dxa"/>
-              <w:right w:w="100" w:type="dxa"/>
-            </w:tcMar>
-            <w:vAlign w:val="center"/>
-          </w:tcPr>
-          <w:p>
-            <w:pPr>
-              <w:spacing w:before="20" w:after="20"/>
-            </w:pPr>
-            <w:r>
-              <w:rPr>
-                <w:color w:val="1A1A1A"/>
-                <w:sz w:val="18"/>
-                <w:szCs w:val="18"/>
-              </w:rPr>
-              <w:t>Net Profit - annualised (USD M)</w:t>
-            </w:r>
-          </w:p>
-        </w:tc>
-        <w:tc>
-          <w:tcPr>
-            <w:tcW w:w="2200" w:type="dxa"/>
+            <w:tcW w:w="2880" w:type="dxa"/>
+            <w:shd w:val="clear" w:color="auto" w:fill="FFFFFF"/>
+            <w:tcMar>
+              <w:top w:w="40" w:type="dxa"/>
+              <w:left w:w="100" w:type="dxa"/>
+              <w:bottom w:w="40" w:type="dxa"/>
+              <w:right w:w="100" w:type="dxa"/>
+            </w:tcMar>
+            <w:vAlign w:val="center"/>
+          </w:tcPr>
+          <w:p>
+            <w:pPr>
+              <w:spacing w:before="20" w:after="20"/>
+            </w:pPr>
+            <w:r>
+              <w:rPr>
+                <w:color w:val="1A1A1A"/>
+                <w:sz w:val="18"/>
+                <w:szCs w:val="18"/>
+              </w:rPr>
+              <w:t>Net Interest Income - reported (USD M)</w:t>
+            </w:r>
+          </w:p>
+        </w:tc>
+        <w:tc>
+          <w:tcPr>
+            <w:tcW w:w="1440" w:type="dxa"/>
             <w:shd w:val="clear" w:color="auto" w:fill="FFFFFF"/>
             <w:tcMar>
               <w:top w:w="40" w:type="dxa"/>
@@ -11048,61 +11161,115 @@
                 <w:sz w:val="18"/>
                 <w:szCs w:val="18"/>
               </w:rPr>
-              <w:t>272.1</w:t>
-            </w:r>
-          </w:p>
-        </w:tc>
-        <w:tc>
-          <w:tcPr>
-            <w:tcW w:w="2200" w:type="dxa"/>
-            <w:shd w:val="clear" w:color="auto" w:fill="FFFFFF"/>
-            <w:tcMar>
-              <w:top w:w="40" w:type="dxa"/>
-              <w:left w:w="100" w:type="dxa"/>
-              <w:bottom w:w="40" w:type="dxa"/>
-              <w:right w:w="100" w:type="dxa"/>
-            </w:tcMar>
-            <w:vAlign w:val="center"/>
-          </w:tcPr>
-          <w:p>
-            <w:pPr>
-              <w:spacing w:before="20" w:after="20"/>
-              <w:jc w:val="right"/>
-            </w:pPr>
-            <w:r>
-              <w:rPr>
-                <w:color w:val="1A1A1A"/>
-                <w:sz w:val="18"/>
-                <w:szCs w:val="18"/>
-              </w:rPr>
-              <w:t>117</w:t>
-            </w:r>
-          </w:p>
-        </w:tc>
-        <w:tc>
-          <w:tcPr>
-            <w:tcW w:w="2200" w:type="dxa"/>
-            <w:shd w:val="clear" w:color="auto" w:fill="FFFFFF"/>
-            <w:tcMar>
-              <w:top w:w="40" w:type="dxa"/>
-              <w:left w:w="100" w:type="dxa"/>
-              <w:bottom w:w="40" w:type="dxa"/>
-              <w:right w:w="100" w:type="dxa"/>
-            </w:tcMar>
-            <w:vAlign w:val="center"/>
-          </w:tcPr>
-          <w:p>
-            <w:pPr>
-              <w:spacing w:before="20" w:after="20"/>
-              <w:jc w:val="right"/>
-            </w:pPr>
-            <w:r>
-              <w:rPr>
-                <w:color w:val="1A1A1A"/>
-                <w:sz w:val="18"/>
-                <w:szCs w:val="18"/>
-              </w:rPr>
-              <w:t>9.5</w:t>
+              <w:t>268.2</w:t>
+            </w:r>
+          </w:p>
+        </w:tc>
+        <w:tc>
+          <w:tcPr>
+            <w:tcW w:w="1440" w:type="dxa"/>
+            <w:shd w:val="clear" w:color="auto" w:fill="FFFFFF"/>
+            <w:tcMar>
+              <w:top w:w="40" w:type="dxa"/>
+              <w:left w:w="100" w:type="dxa"/>
+              <w:bottom w:w="40" w:type="dxa"/>
+              <w:right w:w="100" w:type="dxa"/>
+            </w:tcMar>
+            <w:vAlign w:val="center"/>
+          </w:tcPr>
+          <w:p>
+            <w:pPr>
+              <w:spacing w:before="20" w:after="20"/>
+              <w:jc w:val="right"/>
+            </w:pPr>
+            <w:r>
+              <w:rPr>
+                <w:color w:val="1A1A1A"/>
+                <w:sz w:val="18"/>
+                <w:szCs w:val="18"/>
+              </w:rPr>
+              <w:t>220</w:t>
+            </w:r>
+          </w:p>
+        </w:tc>
+        <w:tc>
+          <w:tcPr>
+            <w:tcW w:w="1440" w:type="dxa"/>
+            <w:shd w:val="clear" w:color="auto" w:fill="FFFFFF"/>
+            <w:tcMar>
+              <w:top w:w="40" w:type="dxa"/>
+              <w:left w:w="100" w:type="dxa"/>
+              <w:bottom w:w="40" w:type="dxa"/>
+              <w:right w:w="100" w:type="dxa"/>
+            </w:tcMar>
+            <w:vAlign w:val="center"/>
+          </w:tcPr>
+          <w:p>
+            <w:pPr>
+              <w:spacing w:before="20" w:after="20"/>
+              <w:jc w:val="right"/>
+            </w:pPr>
+            <w:r>
+              <w:rPr>
+                <w:color w:val="1A1A1A"/>
+                <w:sz w:val="18"/>
+                <w:szCs w:val="18"/>
+              </w:rPr>
+              <w:t>n.a.²</w:t>
+            </w:r>
+          </w:p>
+        </w:tc>
+        <w:tc>
+          <w:tcPr>
+            <w:tcW w:w="1440" w:type="dxa"/>
+            <w:shd w:val="clear" w:color="auto" w:fill="FFFFFF"/>
+            <w:tcMar>
+              <w:top w:w="40" w:type="dxa"/>
+              <w:left w:w="100" w:type="dxa"/>
+              <w:bottom w:w="40" w:type="dxa"/>
+              <w:right w:w="100" w:type="dxa"/>
+            </w:tcMar>
+            <w:vAlign w:val="center"/>
+          </w:tcPr>
+          <w:p>
+            <w:pPr>
+              <w:spacing w:before="20" w:after="20"/>
+              <w:jc w:val="right"/>
+            </w:pPr>
+            <w:r>
+              <w:rPr>
+                <w:color w:val="1A1A1A"/>
+                <w:sz w:val="18"/>
+                <w:szCs w:val="18"/>
+              </w:rPr>
+              <w:t>~1,280</w:t>
+            </w:r>
+          </w:p>
+        </w:tc>
+        <w:tc>
+          <w:tcPr>
+            <w:tcW w:w="1440" w:type="dxa"/>
+            <w:shd w:val="clear" w:color="auto" w:fill="FFFFFF"/>
+            <w:tcMar>
+              <w:top w:w="40" w:type="dxa"/>
+              <w:left w:w="100" w:type="dxa"/>
+              <w:bottom w:w="40" w:type="dxa"/>
+              <w:right w:w="100" w:type="dxa"/>
+            </w:tcMar>
+            <w:vAlign w:val="center"/>
+          </w:tcPr>
+          <w:p>
+            <w:pPr>
+              <w:spacing w:before="20" w:after="20"/>
+              <w:jc w:val="right"/>
+            </w:pPr>
+            <w:r>
+              <w:rPr>
+                <w:color w:val="1A1A1A"/>
+                <w:sz w:val="18"/>
+                <w:szCs w:val="18"/>
+              </w:rPr>
+              <w:t>n.a.³</w:t>
             </w:r>
           </w:p>
         </w:tc>
@@ -11110,33 +11277,33 @@
       <w:tr>
         <w:tc>
           <w:tcPr>
-            <w:tcW w:w="3480" w:type="dxa"/>
-            <w:shd w:val="clear" w:color="auto" w:fill="FFFFFF"/>
-            <w:tcMar>
-              <w:top w:w="40" w:type="dxa"/>
-              <w:left w:w="100" w:type="dxa"/>
-              <w:bottom w:w="40" w:type="dxa"/>
-              <w:right w:w="100" w:type="dxa"/>
-            </w:tcMar>
-            <w:vAlign w:val="center"/>
-          </w:tcPr>
-          <w:p>
-            <w:pPr>
-              <w:spacing w:before="20" w:after="20"/>
-            </w:pPr>
-            <w:r>
-              <w:rPr>
-                <w:color w:val="1A1A1A"/>
-                <w:sz w:val="18"/>
-                <w:szCs w:val="18"/>
-              </w:rPr>
-              <w:t>Net Interest Income - reported (USD M)</w:t>
-            </w:r>
-          </w:p>
-        </w:tc>
-        <w:tc>
-          <w:tcPr>
-            <w:tcW w:w="2200" w:type="dxa"/>
+            <w:tcW w:w="2880" w:type="dxa"/>
+            <w:shd w:val="clear" w:color="auto" w:fill="FFFFFF"/>
+            <w:tcMar>
+              <w:top w:w="40" w:type="dxa"/>
+              <w:left w:w="100" w:type="dxa"/>
+              <w:bottom w:w="40" w:type="dxa"/>
+              <w:right w:w="100" w:type="dxa"/>
+            </w:tcMar>
+            <w:vAlign w:val="center"/>
+          </w:tcPr>
+          <w:p>
+            <w:pPr>
+              <w:spacing w:before="20" w:after="20"/>
+            </w:pPr>
+            <w:r>
+              <w:rPr>
+                <w:color w:val="1A1A1A"/>
+                <w:sz w:val="18"/>
+                <w:szCs w:val="18"/>
+              </w:rPr>
+              <w:t>Net Interest Margin (NIM)</w:t>
+            </w:r>
+          </w:p>
+        </w:tc>
+        <w:tc>
+          <w:tcPr>
+            <w:tcW w:w="1440" w:type="dxa"/>
             <w:shd w:val="clear" w:color="auto" w:fill="FFFFFF"/>
             <w:tcMar>
               <w:top w:w="40" w:type="dxa"/>
@@ -11159,61 +11326,115 @@
                 <w:sz w:val="18"/>
                 <w:szCs w:val="18"/>
               </w:rPr>
-              <w:t>268.2</w:t>
-            </w:r>
-          </w:p>
-        </w:tc>
-        <w:tc>
-          <w:tcPr>
-            <w:tcW w:w="2200" w:type="dxa"/>
-            <w:shd w:val="clear" w:color="auto" w:fill="FFFFFF"/>
-            <w:tcMar>
-              <w:top w:w="40" w:type="dxa"/>
-              <w:left w:w="100" w:type="dxa"/>
-              <w:bottom w:w="40" w:type="dxa"/>
-              <w:right w:w="100" w:type="dxa"/>
-            </w:tcMar>
-            <w:vAlign w:val="center"/>
-          </w:tcPr>
-          <w:p>
-            <w:pPr>
-              <w:spacing w:before="20" w:after="20"/>
-              <w:jc w:val="right"/>
-            </w:pPr>
-            <w:r>
-              <w:rPr>
-                <w:color w:val="1A1A1A"/>
-                <w:sz w:val="18"/>
-                <w:szCs w:val="18"/>
-              </w:rPr>
-              <w:t>220</w:t>
-            </w:r>
-          </w:p>
-        </w:tc>
-        <w:tc>
-          <w:tcPr>
-            <w:tcW w:w="2200" w:type="dxa"/>
-            <w:shd w:val="clear" w:color="auto" w:fill="FFFFFF"/>
-            <w:tcMar>
-              <w:top w:w="40" w:type="dxa"/>
-              <w:left w:w="100" w:type="dxa"/>
-              <w:bottom w:w="40" w:type="dxa"/>
-              <w:right w:w="100" w:type="dxa"/>
-            </w:tcMar>
-            <w:vAlign w:val="center"/>
-          </w:tcPr>
-          <w:p>
-            <w:pPr>
-              <w:spacing w:before="20" w:after="20"/>
-              <w:jc w:val="right"/>
-            </w:pPr>
-            <w:r>
-              <w:rPr>
-                <w:color w:val="1A1A1A"/>
-                <w:sz w:val="18"/>
-                <w:szCs w:val="18"/>
-              </w:rPr>
-              <w:t>n.a.²</w:t>
+              <w:t>~4.5%</w:t>
+            </w:r>
+          </w:p>
+        </w:tc>
+        <w:tc>
+          <w:tcPr>
+            <w:tcW w:w="1440" w:type="dxa"/>
+            <w:shd w:val="clear" w:color="auto" w:fill="FFFFFF"/>
+            <w:tcMar>
+              <w:top w:w="40" w:type="dxa"/>
+              <w:left w:w="100" w:type="dxa"/>
+              <w:bottom w:w="40" w:type="dxa"/>
+              <w:right w:w="100" w:type="dxa"/>
+            </w:tcMar>
+            <w:vAlign w:val="center"/>
+          </w:tcPr>
+          <w:p>
+            <w:pPr>
+              <w:spacing w:before="20" w:after="20"/>
+              <w:jc w:val="right"/>
+            </w:pPr>
+            <w:r>
+              <w:rPr>
+                <w:color w:val="1A1A1A"/>
+                <w:sz w:val="18"/>
+                <w:szCs w:val="18"/>
+              </w:rPr>
+              <w:t>4.7%</w:t>
+            </w:r>
+          </w:p>
+        </w:tc>
+        <w:tc>
+          <w:tcPr>
+            <w:tcW w:w="1440" w:type="dxa"/>
+            <w:shd w:val="clear" w:color="auto" w:fill="FFFFFF"/>
+            <w:tcMar>
+              <w:top w:w="40" w:type="dxa"/>
+              <w:left w:w="100" w:type="dxa"/>
+              <w:bottom w:w="40" w:type="dxa"/>
+              <w:right w:w="100" w:type="dxa"/>
+            </w:tcMar>
+            <w:vAlign w:val="center"/>
+          </w:tcPr>
+          <w:p>
+            <w:pPr>
+              <w:spacing w:before="20" w:after="20"/>
+              <w:jc w:val="right"/>
+            </w:pPr>
+            <w:r>
+              <w:rPr>
+                <w:color w:val="1A1A1A"/>
+                <w:sz w:val="18"/>
+                <w:szCs w:val="18"/>
+              </w:rPr>
+              <w:t>3.4%</w:t>
+            </w:r>
+          </w:p>
+        </w:tc>
+        <w:tc>
+          <w:tcPr>
+            <w:tcW w:w="1440" w:type="dxa"/>
+            <w:shd w:val="clear" w:color="auto" w:fill="FFFFFF"/>
+            <w:tcMar>
+              <w:top w:w="40" w:type="dxa"/>
+              <w:left w:w="100" w:type="dxa"/>
+              <w:bottom w:w="40" w:type="dxa"/>
+              <w:right w:w="100" w:type="dxa"/>
+            </w:tcMar>
+            <w:vAlign w:val="center"/>
+          </w:tcPr>
+          <w:p>
+            <w:pPr>
+              <w:spacing w:before="20" w:after="20"/>
+              <w:jc w:val="right"/>
+            </w:pPr>
+            <w:r>
+              <w:rPr>
+                <w:color w:val="1A1A1A"/>
+                <w:sz w:val="18"/>
+                <w:szCs w:val="18"/>
+              </w:rPr>
+              <w:t>7.2%</w:t>
+            </w:r>
+          </w:p>
+        </w:tc>
+        <w:tc>
+          <w:tcPr>
+            <w:tcW w:w="1440" w:type="dxa"/>
+            <w:shd w:val="clear" w:color="auto" w:fill="FFFFFF"/>
+            <w:tcMar>
+              <w:top w:w="40" w:type="dxa"/>
+              <w:left w:w="100" w:type="dxa"/>
+              <w:bottom w:w="40" w:type="dxa"/>
+              <w:right w:w="100" w:type="dxa"/>
+            </w:tcMar>
+            <w:vAlign w:val="center"/>
+          </w:tcPr>
+          <w:p>
+            <w:pPr>
+              <w:spacing w:before="20" w:after="20"/>
+              <w:jc w:val="right"/>
+            </w:pPr>
+            <w:r>
+              <w:rPr>
+                <w:color w:val="1A1A1A"/>
+                <w:sz w:val="18"/>
+                <w:szCs w:val="18"/>
+              </w:rPr>
+              <w:t>n.a.³</w:t>
             </w:r>
           </w:p>
         </w:tc>
@@ -11221,33 +11442,33 @@
       <w:tr>
         <w:tc>
           <w:tcPr>
-            <w:tcW w:w="3480" w:type="dxa"/>
-            <w:shd w:val="clear" w:color="auto" w:fill="FFFFFF"/>
-            <w:tcMar>
-              <w:top w:w="40" w:type="dxa"/>
-              <w:left w:w="100" w:type="dxa"/>
-              <w:bottom w:w="40" w:type="dxa"/>
-              <w:right w:w="100" w:type="dxa"/>
-            </w:tcMar>
-            <w:vAlign w:val="center"/>
-          </w:tcPr>
-          <w:p>
-            <w:pPr>
-              <w:spacing w:before="20" w:after="20"/>
-            </w:pPr>
-            <w:r>
-              <w:rPr>
-                <w:color w:val="1A1A1A"/>
-                <w:sz w:val="18"/>
-                <w:szCs w:val="18"/>
-              </w:rPr>
-              <w:t>Net Interest Margin (NIM)</w:t>
-            </w:r>
-          </w:p>
-        </w:tc>
-        <w:tc>
-          <w:tcPr>
-            <w:tcW w:w="2200" w:type="dxa"/>
+            <w:tcW w:w="2880" w:type="dxa"/>
+            <w:shd w:val="clear" w:color="auto" w:fill="FFFFFF"/>
+            <w:tcMar>
+              <w:top w:w="40" w:type="dxa"/>
+              <w:left w:w="100" w:type="dxa"/>
+              <w:bottom w:w="40" w:type="dxa"/>
+              <w:right w:w="100" w:type="dxa"/>
+            </w:tcMar>
+            <w:vAlign w:val="center"/>
+          </w:tcPr>
+          <w:p>
+            <w:pPr>
+              <w:spacing w:before="20" w:after="20"/>
+            </w:pPr>
+            <w:r>
+              <w:rPr>
+                <w:color w:val="1A1A1A"/>
+                <w:sz w:val="18"/>
+                <w:szCs w:val="18"/>
+              </w:rPr>
+              <w:t>Cost-to-Income Ratio (CIR)</w:t>
+            </w:r>
+          </w:p>
+        </w:tc>
+        <w:tc>
+          <w:tcPr>
+            <w:tcW w:w="1440" w:type="dxa"/>
             <w:shd w:val="clear" w:color="auto" w:fill="FFFFFF"/>
             <w:tcMar>
               <w:top w:w="40" w:type="dxa"/>
@@ -11270,61 +11491,115 @@
                 <w:sz w:val="18"/>
                 <w:szCs w:val="18"/>
               </w:rPr>
-              <w:t>~4.5%</w:t>
-            </w:r>
-          </w:p>
-        </w:tc>
-        <w:tc>
-          <w:tcPr>
-            <w:tcW w:w="2200" w:type="dxa"/>
-            <w:shd w:val="clear" w:color="auto" w:fill="FFFFFF"/>
-            <w:tcMar>
-              <w:top w:w="40" w:type="dxa"/>
-              <w:left w:w="100" w:type="dxa"/>
-              <w:bottom w:w="40" w:type="dxa"/>
-              <w:right w:w="100" w:type="dxa"/>
-            </w:tcMar>
-            <w:vAlign w:val="center"/>
-          </w:tcPr>
-          <w:p>
-            <w:pPr>
-              <w:spacing w:before="20" w:after="20"/>
-              <w:jc w:val="right"/>
-            </w:pPr>
-            <w:r>
-              <w:rPr>
-                <w:color w:val="1A1A1A"/>
-                <w:sz w:val="18"/>
-                <w:szCs w:val="18"/>
-              </w:rPr>
-              <w:t>4.7%</w:t>
-            </w:r>
-          </w:p>
-        </w:tc>
-        <w:tc>
-          <w:tcPr>
-            <w:tcW w:w="2200" w:type="dxa"/>
-            <w:shd w:val="clear" w:color="auto" w:fill="FFFFFF"/>
-            <w:tcMar>
-              <w:top w:w="40" w:type="dxa"/>
-              <w:left w:w="100" w:type="dxa"/>
-              <w:bottom w:w="40" w:type="dxa"/>
-              <w:right w:w="100" w:type="dxa"/>
-            </w:tcMar>
-            <w:vAlign w:val="center"/>
-          </w:tcPr>
-          <w:p>
-            <w:pPr>
-              <w:spacing w:before="20" w:after="20"/>
-              <w:jc w:val="right"/>
-            </w:pPr>
-            <w:r>
-              <w:rPr>
-                <w:color w:val="1A1A1A"/>
-                <w:sz w:val="18"/>
-                <w:szCs w:val="18"/>
-              </w:rPr>
-              <w:t>3.4%</w:t>
+              <w:t>~29%</w:t>
+            </w:r>
+          </w:p>
+        </w:tc>
+        <w:tc>
+          <w:tcPr>
+            <w:tcW w:w="1440" w:type="dxa"/>
+            <w:shd w:val="clear" w:color="auto" w:fill="FFFFFF"/>
+            <w:tcMar>
+              <w:top w:w="40" w:type="dxa"/>
+              <w:left w:w="100" w:type="dxa"/>
+              <w:bottom w:w="40" w:type="dxa"/>
+              <w:right w:w="100" w:type="dxa"/>
+            </w:tcMar>
+            <w:vAlign w:val="center"/>
+          </w:tcPr>
+          <w:p>
+            <w:pPr>
+              <w:spacing w:before="20" w:after="20"/>
+              <w:jc w:val="right"/>
+            </w:pPr>
+            <w:r>
+              <w:rPr>
+                <w:color w:val="1A1A1A"/>
+                <w:sz w:val="18"/>
+                <w:szCs w:val="18"/>
+              </w:rPr>
+              <w:t>20.7%</w:t>
+            </w:r>
+          </w:p>
+        </w:tc>
+        <w:tc>
+          <w:tcPr>
+            <w:tcW w:w="1440" w:type="dxa"/>
+            <w:shd w:val="clear" w:color="auto" w:fill="FFFFFF"/>
+            <w:tcMar>
+              <w:top w:w="40" w:type="dxa"/>
+              <w:left w:w="100" w:type="dxa"/>
+              <w:bottom w:w="40" w:type="dxa"/>
+              <w:right w:w="100" w:type="dxa"/>
+            </w:tcMar>
+            <w:vAlign w:val="center"/>
+          </w:tcPr>
+          <w:p>
+            <w:pPr>
+              <w:spacing w:before="20" w:after="20"/>
+              <w:jc w:val="right"/>
+            </w:pPr>
+            <w:r>
+              <w:rPr>
+                <w:color w:val="1A1A1A"/>
+                <w:sz w:val="18"/>
+                <w:szCs w:val="18"/>
+              </w:rPr>
+              <w:t>63.6%</w:t>
+            </w:r>
+          </w:p>
+        </w:tc>
+        <w:tc>
+          <w:tcPr>
+            <w:tcW w:w="1440" w:type="dxa"/>
+            <w:shd w:val="clear" w:color="auto" w:fill="FFFFFF"/>
+            <w:tcMar>
+              <w:top w:w="40" w:type="dxa"/>
+              <w:left w:w="100" w:type="dxa"/>
+              <w:bottom w:w="40" w:type="dxa"/>
+              <w:right w:w="100" w:type="dxa"/>
+            </w:tcMar>
+            <w:vAlign w:val="center"/>
+          </w:tcPr>
+          <w:p>
+            <w:pPr>
+              <w:spacing w:before="20" w:after="20"/>
+              <w:jc w:val="right"/>
+            </w:pPr>
+            <w:r>
+              <w:rPr>
+                <w:color w:val="1A1A1A"/>
+                <w:sz w:val="18"/>
+                <w:szCs w:val="18"/>
+              </w:rPr>
+              <w:t>17.2%</w:t>
+            </w:r>
+          </w:p>
+        </w:tc>
+        <w:tc>
+          <w:tcPr>
+            <w:tcW w:w="1440" w:type="dxa"/>
+            <w:shd w:val="clear" w:color="auto" w:fill="FFFFFF"/>
+            <w:tcMar>
+              <w:top w:w="40" w:type="dxa"/>
+              <w:left w:w="100" w:type="dxa"/>
+              <w:bottom w:w="40" w:type="dxa"/>
+              <w:right w:w="100" w:type="dxa"/>
+            </w:tcMar>
+            <w:vAlign w:val="center"/>
+          </w:tcPr>
+          <w:p>
+            <w:pPr>
+              <w:spacing w:before="20" w:after="20"/>
+              <w:jc w:val="right"/>
+            </w:pPr>
+            <w:r>
+              <w:rPr>
+                <w:color w:val="1A1A1A"/>
+                <w:sz w:val="18"/>
+                <w:szCs w:val="18"/>
+              </w:rPr>
+              <w:t>n.a.³</w:t>
             </w:r>
           </w:p>
         </w:tc>
@@ -11332,33 +11607,33 @@
       <w:tr>
         <w:tc>
           <w:tcPr>
-            <w:tcW w:w="3480" w:type="dxa"/>
-            <w:shd w:val="clear" w:color="auto" w:fill="FFFFFF"/>
-            <w:tcMar>
-              <w:top w:w="40" w:type="dxa"/>
-              <w:left w:w="100" w:type="dxa"/>
-              <w:bottom w:w="40" w:type="dxa"/>
-              <w:right w:w="100" w:type="dxa"/>
-            </w:tcMar>
-            <w:vAlign w:val="center"/>
-          </w:tcPr>
-          <w:p>
-            <w:pPr>
-              <w:spacing w:before="20" w:after="20"/>
-            </w:pPr>
-            <w:r>
-              <w:rPr>
-                <w:color w:val="1A1A1A"/>
-                <w:sz w:val="18"/>
-                <w:szCs w:val="18"/>
-              </w:rPr>
-              <w:t>Cost-to-Income Ratio (CIR)</w:t>
-            </w:r>
-          </w:p>
-        </w:tc>
-        <w:tc>
-          <w:tcPr>
-            <w:tcW w:w="2200" w:type="dxa"/>
+            <w:tcW w:w="2880" w:type="dxa"/>
+            <w:shd w:val="clear" w:color="auto" w:fill="FFFFFF"/>
+            <w:tcMar>
+              <w:top w:w="40" w:type="dxa"/>
+              <w:left w:w="100" w:type="dxa"/>
+              <w:bottom w:w="40" w:type="dxa"/>
+              <w:right w:w="100" w:type="dxa"/>
+            </w:tcMar>
+            <w:vAlign w:val="center"/>
+          </w:tcPr>
+          <w:p>
+            <w:pPr>
+              <w:spacing w:before="20" w:after="20"/>
+            </w:pPr>
+            <w:r>
+              <w:rPr>
+                <w:color w:val="1A1A1A"/>
+                <w:sz w:val="18"/>
+                <w:szCs w:val="18"/>
+              </w:rPr>
+              <w:t>Return on Equity (ROE, ann.)</w:t>
+            </w:r>
+          </w:p>
+        </w:tc>
+        <w:tc>
+          <w:tcPr>
+            <w:tcW w:w="1440" w:type="dxa"/>
             <w:shd w:val="clear" w:color="auto" w:fill="FFFFFF"/>
             <w:tcMar>
               <w:top w:w="40" w:type="dxa"/>
@@ -11381,61 +11656,115 @@
                 <w:sz w:val="18"/>
                 <w:szCs w:val="18"/>
               </w:rPr>
-              <w:t>~29%</w:t>
-            </w:r>
-          </w:p>
-        </w:tc>
-        <w:tc>
-          <w:tcPr>
-            <w:tcW w:w="2200" w:type="dxa"/>
-            <w:shd w:val="clear" w:color="auto" w:fill="FFFFFF"/>
-            <w:tcMar>
-              <w:top w:w="40" w:type="dxa"/>
-              <w:left w:w="100" w:type="dxa"/>
-              <w:bottom w:w="40" w:type="dxa"/>
-              <w:right w:w="100" w:type="dxa"/>
-            </w:tcMar>
-            <w:vAlign w:val="center"/>
-          </w:tcPr>
-          <w:p>
-            <w:pPr>
-              <w:spacing w:before="20" w:after="20"/>
-              <w:jc w:val="right"/>
-            </w:pPr>
-            <w:r>
-              <w:rPr>
-                <w:color w:val="1A1A1A"/>
-                <w:sz w:val="18"/>
-                <w:szCs w:val="18"/>
-              </w:rPr>
-              <w:t>20.7%</w:t>
-            </w:r>
-          </w:p>
-        </w:tc>
-        <w:tc>
-          <w:tcPr>
-            <w:tcW w:w="2200" w:type="dxa"/>
-            <w:shd w:val="clear" w:color="auto" w:fill="FFFFFF"/>
-            <w:tcMar>
-              <w:top w:w="40" w:type="dxa"/>
-              <w:left w:w="100" w:type="dxa"/>
-              <w:bottom w:w="40" w:type="dxa"/>
-              <w:right w:w="100" w:type="dxa"/>
-            </w:tcMar>
-            <w:vAlign w:val="center"/>
-          </w:tcPr>
-          <w:p>
-            <w:pPr>
-              <w:spacing w:before="20" w:after="20"/>
-              <w:jc w:val="right"/>
-            </w:pPr>
-            <w:r>
-              <w:rPr>
-                <w:color w:val="1A1A1A"/>
-                <w:sz w:val="18"/>
-                <w:szCs w:val="18"/>
-              </w:rPr>
-              <w:t>63.6%</w:t>
+              <w:t>15.7%</w:t>
+            </w:r>
+          </w:p>
+        </w:tc>
+        <w:tc>
+          <w:tcPr>
+            <w:tcW w:w="1440" w:type="dxa"/>
+            <w:shd w:val="clear" w:color="auto" w:fill="FFFFFF"/>
+            <w:tcMar>
+              <w:top w:w="40" w:type="dxa"/>
+              <w:left w:w="100" w:type="dxa"/>
+              <w:bottom w:w="40" w:type="dxa"/>
+              <w:right w:w="100" w:type="dxa"/>
+            </w:tcMar>
+            <w:vAlign w:val="center"/>
+          </w:tcPr>
+          <w:p>
+            <w:pPr>
+              <w:spacing w:before="20" w:after="20"/>
+              <w:jc w:val="right"/>
+            </w:pPr>
+            <w:r>
+              <w:rPr>
+                <w:color w:val="1A1A1A"/>
+                <w:sz w:val="18"/>
+                <w:szCs w:val="18"/>
+              </w:rPr>
+              <w:t>14.6%</w:t>
+            </w:r>
+          </w:p>
+        </w:tc>
+        <w:tc>
+          <w:tcPr>
+            <w:tcW w:w="1440" w:type="dxa"/>
+            <w:shd w:val="clear" w:color="auto" w:fill="FFFFFF"/>
+            <w:tcMar>
+              <w:top w:w="40" w:type="dxa"/>
+              <w:left w:w="100" w:type="dxa"/>
+              <w:bottom w:w="40" w:type="dxa"/>
+              <w:right w:w="100" w:type="dxa"/>
+            </w:tcMar>
+            <w:vAlign w:val="center"/>
+          </w:tcPr>
+          <w:p>
+            <w:pPr>
+              <w:spacing w:before="20" w:after="20"/>
+              <w:jc w:val="right"/>
+            </w:pPr>
+            <w:r>
+              <w:rPr>
+                <w:color w:val="1A1A1A"/>
+                <w:sz w:val="18"/>
+                <w:szCs w:val="18"/>
+              </w:rPr>
+              <w:t>0.9%</w:t>
+            </w:r>
+          </w:p>
+        </w:tc>
+        <w:tc>
+          <w:tcPr>
+            <w:tcW w:w="1440" w:type="dxa"/>
+            <w:shd w:val="clear" w:color="auto" w:fill="FFFFFF"/>
+            <w:tcMar>
+              <w:top w:w="40" w:type="dxa"/>
+              <w:left w:w="100" w:type="dxa"/>
+              <w:bottom w:w="40" w:type="dxa"/>
+              <w:right w:w="100" w:type="dxa"/>
+            </w:tcMar>
+            <w:vAlign w:val="center"/>
+          </w:tcPr>
+          <w:p>
+            <w:pPr>
+              <w:spacing w:before="20" w:after="20"/>
+              <w:jc w:val="right"/>
+            </w:pPr>
+            <w:r>
+              <w:rPr>
+                <w:color w:val="1A1A1A"/>
+                <w:sz w:val="18"/>
+                <w:szCs w:val="18"/>
+              </w:rPr>
+              <w:t>~32%</w:t>
+            </w:r>
+          </w:p>
+        </w:tc>
+        <w:tc>
+          <w:tcPr>
+            <w:tcW w:w="1440" w:type="dxa"/>
+            <w:shd w:val="clear" w:color="auto" w:fill="FFFFFF"/>
+            <w:tcMar>
+              <w:top w:w="40" w:type="dxa"/>
+              <w:left w:w="100" w:type="dxa"/>
+              <w:bottom w:w="40" w:type="dxa"/>
+              <w:right w:w="100" w:type="dxa"/>
+            </w:tcMar>
+            <w:vAlign w:val="center"/>
+          </w:tcPr>
+          <w:p>
+            <w:pPr>
+              <w:spacing w:before="20" w:after="20"/>
+              <w:jc w:val="right"/>
+            </w:pPr>
+            <w:r>
+              <w:rPr>
+                <w:color w:val="1A1A1A"/>
+                <w:sz w:val="18"/>
+                <w:szCs w:val="18"/>
+              </w:rPr>
+              <w:t>n.a.³</w:t>
             </w:r>
           </w:p>
         </w:tc>
@@ -11443,33 +11772,33 @@
       <w:tr>
         <w:tc>
           <w:tcPr>
-            <w:tcW w:w="3480" w:type="dxa"/>
-            <w:shd w:val="clear" w:color="auto" w:fill="FFFFFF"/>
-            <w:tcMar>
-              <w:top w:w="40" w:type="dxa"/>
-              <w:left w:w="100" w:type="dxa"/>
-              <w:bottom w:w="40" w:type="dxa"/>
-              <w:right w:w="100" w:type="dxa"/>
-            </w:tcMar>
-            <w:vAlign w:val="center"/>
-          </w:tcPr>
-          <w:p>
-            <w:pPr>
-              <w:spacing w:before="20" w:after="20"/>
-            </w:pPr>
-            <w:r>
-              <w:rPr>
-                <w:color w:val="1A1A1A"/>
-                <w:sz w:val="18"/>
-                <w:szCs w:val="18"/>
-              </w:rPr>
-              <w:t>Return on Equity (ROE, ann.)</w:t>
-            </w:r>
-          </w:p>
-        </w:tc>
-        <w:tc>
-          <w:tcPr>
-            <w:tcW w:w="2200" w:type="dxa"/>
+            <w:tcW w:w="2880" w:type="dxa"/>
+            <w:shd w:val="clear" w:color="auto" w:fill="FFFFFF"/>
+            <w:tcMar>
+              <w:top w:w="40" w:type="dxa"/>
+              <w:left w:w="100" w:type="dxa"/>
+              <w:bottom w:w="40" w:type="dxa"/>
+              <w:right w:w="100" w:type="dxa"/>
+            </w:tcMar>
+            <w:vAlign w:val="center"/>
+          </w:tcPr>
+          <w:p>
+            <w:pPr>
+              <w:spacing w:before="20" w:after="20"/>
+            </w:pPr>
+            <w:r>
+              <w:rPr>
+                <w:color w:val="1A1A1A"/>
+                <w:sz w:val="18"/>
+                <w:szCs w:val="18"/>
+              </w:rPr>
+              <w:t>Return on Assets (ROA, ann.)</w:t>
+            </w:r>
+          </w:p>
+        </w:tc>
+        <w:tc>
+          <w:tcPr>
+            <w:tcW w:w="1440" w:type="dxa"/>
             <w:shd w:val="clear" w:color="auto" w:fill="FFFFFF"/>
             <w:tcMar>
               <w:top w:w="40" w:type="dxa"/>
@@ -11492,61 +11821,115 @@
                 <w:sz w:val="18"/>
                 <w:szCs w:val="18"/>
               </w:rPr>
-              <w:t>15.7%</w:t>
-            </w:r>
-          </w:p>
-        </w:tc>
-        <w:tc>
-          <w:tcPr>
-            <w:tcW w:w="2200" w:type="dxa"/>
-            <w:shd w:val="clear" w:color="auto" w:fill="FFFFFF"/>
-            <w:tcMar>
-              <w:top w:w="40" w:type="dxa"/>
-              <w:left w:w="100" w:type="dxa"/>
-              <w:bottom w:w="40" w:type="dxa"/>
-              <w:right w:w="100" w:type="dxa"/>
-            </w:tcMar>
-            <w:vAlign w:val="center"/>
-          </w:tcPr>
-          <w:p>
-            <w:pPr>
-              <w:spacing w:before="20" w:after="20"/>
-              <w:jc w:val="right"/>
-            </w:pPr>
-            <w:r>
-              <w:rPr>
-                <w:color w:val="1A1A1A"/>
-                <w:sz w:val="18"/>
-                <w:szCs w:val="18"/>
-              </w:rPr>
-              <w:t>14.6%</w:t>
-            </w:r>
-          </w:p>
-        </w:tc>
-        <w:tc>
-          <w:tcPr>
-            <w:tcW w:w="2200" w:type="dxa"/>
-            <w:shd w:val="clear" w:color="auto" w:fill="FFFFFF"/>
-            <w:tcMar>
-              <w:top w:w="40" w:type="dxa"/>
-              <w:left w:w="100" w:type="dxa"/>
-              <w:bottom w:w="40" w:type="dxa"/>
-              <w:right w:w="100" w:type="dxa"/>
-            </w:tcMar>
-            <w:vAlign w:val="center"/>
-          </w:tcPr>
-          <w:p>
-            <w:pPr>
-              <w:spacing w:before="20" w:after="20"/>
-              <w:jc w:val="right"/>
-            </w:pPr>
-            <w:r>
-              <w:rPr>
-                <w:color w:val="1A1A1A"/>
-                <w:sz w:val="18"/>
-                <w:szCs w:val="18"/>
-              </w:rPr>
-              <w:t>0.9%</w:t>
+              <w:t>2.3%</w:t>
+            </w:r>
+          </w:p>
+        </w:tc>
+        <w:tc>
+          <w:tcPr>
+            <w:tcW w:w="1440" w:type="dxa"/>
+            <w:shd w:val="clear" w:color="auto" w:fill="FFFFFF"/>
+            <w:tcMar>
+              <w:top w:w="40" w:type="dxa"/>
+              <w:left w:w="100" w:type="dxa"/>
+              <w:bottom w:w="40" w:type="dxa"/>
+              <w:right w:w="100" w:type="dxa"/>
+            </w:tcMar>
+            <w:vAlign w:val="center"/>
+          </w:tcPr>
+          <w:p>
+            <w:pPr>
+              <w:spacing w:before="20" w:after="20"/>
+              <w:jc w:val="right"/>
+            </w:pPr>
+            <w:r>
+              <w:rPr>
+                <w:color w:val="1A1A1A"/>
+                <w:sz w:val="18"/>
+                <w:szCs w:val="18"/>
+              </w:rPr>
+              <w:t>1.5%</w:t>
+            </w:r>
+          </w:p>
+        </w:tc>
+        <w:tc>
+          <w:tcPr>
+            <w:tcW w:w="1440" w:type="dxa"/>
+            <w:shd w:val="clear" w:color="auto" w:fill="FFFFFF"/>
+            <w:tcMar>
+              <w:top w:w="40" w:type="dxa"/>
+              <w:left w:w="100" w:type="dxa"/>
+              <w:bottom w:w="40" w:type="dxa"/>
+              <w:right w:w="100" w:type="dxa"/>
+            </w:tcMar>
+            <w:vAlign w:val="center"/>
+          </w:tcPr>
+          <w:p>
+            <w:pPr>
+              <w:spacing w:before="20" w:after="20"/>
+              <w:jc w:val="right"/>
+            </w:pPr>
+            <w:r>
+              <w:rPr>
+                <w:color w:val="1A1A1A"/>
+                <w:sz w:val="18"/>
+                <w:szCs w:val="18"/>
+              </w:rPr>
+              <w:t>0.12%</w:t>
+            </w:r>
+          </w:p>
+        </w:tc>
+        <w:tc>
+          <w:tcPr>
+            <w:tcW w:w="1440" w:type="dxa"/>
+            <w:shd w:val="clear" w:color="auto" w:fill="FFFFFF"/>
+            <w:tcMar>
+              <w:top w:w="40" w:type="dxa"/>
+              <w:left w:w="100" w:type="dxa"/>
+              <w:bottom w:w="40" w:type="dxa"/>
+              <w:right w:w="100" w:type="dxa"/>
+            </w:tcMar>
+            <w:vAlign w:val="center"/>
+          </w:tcPr>
+          <w:p>
+            <w:pPr>
+              <w:spacing w:before="20" w:after="20"/>
+              <w:jc w:val="right"/>
+            </w:pPr>
+            <w:r>
+              <w:rPr>
+                <w:color w:val="1A1A1A"/>
+                <w:sz w:val="18"/>
+                <w:szCs w:val="18"/>
+              </w:rPr>
+              <w:t>~5.3%</w:t>
+            </w:r>
+          </w:p>
+        </w:tc>
+        <w:tc>
+          <w:tcPr>
+            <w:tcW w:w="1440" w:type="dxa"/>
+            <w:shd w:val="clear" w:color="auto" w:fill="FFFFFF"/>
+            <w:tcMar>
+              <w:top w:w="40" w:type="dxa"/>
+              <w:left w:w="100" w:type="dxa"/>
+              <w:bottom w:w="40" w:type="dxa"/>
+              <w:right w:w="100" w:type="dxa"/>
+            </w:tcMar>
+            <w:vAlign w:val="center"/>
+          </w:tcPr>
+          <w:p>
+            <w:pPr>
+              <w:spacing w:before="20" w:after="20"/>
+              <w:jc w:val="right"/>
+            </w:pPr>
+            <w:r>
+              <w:rPr>
+                <w:color w:val="1A1A1A"/>
+                <w:sz w:val="18"/>
+                <w:szCs w:val="18"/>
+              </w:rPr>
+              <w:t>n.a.³</w:t>
             </w:r>
           </w:p>
         </w:tc>
@@ -11554,119 +11937,8 @@
       <w:tr>
         <w:tc>
           <w:tcPr>
-            <w:tcW w:w="3480" w:type="dxa"/>
-            <w:shd w:val="clear" w:color="auto" w:fill="FFFFFF"/>
-            <w:tcMar>
-              <w:top w:w="40" w:type="dxa"/>
-              <w:left w:w="100" w:type="dxa"/>
-              <w:bottom w:w="40" w:type="dxa"/>
-              <w:right w:w="100" w:type="dxa"/>
-            </w:tcMar>
-            <w:vAlign w:val="center"/>
-          </w:tcPr>
-          <w:p>
-            <w:pPr>
-              <w:spacing w:before="20" w:after="20"/>
-            </w:pPr>
-            <w:r>
-              <w:rPr>
-                <w:color w:val="1A1A1A"/>
-                <w:sz w:val="18"/>
-                <w:szCs w:val="18"/>
-              </w:rPr>
-              <w:t>Return on Assets (ROA, ann.)</w:t>
-            </w:r>
-          </w:p>
-        </w:tc>
-        <w:tc>
-          <w:tcPr>
-            <w:tcW w:w="2200" w:type="dxa"/>
-            <w:shd w:val="clear" w:color="auto" w:fill="FFFFFF"/>
-            <w:tcMar>
-              <w:top w:w="40" w:type="dxa"/>
-              <w:left w:w="100" w:type="dxa"/>
-              <w:bottom w:w="40" w:type="dxa"/>
-              <w:right w:w="100" w:type="dxa"/>
-            </w:tcMar>
-            <w:vAlign w:val="center"/>
-          </w:tcPr>
-          <w:p>
-            <w:pPr>
-              <w:spacing w:before="20" w:after="20"/>
-              <w:jc w:val="right"/>
-            </w:pPr>
-            <w:r>
-              <w:rPr>
-                <w:b/>
-                <w:bCs/>
-                <w:color w:val="1A1A1A"/>
-                <w:sz w:val="18"/>
-                <w:szCs w:val="18"/>
-              </w:rPr>
-              <w:t>2.3%</w:t>
-            </w:r>
-          </w:p>
-        </w:tc>
-        <w:tc>
-          <w:tcPr>
-            <w:tcW w:w="2200" w:type="dxa"/>
-            <w:shd w:val="clear" w:color="auto" w:fill="FFFFFF"/>
-            <w:tcMar>
-              <w:top w:w="40" w:type="dxa"/>
-              <w:left w:w="100" w:type="dxa"/>
-              <w:bottom w:w="40" w:type="dxa"/>
-              <w:right w:w="100" w:type="dxa"/>
-            </w:tcMar>
-            <w:vAlign w:val="center"/>
-          </w:tcPr>
-          <w:p>
-            <w:pPr>
-              <w:spacing w:before="20" w:after="20"/>
-              <w:jc w:val="right"/>
-            </w:pPr>
-            <w:r>
-              <w:rPr>
-                <w:color w:val="1A1A1A"/>
-                <w:sz w:val="18"/>
-                <w:szCs w:val="18"/>
-              </w:rPr>
-              <w:t>1.5%</w:t>
-            </w:r>
-          </w:p>
-        </w:tc>
-        <w:tc>
-          <w:tcPr>
-            <w:tcW w:w="2200" w:type="dxa"/>
-            <w:shd w:val="clear" w:color="auto" w:fill="FFFFFF"/>
-            <w:tcMar>
-              <w:top w:w="40" w:type="dxa"/>
-              <w:left w:w="100" w:type="dxa"/>
-              <w:bottom w:w="40" w:type="dxa"/>
-              <w:right w:w="100" w:type="dxa"/>
-            </w:tcMar>
-            <w:vAlign w:val="center"/>
-          </w:tcPr>
-          <w:p>
-            <w:pPr>
-              <w:spacing w:before="20" w:after="20"/>
-              <w:jc w:val="right"/>
-            </w:pPr>
-            <w:r>
-              <w:rPr>
-                <w:color w:val="1A1A1A"/>
-                <w:sz w:val="18"/>
-                <w:szCs w:val="18"/>
-              </w:rPr>
-              <w:t>0.12%</w:t>
-            </w:r>
-          </w:p>
-        </w:tc>
-      </w:tr>
-      <w:tr>
-        <w:tc>
-          <w:tcPr>
             <w:tcW w:w="10080" w:type="dxa"/>
-            <w:gridSpan w:val="4"/>
+            <w:gridSpan w:val="6"/>
             <w:shd w:val="clear" w:color="auto" w:fill="EDF2F7"/>
             <w:tcMar>
               <w:top w:w="40" w:type="dxa"/>
@@ -11696,7 +11968,7 @@
       <w:tr>
         <w:tc>
           <w:tcPr>
-            <w:tcW w:w="3480" w:type="dxa"/>
+            <w:tcW w:w="2880" w:type="dxa"/>
             <w:shd w:val="clear" w:color="auto" w:fill="FFFFFF"/>
             <w:tcMar>
               <w:top w:w="40" w:type="dxa"/>
@@ -11722,7 +11994,7 @@
         </w:tc>
         <w:tc>
           <w:tcPr>
-            <w:tcW w:w="2200" w:type="dxa"/>
+            <w:tcW w:w="1440" w:type="dxa"/>
             <w:shd w:val="clear" w:color="auto" w:fill="FFFFFF"/>
             <w:tcMar>
               <w:top w:w="40" w:type="dxa"/>
@@ -11751,7 +12023,7 @@
         </w:tc>
         <w:tc>
           <w:tcPr>
-            <w:tcW w:w="2200" w:type="dxa"/>
+            <w:tcW w:w="1440" w:type="dxa"/>
             <w:shd w:val="clear" w:color="auto" w:fill="FFFFFF"/>
             <w:tcMar>
               <w:top w:w="40" w:type="dxa"/>
@@ -11778,7 +12050,7 @@
         </w:tc>
         <w:tc>
           <w:tcPr>
-            <w:tcW w:w="2200" w:type="dxa"/>
+            <w:tcW w:w="1440" w:type="dxa"/>
             <w:shd w:val="clear" w:color="auto" w:fill="FFFFFF"/>
             <w:tcMar>
               <w:top w:w="40" w:type="dxa"/>
@@ -11800,6 +12072,60 @@
                 <w:szCs w:val="18"/>
               </w:rPr>
               <w:t>5.8%</w:t>
+            </w:r>
+          </w:p>
+        </w:tc>
+        <w:tc>
+          <w:tcPr>
+            <w:tcW w:w="1440" w:type="dxa"/>
+            <w:shd w:val="clear" w:color="auto" w:fill="FFFFFF"/>
+            <w:tcMar>
+              <w:top w:w="40" w:type="dxa"/>
+              <w:left w:w="100" w:type="dxa"/>
+              <w:bottom w:w="40" w:type="dxa"/>
+              <w:right w:w="100" w:type="dxa"/>
+            </w:tcMar>
+            <w:vAlign w:val="center"/>
+          </w:tcPr>
+          <w:p>
+            <w:pPr>
+              <w:spacing w:before="20" w:after="20"/>
+              <w:jc w:val="right"/>
+            </w:pPr>
+            <w:r>
+              <w:rPr>
+                <w:color w:val="1A1A1A"/>
+                <w:sz w:val="18"/>
+                <w:szCs w:val="18"/>
+              </w:rPr>
+              <w:t>6.6%</w:t>
+            </w:r>
+          </w:p>
+        </w:tc>
+        <w:tc>
+          <w:tcPr>
+            <w:tcW w:w="1440" w:type="dxa"/>
+            <w:shd w:val="clear" w:color="auto" w:fill="FFFFFF"/>
+            <w:tcMar>
+              <w:top w:w="40" w:type="dxa"/>
+              <w:left w:w="100" w:type="dxa"/>
+              <w:bottom w:w="40" w:type="dxa"/>
+              <w:right w:w="100" w:type="dxa"/>
+            </w:tcMar>
+            <w:vAlign w:val="center"/>
+          </w:tcPr>
+          <w:p>
+            <w:pPr>
+              <w:spacing w:before="20" w:after="20"/>
+              <w:jc w:val="right"/>
+            </w:pPr>
+            <w:r>
+              <w:rPr>
+                <w:color w:val="1A1A1A"/>
+                <w:sz w:val="18"/>
+                <w:szCs w:val="18"/>
+              </w:rPr>
+              <w:t>5.7%</w:t>
             </w:r>
           </w:p>
         </w:tc>
@@ -11807,7 +12133,7 @@
       <w:tr>
         <w:tc>
           <w:tcPr>
-            <w:tcW w:w="3480" w:type="dxa"/>
+            <w:tcW w:w="2880" w:type="dxa"/>
             <w:shd w:val="clear" w:color="auto" w:fill="FFFFFF"/>
             <w:tcMar>
               <w:top w:w="40" w:type="dxa"/>
@@ -11833,7 +12159,7 @@
         </w:tc>
         <w:tc>
           <w:tcPr>
-            <w:tcW w:w="2200" w:type="dxa"/>
+            <w:tcW w:w="1440" w:type="dxa"/>
             <w:shd w:val="clear" w:color="auto" w:fill="FFFFFF"/>
             <w:tcMar>
               <w:top w:w="40" w:type="dxa"/>
@@ -11862,7 +12188,7 @@
         </w:tc>
         <w:tc>
           <w:tcPr>
-            <w:tcW w:w="2200" w:type="dxa"/>
+            <w:tcW w:w="1440" w:type="dxa"/>
             <w:shd w:val="clear" w:color="auto" w:fill="FFFFFF"/>
             <w:tcMar>
               <w:top w:w="40" w:type="dxa"/>
@@ -11889,7 +12215,7 @@
         </w:tc>
         <w:tc>
           <w:tcPr>
-            <w:tcW w:w="2200" w:type="dxa"/>
+            <w:tcW w:w="1440" w:type="dxa"/>
             <w:shd w:val="clear" w:color="auto" w:fill="FFFFFF"/>
             <w:tcMar>
               <w:top w:w="40" w:type="dxa"/>
@@ -11911,6 +12237,60 @@
                 <w:szCs w:val="18"/>
               </w:rPr>
               <w:t>53.8%</w:t>
+            </w:r>
+          </w:p>
+        </w:tc>
+        <w:tc>
+          <w:tcPr>
+            <w:tcW w:w="1440" w:type="dxa"/>
+            <w:shd w:val="clear" w:color="auto" w:fill="FFFFFF"/>
+            <w:tcMar>
+              <w:top w:w="40" w:type="dxa"/>
+              <w:left w:w="100" w:type="dxa"/>
+              <w:bottom w:w="40" w:type="dxa"/>
+              <w:right w:w="100" w:type="dxa"/>
+            </w:tcMar>
+            <w:vAlign w:val="center"/>
+          </w:tcPr>
+          <w:p>
+            <w:pPr>
+              <w:spacing w:before="20" w:after="20"/>
+              <w:jc w:val="right"/>
+            </w:pPr>
+            <w:r>
+              <w:rPr>
+                <w:color w:val="1A1A1A"/>
+                <w:sz w:val="18"/>
+                <w:szCs w:val="18"/>
+              </w:rPr>
+              <w:t>n.a.</w:t>
+            </w:r>
+          </w:p>
+        </w:tc>
+        <w:tc>
+          <w:tcPr>
+            <w:tcW w:w="1440" w:type="dxa"/>
+            <w:shd w:val="clear" w:color="auto" w:fill="FFFFFF"/>
+            <w:tcMar>
+              <w:top w:w="40" w:type="dxa"/>
+              <w:left w:w="100" w:type="dxa"/>
+              <w:bottom w:w="40" w:type="dxa"/>
+              <w:right w:w="100" w:type="dxa"/>
+            </w:tcMar>
+            <w:vAlign w:val="center"/>
+          </w:tcPr>
+          <w:p>
+            <w:pPr>
+              <w:spacing w:before="20" w:after="20"/>
+              <w:jc w:val="right"/>
+            </w:pPr>
+            <w:r>
+              <w:rPr>
+                <w:color w:val="1A1A1A"/>
+                <w:sz w:val="18"/>
+                <w:szCs w:val="18"/>
+              </w:rPr>
+              <w:t>n.a.³</w:t>
             </w:r>
           </w:p>
         </w:tc>
@@ -11919,7 +12299,7 @@
         <w:tc>
           <w:tcPr>
             <w:tcW w:w="10080" w:type="dxa"/>
-            <w:gridSpan w:val="4"/>
+            <w:gridSpan w:val="6"/>
             <w:shd w:val="clear" w:color="auto" w:fill="EDF2F7"/>
             <w:tcMar>
               <w:top w:w="40" w:type="dxa"/>
@@ -11949,7 +12329,7 @@
       <w:tr>
         <w:tc>
           <w:tcPr>
-            <w:tcW w:w="3480" w:type="dxa"/>
+            <w:tcW w:w="2880" w:type="dxa"/>
             <w:shd w:val="clear" w:color="auto" w:fill="FFFFFF"/>
             <w:tcMar>
               <w:top w:w="40" w:type="dxa"/>
@@ -11975,7 +12355,7 @@
         </w:tc>
         <w:tc>
           <w:tcPr>
-            <w:tcW w:w="2200" w:type="dxa"/>
+            <w:tcW w:w="1440" w:type="dxa"/>
             <w:shd w:val="clear" w:color="auto" w:fill="FFFFFF"/>
             <w:tcMar>
               <w:top w:w="40" w:type="dxa"/>
@@ -12004,7 +12384,7 @@
         </w:tc>
         <w:tc>
           <w:tcPr>
-            <w:tcW w:w="2200" w:type="dxa"/>
+            <w:tcW w:w="1440" w:type="dxa"/>
             <w:shd w:val="clear" w:color="auto" w:fill="FFFFFF"/>
             <w:tcMar>
               <w:top w:w="40" w:type="dxa"/>
@@ -12031,7 +12411,7 @@
         </w:tc>
         <w:tc>
           <w:tcPr>
-            <w:tcW w:w="2200" w:type="dxa"/>
+            <w:tcW w:w="1440" w:type="dxa"/>
             <w:shd w:val="clear" w:color="auto" w:fill="FFFFFF"/>
             <w:tcMar>
               <w:top w:w="40" w:type="dxa"/>
@@ -12053,6 +12433,60 @@
                 <w:szCs w:val="18"/>
               </w:rPr>
               <w:t>13.2%</w:t>
+            </w:r>
+          </w:p>
+        </w:tc>
+        <w:tc>
+          <w:tcPr>
+            <w:tcW w:w="1440" w:type="dxa"/>
+            <w:shd w:val="clear" w:color="auto" w:fill="FFFFFF"/>
+            <w:tcMar>
+              <w:top w:w="40" w:type="dxa"/>
+              <w:left w:w="100" w:type="dxa"/>
+              <w:bottom w:w="40" w:type="dxa"/>
+              <w:right w:w="100" w:type="dxa"/>
+            </w:tcMar>
+            <w:vAlign w:val="center"/>
+          </w:tcPr>
+          <w:p>
+            <w:pPr>
+              <w:spacing w:before="20" w:after="20"/>
+              <w:jc w:val="right"/>
+            </w:pPr>
+            <w:r>
+              <w:rPr>
+                <w:color w:val="1A1A1A"/>
+                <w:sz w:val="18"/>
+                <w:szCs w:val="18"/>
+              </w:rPr>
+              <w:t>~19%</w:t>
+            </w:r>
+          </w:p>
+        </w:tc>
+        <w:tc>
+          <w:tcPr>
+            <w:tcW w:w="1440" w:type="dxa"/>
+            <w:shd w:val="clear" w:color="auto" w:fill="FFFFFF"/>
+            <w:tcMar>
+              <w:top w:w="40" w:type="dxa"/>
+              <w:left w:w="100" w:type="dxa"/>
+              <w:bottom w:w="40" w:type="dxa"/>
+              <w:right w:w="100" w:type="dxa"/>
+            </w:tcMar>
+            <w:vAlign w:val="center"/>
+          </w:tcPr>
+          <w:p>
+            <w:pPr>
+              <w:spacing w:before="20" w:after="20"/>
+              <w:jc w:val="right"/>
+            </w:pPr>
+            <w:r>
+              <w:rPr>
+                <w:color w:val="1A1A1A"/>
+                <w:sz w:val="18"/>
+                <w:szCs w:val="18"/>
+              </w:rPr>
+              <w:t>n.a.³</w:t>
             </w:r>
           </w:p>
         </w:tc>
@@ -12060,7 +12494,7 @@
       <w:tr>
         <w:tc>
           <w:tcPr>
-            <w:tcW w:w="3480" w:type="dxa"/>
+            <w:tcW w:w="2880" w:type="dxa"/>
             <w:shd w:val="clear" w:color="auto" w:fill="FFFFFF"/>
             <w:tcMar>
               <w:top w:w="40" w:type="dxa"/>
@@ -12086,7 +12520,7 @@
         </w:tc>
         <w:tc>
           <w:tcPr>
-            <w:tcW w:w="2200" w:type="dxa"/>
+            <w:tcW w:w="1440" w:type="dxa"/>
             <w:shd w:val="clear" w:color="auto" w:fill="FFFFFF"/>
             <w:tcMar>
               <w:top w:w="40" w:type="dxa"/>
@@ -12115,7 +12549,7 @@
         </w:tc>
         <w:tc>
           <w:tcPr>
-            <w:tcW w:w="2200" w:type="dxa"/>
+            <w:tcW w:w="1440" w:type="dxa"/>
             <w:shd w:val="clear" w:color="auto" w:fill="FFFFFF"/>
             <w:tcMar>
               <w:top w:w="40" w:type="dxa"/>
@@ -12142,7 +12576,7 @@
         </w:tc>
         <w:tc>
           <w:tcPr>
-            <w:tcW w:w="2200" w:type="dxa"/>
+            <w:tcW w:w="1440" w:type="dxa"/>
             <w:shd w:val="clear" w:color="auto" w:fill="FFFFFF"/>
             <w:tcMar>
               <w:top w:w="40" w:type="dxa"/>
@@ -12164,6 +12598,60 @@
                 <w:szCs w:val="18"/>
               </w:rPr>
               <w:t>14.2%</w:t>
+            </w:r>
+          </w:p>
+        </w:tc>
+        <w:tc>
+          <w:tcPr>
+            <w:tcW w:w="1440" w:type="dxa"/>
+            <w:shd w:val="clear" w:color="auto" w:fill="FFFFFF"/>
+            <w:tcMar>
+              <w:top w:w="40" w:type="dxa"/>
+              <w:left w:w="100" w:type="dxa"/>
+              <w:bottom w:w="40" w:type="dxa"/>
+              <w:right w:w="100" w:type="dxa"/>
+            </w:tcMar>
+            <w:vAlign w:val="center"/>
+          </w:tcPr>
+          <w:p>
+            <w:pPr>
+              <w:spacing w:before="20" w:after="20"/>
+              <w:jc w:val="right"/>
+            </w:pPr>
+            <w:r>
+              <w:rPr>
+                <w:color w:val="1A1A1A"/>
+                <w:sz w:val="18"/>
+                <w:szCs w:val="18"/>
+              </w:rPr>
+              <w:t>~18.5%</w:t>
+            </w:r>
+          </w:p>
+        </w:tc>
+        <w:tc>
+          <w:tcPr>
+            <w:tcW w:w="1440" w:type="dxa"/>
+            <w:shd w:val="clear" w:color="auto" w:fill="FFFFFF"/>
+            <w:tcMar>
+              <w:top w:w="40" w:type="dxa"/>
+              <w:left w:w="100" w:type="dxa"/>
+              <w:bottom w:w="40" w:type="dxa"/>
+              <w:right w:w="100" w:type="dxa"/>
+            </w:tcMar>
+            <w:vAlign w:val="center"/>
+          </w:tcPr>
+          <w:p>
+            <w:pPr>
+              <w:spacing w:before="20" w:after="20"/>
+              <w:jc w:val="right"/>
+            </w:pPr>
+            <w:r>
+              <w:rPr>
+                <w:color w:val="1A1A1A"/>
+                <w:sz w:val="18"/>
+                <w:szCs w:val="18"/>
+              </w:rPr>
+              <w:t>n.a.³</w:t>
             </w:r>
           </w:p>
         </w:tc>
@@ -12171,7 +12659,7 @@
       <w:tr>
         <w:tc>
           <w:tcPr>
-            <w:tcW w:w="3480" w:type="dxa"/>
+            <w:tcW w:w="2880" w:type="dxa"/>
             <w:shd w:val="clear" w:color="auto" w:fill="FFFFFF"/>
             <w:tcMar>
               <w:top w:w="40" w:type="dxa"/>
@@ -12197,7 +12685,7 @@
         </w:tc>
         <w:tc>
           <w:tcPr>
-            <w:tcW w:w="2200" w:type="dxa"/>
+            <w:tcW w:w="1440" w:type="dxa"/>
             <w:shd w:val="clear" w:color="auto" w:fill="FFFFFF"/>
             <w:tcMar>
               <w:top w:w="40" w:type="dxa"/>
@@ -12226,7 +12714,7 @@
         </w:tc>
         <w:tc>
           <w:tcPr>
-            <w:tcW w:w="2200" w:type="dxa"/>
+            <w:tcW w:w="1440" w:type="dxa"/>
             <w:shd w:val="clear" w:color="auto" w:fill="FFFFFF"/>
             <w:tcMar>
               <w:top w:w="40" w:type="dxa"/>
@@ -12253,7 +12741,7 @@
         </w:tc>
         <w:tc>
           <w:tcPr>
-            <w:tcW w:w="2200" w:type="dxa"/>
+            <w:tcW w:w="1440" w:type="dxa"/>
             <w:shd w:val="clear" w:color="auto" w:fill="FFFFFF"/>
             <w:tcMar>
               <w:top w:w="40" w:type="dxa"/>
@@ -12275,6 +12763,60 @@
                 <w:szCs w:val="18"/>
               </w:rPr>
               <w:t>14.0%</w:t>
+            </w:r>
+          </w:p>
+        </w:tc>
+        <w:tc>
+          <w:tcPr>
+            <w:tcW w:w="1440" w:type="dxa"/>
+            <w:shd w:val="clear" w:color="auto" w:fill="FFFFFF"/>
+            <w:tcMar>
+              <w:top w:w="40" w:type="dxa"/>
+              <w:left w:w="100" w:type="dxa"/>
+              <w:bottom w:w="40" w:type="dxa"/>
+              <w:right w:w="100" w:type="dxa"/>
+            </w:tcMar>
+            <w:vAlign w:val="center"/>
+          </w:tcPr>
+          <w:p>
+            <w:pPr>
+              <w:spacing w:before="20" w:after="20"/>
+              <w:jc w:val="right"/>
+            </w:pPr>
+            <w:r>
+              <w:rPr>
+                <w:color w:val="1A1A1A"/>
+                <w:sz w:val="18"/>
+                <w:szCs w:val="18"/>
+              </w:rPr>
+              <w:t>n.a.</w:t>
+            </w:r>
+          </w:p>
+        </w:tc>
+        <w:tc>
+          <w:tcPr>
+            <w:tcW w:w="1440" w:type="dxa"/>
+            <w:shd w:val="clear" w:color="auto" w:fill="FFFFFF"/>
+            <w:tcMar>
+              <w:top w:w="40" w:type="dxa"/>
+              <w:left w:w="100" w:type="dxa"/>
+              <w:bottom w:w="40" w:type="dxa"/>
+              <w:right w:w="100" w:type="dxa"/>
+            </w:tcMar>
+            <w:vAlign w:val="center"/>
+          </w:tcPr>
+          <w:p>
+            <w:pPr>
+              <w:spacing w:before="20" w:after="20"/>
+              <w:jc w:val="right"/>
+            </w:pPr>
+            <w:r>
+              <w:rPr>
+                <w:color w:val="1A1A1A"/>
+                <w:sz w:val="18"/>
+                <w:szCs w:val="18"/>
+              </w:rPr>
+              <w:t>n.a.</w:t>
             </w:r>
           </w:p>
         </w:tc>
@@ -12282,33 +12824,33 @@
       <w:tr>
         <w:tc>
           <w:tcPr>
-            <w:tcW w:w="3480" w:type="dxa"/>
-            <w:shd w:val="clear" w:color="auto" w:fill="FFFFFF"/>
-            <w:tcMar>
-              <w:top w:w="40" w:type="dxa"/>
-              <w:left w:w="100" w:type="dxa"/>
-              <w:bottom w:w="40" w:type="dxa"/>
-              <w:right w:w="100" w:type="dxa"/>
-            </w:tcMar>
-            <w:vAlign w:val="center"/>
-          </w:tcPr>
-          <w:p>
-            <w:pPr>
-              <w:spacing w:before="20" w:after="20"/>
-            </w:pPr>
-            <w:r>
-              <w:rPr>
-                <w:color w:val="1A1A1A"/>
-                <w:sz w:val="18"/>
-                <w:szCs w:val="18"/>
-              </w:rPr>
-              <w:t>CBU minimum CAR (memo)</w:t>
-            </w:r>
-          </w:p>
-        </w:tc>
-        <w:tc>
-          <w:tcPr>
-            <w:tcW w:w="2200" w:type="dxa"/>
+            <w:tcW w:w="2880" w:type="dxa"/>
+            <w:shd w:val="clear" w:color="auto" w:fill="FFFFFF"/>
+            <w:tcMar>
+              <w:top w:w="40" w:type="dxa"/>
+              <w:left w:w="100" w:type="dxa"/>
+              <w:bottom w:w="40" w:type="dxa"/>
+              <w:right w:w="100" w:type="dxa"/>
+            </w:tcMar>
+            <w:vAlign w:val="center"/>
+          </w:tcPr>
+          <w:p>
+            <w:pPr>
+              <w:spacing w:before="20" w:after="20"/>
+            </w:pPr>
+            <w:r>
+              <w:rPr>
+                <w:color w:val="1A1A1A"/>
+                <w:sz w:val="18"/>
+                <w:szCs w:val="18"/>
+              </w:rPr>
+              <w:t>Regulatory minimum CAR (memo)</w:t>
+            </w:r>
+          </w:p>
+        </w:tc>
+        <w:tc>
+          <w:tcPr>
+            <w:tcW w:w="1440" w:type="dxa"/>
             <w:shd w:val="clear" w:color="auto" w:fill="FFFFFF"/>
             <w:tcMar>
               <w:top w:w="40" w:type="dxa"/>
@@ -12337,7 +12879,7 @@
         </w:tc>
         <w:tc>
           <w:tcPr>
-            <w:tcW w:w="2200" w:type="dxa"/>
+            <w:tcW w:w="1440" w:type="dxa"/>
             <w:shd w:val="clear" w:color="auto" w:fill="FFFFFF"/>
             <w:tcMar>
               <w:top w:w="40" w:type="dxa"/>
@@ -12364,7 +12906,7 @@
         </w:tc>
         <w:tc>
           <w:tcPr>
-            <w:tcW w:w="2200" w:type="dxa"/>
+            <w:tcW w:w="1440" w:type="dxa"/>
             <w:shd w:val="clear" w:color="auto" w:fill="FFFFFF"/>
             <w:tcMar>
               <w:top w:w="40" w:type="dxa"/>
@@ -12386,6 +12928,60 @@
                 <w:szCs w:val="18"/>
               </w:rPr>
               <w:t>13%</w:t>
+            </w:r>
+          </w:p>
+        </w:tc>
+        <w:tc>
+          <w:tcPr>
+            <w:tcW w:w="1440" w:type="dxa"/>
+            <w:shd w:val="clear" w:color="auto" w:fill="FFFFFF"/>
+            <w:tcMar>
+              <w:top w:w="40" w:type="dxa"/>
+              <w:left w:w="100" w:type="dxa"/>
+              <w:bottom w:w="40" w:type="dxa"/>
+              <w:right w:w="100" w:type="dxa"/>
+            </w:tcMar>
+            <w:vAlign w:val="center"/>
+          </w:tcPr>
+          <w:p>
+            <w:pPr>
+              <w:spacing w:before="20" w:after="20"/>
+              <w:jc w:val="right"/>
+            </w:pPr>
+            <w:r>
+              <w:rPr>
+                <w:color w:val="1A1A1A"/>
+                <w:sz w:val="18"/>
+                <w:szCs w:val="18"/>
+              </w:rPr>
+              <w:t>12%</w:t>
+            </w:r>
+          </w:p>
+        </w:tc>
+        <w:tc>
+          <w:tcPr>
+            <w:tcW w:w="1440" w:type="dxa"/>
+            <w:shd w:val="clear" w:color="auto" w:fill="FFFFFF"/>
+            <w:tcMar>
+              <w:top w:w="40" w:type="dxa"/>
+              <w:left w:w="100" w:type="dxa"/>
+              <w:bottom w:w="40" w:type="dxa"/>
+              <w:right w:w="100" w:type="dxa"/>
+            </w:tcMar>
+            <w:vAlign w:val="center"/>
+          </w:tcPr>
+          <w:p>
+            <w:pPr>
+              <w:spacing w:before="20" w:after="20"/>
+              <w:jc w:val="right"/>
+            </w:pPr>
+            <w:r>
+              <w:rPr>
+                <w:color w:val="1A1A1A"/>
+                <w:sz w:val="18"/>
+                <w:szCs w:val="18"/>
+              </w:rPr>
+              <w:t>12%</w:t>
             </w:r>
           </w:p>
         </w:tc>
@@ -12394,7 +12990,7 @@
         <w:tc>
           <w:tcPr>
             <w:tcW w:w="10080" w:type="dxa"/>
-            <w:gridSpan w:val="4"/>
+            <w:gridSpan w:val="6"/>
             <w:shd w:val="clear" w:color="auto" w:fill="EDF2F7"/>
             <w:tcMar>
               <w:top w:w="40" w:type="dxa"/>
@@ -12424,7 +13020,7 @@
       <w:tr>
         <w:tc>
           <w:tcPr>
-            <w:tcW w:w="3480" w:type="dxa"/>
+            <w:tcW w:w="2880" w:type="dxa"/>
             <w:shd w:val="clear" w:color="auto" w:fill="FFFFFF"/>
             <w:tcMar>
               <w:top w:w="40" w:type="dxa"/>
@@ -12450,7 +13046,7 @@
         </w:tc>
         <w:tc>
           <w:tcPr>
-            <w:tcW w:w="2200" w:type="dxa"/>
+            <w:tcW w:w="1440" w:type="dxa"/>
             <w:shd w:val="clear" w:color="auto" w:fill="FFFFFF"/>
             <w:tcMar>
               <w:top w:w="40" w:type="dxa"/>
@@ -12479,7 +13075,7 @@
         </w:tc>
         <w:tc>
           <w:tcPr>
-            <w:tcW w:w="2200" w:type="dxa"/>
+            <w:tcW w:w="1440" w:type="dxa"/>
             <w:shd w:val="clear" w:color="auto" w:fill="FFFFFF"/>
             <w:tcMar>
               <w:top w:w="40" w:type="dxa"/>
@@ -12506,7 +13102,7 @@
         </w:tc>
         <w:tc>
           <w:tcPr>
-            <w:tcW w:w="2200" w:type="dxa"/>
+            <w:tcW w:w="1440" w:type="dxa"/>
             <w:shd w:val="clear" w:color="auto" w:fill="FFFFFF"/>
             <w:tcMar>
               <w:top w:w="40" w:type="dxa"/>
@@ -12528,6 +13124,60 @@
                 <w:szCs w:val="18"/>
               </w:rPr>
               <w:t>78%</w:t>
+            </w:r>
+          </w:p>
+        </w:tc>
+        <w:tc>
+          <w:tcPr>
+            <w:tcW w:w="1440" w:type="dxa"/>
+            <w:shd w:val="clear" w:color="auto" w:fill="FFFFFF"/>
+            <w:tcMar>
+              <w:top w:w="40" w:type="dxa"/>
+              <w:left w:w="100" w:type="dxa"/>
+              <w:bottom w:w="40" w:type="dxa"/>
+              <w:right w:w="100" w:type="dxa"/>
+            </w:tcMar>
+            <w:vAlign w:val="center"/>
+          </w:tcPr>
+          <w:p>
+            <w:pPr>
+              <w:spacing w:before="20" w:after="20"/>
+              <w:jc w:val="right"/>
+            </w:pPr>
+            <w:r>
+              <w:rPr>
+                <w:color w:val="1A1A1A"/>
+                <w:sz w:val="18"/>
+                <w:szCs w:val="18"/>
+              </w:rPr>
+              <w:t>n.a.</w:t>
+            </w:r>
+          </w:p>
+        </w:tc>
+        <w:tc>
+          <w:tcPr>
+            <w:tcW w:w="1440" w:type="dxa"/>
+            <w:shd w:val="clear" w:color="auto" w:fill="FFFFFF"/>
+            <w:tcMar>
+              <w:top w:w="40" w:type="dxa"/>
+              <w:left w:w="100" w:type="dxa"/>
+              <w:bottom w:w="40" w:type="dxa"/>
+              <w:right w:w="100" w:type="dxa"/>
+            </w:tcMar>
+            <w:vAlign w:val="center"/>
+          </w:tcPr>
+          <w:p>
+            <w:pPr>
+              <w:spacing w:before="20" w:after="20"/>
+              <w:jc w:val="right"/>
+            </w:pPr>
+            <w:r>
+              <w:rPr>
+                <w:color w:val="1A1A1A"/>
+                <w:sz w:val="18"/>
+                <w:szCs w:val="18"/>
+              </w:rPr>
+              <w:t>n.a.</w:t>
             </w:r>
           </w:p>
         </w:tc>
@@ -12535,7 +13185,7 @@
       <w:tr>
         <w:tc>
           <w:tcPr>
-            <w:tcW w:w="3480" w:type="dxa"/>
+            <w:tcW w:w="2880" w:type="dxa"/>
             <w:shd w:val="clear" w:color="auto" w:fill="FFFFFF"/>
             <w:tcMar>
               <w:top w:w="40" w:type="dxa"/>
@@ -12561,7 +13211,7 @@
         </w:tc>
         <w:tc>
           <w:tcPr>
-            <w:tcW w:w="2200" w:type="dxa"/>
+            <w:tcW w:w="1440" w:type="dxa"/>
             <w:shd w:val="clear" w:color="auto" w:fill="FFFFFF"/>
             <w:tcMar>
               <w:top w:w="40" w:type="dxa"/>
@@ -12590,7 +13240,7 @@
         </w:tc>
         <w:tc>
           <w:tcPr>
-            <w:tcW w:w="2200" w:type="dxa"/>
+            <w:tcW w:w="1440" w:type="dxa"/>
             <w:shd w:val="clear" w:color="auto" w:fill="FFFFFF"/>
             <w:tcMar>
               <w:top w:w="40" w:type="dxa"/>
@@ -12617,7 +13267,7 @@
         </w:tc>
         <w:tc>
           <w:tcPr>
-            <w:tcW w:w="2200" w:type="dxa"/>
+            <w:tcW w:w="1440" w:type="dxa"/>
             <w:shd w:val="clear" w:color="auto" w:fill="FFFFFF"/>
             <w:tcMar>
               <w:top w:w="40" w:type="dxa"/>
@@ -12639,6 +13289,60 @@
                 <w:szCs w:val="18"/>
               </w:rPr>
               <w:t>96%</w:t>
+            </w:r>
+          </w:p>
+        </w:tc>
+        <w:tc>
+          <w:tcPr>
+            <w:tcW w:w="1440" w:type="dxa"/>
+            <w:shd w:val="clear" w:color="auto" w:fill="FFFFFF"/>
+            <w:tcMar>
+              <w:top w:w="40" w:type="dxa"/>
+              <w:left w:w="100" w:type="dxa"/>
+              <w:bottom w:w="40" w:type="dxa"/>
+              <w:right w:w="100" w:type="dxa"/>
+            </w:tcMar>
+            <w:vAlign w:val="center"/>
+          </w:tcPr>
+          <w:p>
+            <w:pPr>
+              <w:spacing w:before="20" w:after="20"/>
+              <w:jc w:val="right"/>
+            </w:pPr>
+            <w:r>
+              <w:rPr>
+                <w:color w:val="1A1A1A"/>
+                <w:sz w:val="18"/>
+                <w:szCs w:val="18"/>
+              </w:rPr>
+              <w:t>n.a.</w:t>
+            </w:r>
+          </w:p>
+        </w:tc>
+        <w:tc>
+          <w:tcPr>
+            <w:tcW w:w="1440" w:type="dxa"/>
+            <w:shd w:val="clear" w:color="auto" w:fill="FFFFFF"/>
+            <w:tcMar>
+              <w:top w:w="40" w:type="dxa"/>
+              <w:left w:w="100" w:type="dxa"/>
+              <w:bottom w:w="40" w:type="dxa"/>
+              <w:right w:w="100" w:type="dxa"/>
+            </w:tcMar>
+            <w:vAlign w:val="center"/>
+          </w:tcPr>
+          <w:p>
+            <w:pPr>
+              <w:spacing w:before="20" w:after="20"/>
+              <w:jc w:val="right"/>
+            </w:pPr>
+            <w:r>
+              <w:rPr>
+                <w:color w:val="1A1A1A"/>
+                <w:sz w:val="18"/>
+                <w:szCs w:val="18"/>
+              </w:rPr>
+              <w:t>n.a.</w:t>
             </w:r>
           </w:p>
         </w:tc>
@@ -12646,7 +13350,7 @@
       <w:tr>
         <w:tc>
           <w:tcPr>
-            <w:tcW w:w="3480" w:type="dxa"/>
+            <w:tcW w:w="2880" w:type="dxa"/>
             <w:shd w:val="clear" w:color="auto" w:fill="FFFFFF"/>
             <w:tcMar>
               <w:top w:w="40" w:type="dxa"/>
@@ -12672,7 +13376,7 @@
         </w:tc>
         <w:tc>
           <w:tcPr>
-            <w:tcW w:w="2200" w:type="dxa"/>
+            <w:tcW w:w="1440" w:type="dxa"/>
             <w:shd w:val="clear" w:color="auto" w:fill="FFFFFF"/>
             <w:tcMar>
               <w:top w:w="40" w:type="dxa"/>
@@ -12701,7 +13405,7 @@
         </w:tc>
         <w:tc>
           <w:tcPr>
-            <w:tcW w:w="2200" w:type="dxa"/>
+            <w:tcW w:w="1440" w:type="dxa"/>
             <w:shd w:val="clear" w:color="auto" w:fill="FFFFFF"/>
             <w:tcMar>
               <w:top w:w="40" w:type="dxa"/>
@@ -12728,7 +13432,7 @@
         </w:tc>
         <w:tc>
           <w:tcPr>
-            <w:tcW w:w="2200" w:type="dxa"/>
+            <w:tcW w:w="1440" w:type="dxa"/>
             <w:shd w:val="clear" w:color="auto" w:fill="FFFFFF"/>
             <w:tcMar>
               <w:top w:w="40" w:type="dxa"/>
@@ -12750,6 +13454,60 @@
                 <w:szCs w:val="18"/>
               </w:rPr>
               <w:t>323%</w:t>
+            </w:r>
+          </w:p>
+        </w:tc>
+        <w:tc>
+          <w:tcPr>
+            <w:tcW w:w="1440" w:type="dxa"/>
+            <w:shd w:val="clear" w:color="auto" w:fill="FFFFFF"/>
+            <w:tcMar>
+              <w:top w:w="40" w:type="dxa"/>
+              <w:left w:w="100" w:type="dxa"/>
+              <w:bottom w:w="40" w:type="dxa"/>
+              <w:right w:w="100" w:type="dxa"/>
+            </w:tcMar>
+            <w:vAlign w:val="center"/>
+          </w:tcPr>
+          <w:p>
+            <w:pPr>
+              <w:spacing w:before="20" w:after="20"/>
+              <w:jc w:val="right"/>
+            </w:pPr>
+            <w:r>
+              <w:rPr>
+                <w:color w:val="1A1A1A"/>
+                <w:sz w:val="18"/>
+                <w:szCs w:val="18"/>
+              </w:rPr>
+              <w:t>~86%</w:t>
+            </w:r>
+          </w:p>
+        </w:tc>
+        <w:tc>
+          <w:tcPr>
+            <w:tcW w:w="1440" w:type="dxa"/>
+            <w:shd w:val="clear" w:color="auto" w:fill="FFFFFF"/>
+            <w:tcMar>
+              <w:top w:w="40" w:type="dxa"/>
+              <w:left w:w="100" w:type="dxa"/>
+              <w:bottom w:w="40" w:type="dxa"/>
+              <w:right w:w="100" w:type="dxa"/>
+            </w:tcMar>
+            <w:vAlign w:val="center"/>
+          </w:tcPr>
+          <w:p>
+            <w:pPr>
+              <w:spacing w:before="20" w:after="20"/>
+              <w:jc w:val="right"/>
+            </w:pPr>
+            <w:r>
+              <w:rPr>
+                <w:color w:val="1A1A1A"/>
+                <w:sz w:val="18"/>
+                <w:szCs w:val="18"/>
+              </w:rPr>
+              <w:t>~95%</w:t>
             </w:r>
           </w:p>
         </w:tc>
@@ -12758,7 +13516,7 @@
         <w:tc>
           <w:tcPr>
             <w:tcW w:w="10080" w:type="dxa"/>
-            <w:gridSpan w:val="4"/>
+            <w:gridSpan w:val="6"/>
             <w:shd w:val="clear" w:color="auto" w:fill="EDF2F7"/>
             <w:tcMar>
               <w:top w:w="40" w:type="dxa"/>
@@ -12780,7 +13538,7 @@
                 <w:sz w:val="18"/>
                 <w:szCs w:val="18"/>
               </w:rPr>
-              <w:t>Scale (USD Million @ 12,150)</w:t>
+              <w:t>Scale (USD Million)</w:t>
             </w:r>
           </w:p>
         </w:tc>
@@ -12788,7 +13546,7 @@
       <w:tr>
         <w:tc>
           <w:tcPr>
-            <w:tcW w:w="3480" w:type="dxa"/>
+            <w:tcW w:w="2880" w:type="dxa"/>
             <w:shd w:val="clear" w:color="auto" w:fill="FFFFFF"/>
             <w:tcMar>
               <w:top w:w="40" w:type="dxa"/>
@@ -12814,7 +13572,7 @@
         </w:tc>
         <w:tc>
           <w:tcPr>
-            <w:tcW w:w="2200" w:type="dxa"/>
+            <w:tcW w:w="1440" w:type="dxa"/>
             <w:shd w:val="clear" w:color="auto" w:fill="FFFFFF"/>
             <w:tcMar>
               <w:top w:w="40" w:type="dxa"/>
@@ -12843,7 +13601,7 @@
         </w:tc>
         <w:tc>
           <w:tcPr>
-            <w:tcW w:w="2200" w:type="dxa"/>
+            <w:tcW w:w="1440" w:type="dxa"/>
             <w:shd w:val="clear" w:color="auto" w:fill="FFFFFF"/>
             <w:tcMar>
               <w:top w:w="40" w:type="dxa"/>
@@ -12870,7 +13628,7 @@
         </w:tc>
         <w:tc>
           <w:tcPr>
-            <w:tcW w:w="2200" w:type="dxa"/>
+            <w:tcW w:w="1440" w:type="dxa"/>
             <w:shd w:val="clear" w:color="auto" w:fill="FFFFFF"/>
             <w:tcMar>
               <w:top w:w="40" w:type="dxa"/>
@@ -12892,6 +13650,60 @@
                 <w:szCs w:val="18"/>
               </w:rPr>
               <w:t>7,937</w:t>
+            </w:r>
+          </w:p>
+        </w:tc>
+        <w:tc>
+          <w:tcPr>
+            <w:tcW w:w="1440" w:type="dxa"/>
+            <w:shd w:val="clear" w:color="auto" w:fill="FFFFFF"/>
+            <w:tcMar>
+              <w:top w:w="40" w:type="dxa"/>
+              <w:left w:w="100" w:type="dxa"/>
+              <w:bottom w:w="40" w:type="dxa"/>
+              <w:right w:w="100" w:type="dxa"/>
+            </w:tcMar>
+            <w:vAlign w:val="center"/>
+          </w:tcPr>
+          <w:p>
+            <w:pPr>
+              <w:spacing w:before="20" w:after="20"/>
+              <w:jc w:val="right"/>
+            </w:pPr>
+            <w:r>
+              <w:rPr>
+                <w:color w:val="1A1A1A"/>
+                <w:sz w:val="18"/>
+                <w:szCs w:val="18"/>
+              </w:rPr>
+              <w:t>~37,700</w:t>
+            </w:r>
+          </w:p>
+        </w:tc>
+        <w:tc>
+          <w:tcPr>
+            <w:tcW w:w="1440" w:type="dxa"/>
+            <w:shd w:val="clear" w:color="auto" w:fill="FFFFFF"/>
+            <w:tcMar>
+              <w:top w:w="40" w:type="dxa"/>
+              <w:left w:w="100" w:type="dxa"/>
+              <w:bottom w:w="40" w:type="dxa"/>
+              <w:right w:w="100" w:type="dxa"/>
+            </w:tcMar>
+            <w:vAlign w:val="center"/>
+          </w:tcPr>
+          <w:p>
+            <w:pPr>
+              <w:spacing w:before="20" w:after="20"/>
+              <w:jc w:val="right"/>
+            </w:pPr>
+            <w:r>
+              <w:rPr>
+                <w:color w:val="1A1A1A"/>
+                <w:sz w:val="18"/>
+                <w:szCs w:val="18"/>
+              </w:rPr>
+              <w:t>~19,300</w:t>
             </w:r>
           </w:p>
         </w:tc>
@@ -12899,7 +13711,7 @@
       <w:tr>
         <w:tc>
           <w:tcPr>
-            <w:tcW w:w="3480" w:type="dxa"/>
+            <w:tcW w:w="2880" w:type="dxa"/>
             <w:shd w:val="clear" w:color="auto" w:fill="FFFFFF"/>
             <w:tcMar>
               <w:top w:w="40" w:type="dxa"/>
@@ -12925,7 +13737,7 @@
         </w:tc>
         <w:tc>
           <w:tcPr>
-            <w:tcW w:w="2200" w:type="dxa"/>
+            <w:tcW w:w="1440" w:type="dxa"/>
             <w:shd w:val="clear" w:color="auto" w:fill="FFFFFF"/>
             <w:tcMar>
               <w:top w:w="40" w:type="dxa"/>
@@ -12954,7 +13766,7 @@
         </w:tc>
         <w:tc>
           <w:tcPr>
-            <w:tcW w:w="2200" w:type="dxa"/>
+            <w:tcW w:w="1440" w:type="dxa"/>
             <w:shd w:val="clear" w:color="auto" w:fill="FFFFFF"/>
             <w:tcMar>
               <w:top w:w="40" w:type="dxa"/>
@@ -12981,7 +13793,7 @@
         </w:tc>
         <w:tc>
           <w:tcPr>
-            <w:tcW w:w="2200" w:type="dxa"/>
+            <w:tcW w:w="1440" w:type="dxa"/>
             <w:shd w:val="clear" w:color="auto" w:fill="FFFFFF"/>
             <w:tcMar>
               <w:top w:w="40" w:type="dxa"/>
@@ -13003,6 +13815,60 @@
                 <w:szCs w:val="18"/>
               </w:rPr>
               <w:t>6,648</w:t>
+            </w:r>
+          </w:p>
+        </w:tc>
+        <w:tc>
+          <w:tcPr>
+            <w:tcW w:w="1440" w:type="dxa"/>
+            <w:shd w:val="clear" w:color="auto" w:fill="FFFFFF"/>
+            <w:tcMar>
+              <w:top w:w="40" w:type="dxa"/>
+              <w:left w:w="100" w:type="dxa"/>
+              <w:bottom w:w="40" w:type="dxa"/>
+              <w:right w:w="100" w:type="dxa"/>
+            </w:tcMar>
+            <w:vAlign w:val="center"/>
+          </w:tcPr>
+          <w:p>
+            <w:pPr>
+              <w:spacing w:before="20" w:after="20"/>
+              <w:jc w:val="right"/>
+            </w:pPr>
+            <w:r>
+              <w:rPr>
+                <w:color w:val="1A1A1A"/>
+                <w:sz w:val="18"/>
+                <w:szCs w:val="18"/>
+              </w:rPr>
+              <w:t>~22,900</w:t>
+            </w:r>
+          </w:p>
+        </w:tc>
+        <w:tc>
+          <w:tcPr>
+            <w:tcW w:w="1440" w:type="dxa"/>
+            <w:shd w:val="clear" w:color="auto" w:fill="FFFFFF"/>
+            <w:tcMar>
+              <w:top w:w="40" w:type="dxa"/>
+              <w:left w:w="100" w:type="dxa"/>
+              <w:bottom w:w="40" w:type="dxa"/>
+              <w:right w:w="100" w:type="dxa"/>
+            </w:tcMar>
+            <w:vAlign w:val="center"/>
+          </w:tcPr>
+          <w:p>
+            <w:pPr>
+              <w:spacing w:before="20" w:after="20"/>
+              <w:jc w:val="right"/>
+            </w:pPr>
+            <w:r>
+              <w:rPr>
+                <w:color w:val="1A1A1A"/>
+                <w:sz w:val="18"/>
+                <w:szCs w:val="18"/>
+              </w:rPr>
+              <w:t>~12,300</w:t>
             </w:r>
           </w:p>
         </w:tc>
@@ -13010,7 +13876,7 @@
       <w:tr>
         <w:tc>
           <w:tcPr>
-            <w:tcW w:w="3480" w:type="dxa"/>
+            <w:tcW w:w="2880" w:type="dxa"/>
             <w:shd w:val="clear" w:color="auto" w:fill="FFFFFF"/>
             <w:tcMar>
               <w:top w:w="40" w:type="dxa"/>
@@ -13036,7 +13902,7 @@
         </w:tc>
         <w:tc>
           <w:tcPr>
-            <w:tcW w:w="2200" w:type="dxa"/>
+            <w:tcW w:w="1440" w:type="dxa"/>
             <w:shd w:val="clear" w:color="auto" w:fill="FFFFFF"/>
             <w:tcMar>
               <w:top w:w="40" w:type="dxa"/>
@@ -13065,7 +13931,7 @@
         </w:tc>
         <w:tc>
           <w:tcPr>
-            <w:tcW w:w="2200" w:type="dxa"/>
+            <w:tcW w:w="1440" w:type="dxa"/>
             <w:shd w:val="clear" w:color="auto" w:fill="FFFFFF"/>
             <w:tcMar>
               <w:top w:w="40" w:type="dxa"/>
@@ -13092,7 +13958,7 @@
         </w:tc>
         <w:tc>
           <w:tcPr>
-            <w:tcW w:w="2200" w:type="dxa"/>
+            <w:tcW w:w="1440" w:type="dxa"/>
             <w:shd w:val="clear" w:color="auto" w:fill="FFFFFF"/>
             <w:tcMar>
               <w:top w:w="40" w:type="dxa"/>
@@ -13114,6 +13980,60 @@
                 <w:szCs w:val="18"/>
               </w:rPr>
               <w:t>2,058</w:t>
+            </w:r>
+          </w:p>
+        </w:tc>
+        <w:tc>
+          <w:tcPr>
+            <w:tcW w:w="1440" w:type="dxa"/>
+            <w:shd w:val="clear" w:color="auto" w:fill="FFFFFF"/>
+            <w:tcMar>
+              <w:top w:w="40" w:type="dxa"/>
+              <w:left w:w="100" w:type="dxa"/>
+              <w:bottom w:w="40" w:type="dxa"/>
+              <w:right w:w="100" w:type="dxa"/>
+            </w:tcMar>
+            <w:vAlign w:val="center"/>
+          </w:tcPr>
+          <w:p>
+            <w:pPr>
+              <w:spacing w:before="20" w:after="20"/>
+              <w:jc w:val="right"/>
+            </w:pPr>
+            <w:r>
+              <w:rPr>
+                <w:color w:val="1A1A1A"/>
+                <w:sz w:val="18"/>
+                <w:szCs w:val="18"/>
+              </w:rPr>
+              <w:t>~26,000</w:t>
+            </w:r>
+          </w:p>
+        </w:tc>
+        <w:tc>
+          <w:tcPr>
+            <w:tcW w:w="1440" w:type="dxa"/>
+            <w:shd w:val="clear" w:color="auto" w:fill="FFFFFF"/>
+            <w:tcMar>
+              <w:top w:w="40" w:type="dxa"/>
+              <w:left w:w="100" w:type="dxa"/>
+              <w:bottom w:w="40" w:type="dxa"/>
+              <w:right w:w="100" w:type="dxa"/>
+            </w:tcMar>
+            <w:vAlign w:val="center"/>
+          </w:tcPr>
+          <w:p>
+            <w:pPr>
+              <w:spacing w:before="20" w:after="20"/>
+              <w:jc w:val="right"/>
+            </w:pPr>
+            <w:r>
+              <w:rPr>
+                <w:color w:val="1A1A1A"/>
+                <w:sz w:val="18"/>
+                <w:szCs w:val="18"/>
+              </w:rPr>
+              <w:t>~12,900</w:t>
             </w:r>
           </w:p>
         </w:tc>
@@ -13121,7 +14041,7 @@
       <w:tr>
         <w:tc>
           <w:tcPr>
-            <w:tcW w:w="3480" w:type="dxa"/>
+            <w:tcW w:w="2880" w:type="dxa"/>
             <w:shd w:val="clear" w:color="auto" w:fill="FFFFFF"/>
             <w:tcMar>
               <w:top w:w="40" w:type="dxa"/>
@@ -13147,7 +14067,7 @@
         </w:tc>
         <w:tc>
           <w:tcPr>
-            <w:tcW w:w="2200" w:type="dxa"/>
+            <w:tcW w:w="1440" w:type="dxa"/>
             <w:shd w:val="clear" w:color="auto" w:fill="FFFFFF"/>
             <w:tcMar>
               <w:top w:w="40" w:type="dxa"/>
@@ -13176,7 +14096,7 @@
         </w:tc>
         <w:tc>
           <w:tcPr>
-            <w:tcW w:w="2200" w:type="dxa"/>
+            <w:tcW w:w="1440" w:type="dxa"/>
             <w:shd w:val="clear" w:color="auto" w:fill="FFFFFF"/>
             <w:tcMar>
               <w:top w:w="40" w:type="dxa"/>
@@ -13203,7 +14123,7 @@
         </w:tc>
         <w:tc>
           <w:tcPr>
-            <w:tcW w:w="2200" w:type="dxa"/>
+            <w:tcW w:w="1440" w:type="dxa"/>
             <w:shd w:val="clear" w:color="auto" w:fill="FFFFFF"/>
             <w:tcMar>
               <w:top w:w="40" w:type="dxa"/>
@@ -13225,6 +14145,60 @@
                 <w:szCs w:val="18"/>
               </w:rPr>
               <w:t>1,096</w:t>
+            </w:r>
+          </w:p>
+        </w:tc>
+        <w:tc>
+          <w:tcPr>
+            <w:tcW w:w="1440" w:type="dxa"/>
+            <w:shd w:val="clear" w:color="auto" w:fill="FFFFFF"/>
+            <w:tcMar>
+              <w:top w:w="40" w:type="dxa"/>
+              <w:left w:w="100" w:type="dxa"/>
+              <w:bottom w:w="40" w:type="dxa"/>
+              <w:right w:w="100" w:type="dxa"/>
+            </w:tcMar>
+            <w:vAlign w:val="center"/>
+          </w:tcPr>
+          <w:p>
+            <w:pPr>
+              <w:spacing w:before="20" w:after="20"/>
+              <w:jc w:val="right"/>
+            </w:pPr>
+            <w:r>
+              <w:rPr>
+                <w:color w:val="1A1A1A"/>
+                <w:sz w:val="18"/>
+                <w:szCs w:val="18"/>
+              </w:rPr>
+              <w:t>~6,000</w:t>
+            </w:r>
+          </w:p>
+        </w:tc>
+        <w:tc>
+          <w:tcPr>
+            <w:tcW w:w="1440" w:type="dxa"/>
+            <w:shd w:val="clear" w:color="auto" w:fill="FFFFFF"/>
+            <w:tcMar>
+              <w:top w:w="40" w:type="dxa"/>
+              <w:left w:w="100" w:type="dxa"/>
+              <w:bottom w:w="40" w:type="dxa"/>
+              <w:right w:w="100" w:type="dxa"/>
+            </w:tcMar>
+            <w:vAlign w:val="center"/>
+          </w:tcPr>
+          <w:p>
+            <w:pPr>
+              <w:spacing w:before="20" w:after="20"/>
+              <w:jc w:val="right"/>
+            </w:pPr>
+            <w:r>
+              <w:rPr>
+                <w:color w:val="1A1A1A"/>
+                <w:sz w:val="18"/>
+                <w:szCs w:val="18"/>
+              </w:rPr>
+              <w:t>~3,900</w:t>
             </w:r>
           </w:p>
         </w:tc>
@@ -13232,7 +14206,7 @@
       <w:tr>
         <w:tc>
           <w:tcPr>
-            <w:tcW w:w="3480" w:type="dxa"/>
+            <w:tcW w:w="2880" w:type="dxa"/>
             <w:shd w:val="clear" w:color="auto" w:fill="FFFFFF"/>
             <w:tcMar>
               <w:top w:w="40" w:type="dxa"/>
@@ -13258,7 +14232,7 @@
         </w:tc>
         <w:tc>
           <w:tcPr>
-            <w:tcW w:w="2200" w:type="dxa"/>
+            <w:tcW w:w="1440" w:type="dxa"/>
             <w:shd w:val="clear" w:color="auto" w:fill="FFFFFF"/>
             <w:tcMar>
               <w:top w:w="40" w:type="dxa"/>
@@ -13287,7 +14261,7 @@
         </w:tc>
         <w:tc>
           <w:tcPr>
-            <w:tcW w:w="2200" w:type="dxa"/>
+            <w:tcW w:w="1440" w:type="dxa"/>
             <w:shd w:val="clear" w:color="auto" w:fill="FFFFFF"/>
             <w:tcMar>
               <w:top w:w="40" w:type="dxa"/>
@@ -13314,7 +14288,7 @@
         </w:tc>
         <w:tc>
           <w:tcPr>
-            <w:tcW w:w="2200" w:type="dxa"/>
+            <w:tcW w:w="1440" w:type="dxa"/>
             <w:shd w:val="clear" w:color="auto" w:fill="FFFFFF"/>
             <w:tcMar>
               <w:top w:w="40" w:type="dxa"/>
@@ -13336,6 +14310,60 @@
                 <w:szCs w:val="18"/>
               </w:rPr>
               <w:t>+21.9%</w:t>
+            </w:r>
+          </w:p>
+        </w:tc>
+        <w:tc>
+          <w:tcPr>
+            <w:tcW w:w="1440" w:type="dxa"/>
+            <w:shd w:val="clear" w:color="auto" w:fill="FFFFFF"/>
+            <w:tcMar>
+              <w:top w:w="40" w:type="dxa"/>
+              <w:left w:w="100" w:type="dxa"/>
+              <w:bottom w:w="40" w:type="dxa"/>
+              <w:right w:w="100" w:type="dxa"/>
+            </w:tcMar>
+            <w:vAlign w:val="center"/>
+          </w:tcPr>
+          <w:p>
+            <w:pPr>
+              <w:spacing w:before="20" w:after="20"/>
+              <w:jc w:val="right"/>
+            </w:pPr>
+            <w:r>
+              <w:rPr>
+                <w:color w:val="1A1A1A"/>
+                <w:sz w:val="18"/>
+                <w:szCs w:val="18"/>
+              </w:rPr>
+              <w:t>+2.4%</w:t>
+            </w:r>
+          </w:p>
+        </w:tc>
+        <w:tc>
+          <w:tcPr>
+            <w:tcW w:w="1440" w:type="dxa"/>
+            <w:shd w:val="clear" w:color="auto" w:fill="FFFFFF"/>
+            <w:tcMar>
+              <w:top w:w="40" w:type="dxa"/>
+              <w:left w:w="100" w:type="dxa"/>
+              <w:bottom w:w="40" w:type="dxa"/>
+              <w:right w:w="100" w:type="dxa"/>
+            </w:tcMar>
+            <w:vAlign w:val="center"/>
+          </w:tcPr>
+          <w:p>
+            <w:pPr>
+              <w:spacing w:before="20" w:after="20"/>
+              <w:jc w:val="right"/>
+            </w:pPr>
+            <w:r>
+              <w:rPr>
+                <w:color w:val="1A1A1A"/>
+                <w:sz w:val="18"/>
+                <w:szCs w:val="18"/>
+              </w:rPr>
+              <w:t>+11.0%</w:t>
             </w:r>
           </w:p>
         </w:tc>
@@ -13344,7 +14372,7 @@
         <w:tc>
           <w:tcPr>
             <w:tcW w:w="10080" w:type="dxa"/>
-            <w:gridSpan w:val="4"/>
+            <w:gridSpan w:val="6"/>
             <w:shd w:val="clear" w:color="auto" w:fill="EDF2F7"/>
             <w:tcMar>
               <w:top w:w="40" w:type="dxa"/>
@@ -13374,7 +14402,7 @@
       <w:tr>
         <w:tc>
           <w:tcPr>
-            <w:tcW w:w="3480" w:type="dxa"/>
+            <w:tcW w:w="2880" w:type="dxa"/>
             <w:shd w:val="clear" w:color="auto" w:fill="FFFFFF"/>
             <w:tcMar>
               <w:top w:w="40" w:type="dxa"/>
@@ -13400,7 +14428,7 @@
         </w:tc>
         <w:tc>
           <w:tcPr>
-            <w:tcW w:w="2200" w:type="dxa"/>
+            <w:tcW w:w="1440" w:type="dxa"/>
             <w:shd w:val="clear" w:color="auto" w:fill="FFFFFF"/>
             <w:tcMar>
               <w:top w:w="40" w:type="dxa"/>
@@ -13429,7 +14457,7 @@
         </w:tc>
         <w:tc>
           <w:tcPr>
-            <w:tcW w:w="2200" w:type="dxa"/>
+            <w:tcW w:w="1440" w:type="dxa"/>
             <w:shd w:val="clear" w:color="auto" w:fill="FFFFFF"/>
             <w:tcMar>
               <w:top w:w="40" w:type="dxa"/>
@@ -13456,7 +14484,7 @@
         </w:tc>
         <w:tc>
           <w:tcPr>
-            <w:tcW w:w="2200" w:type="dxa"/>
+            <w:tcW w:w="1440" w:type="dxa"/>
             <w:shd w:val="clear" w:color="auto" w:fill="FFFFFF"/>
             <w:tcMar>
               <w:top w:w="40" w:type="dxa"/>
@@ -13478,6 +14506,60 @@
                 <w:szCs w:val="18"/>
               </w:rPr>
               <w:t>Ba3/Positive</w:t>
+            </w:r>
+          </w:p>
+        </w:tc>
+        <w:tc>
+          <w:tcPr>
+            <w:tcW w:w="1440" w:type="dxa"/>
+            <w:shd w:val="clear" w:color="auto" w:fill="FFFFFF"/>
+            <w:tcMar>
+              <w:top w:w="40" w:type="dxa"/>
+              <w:left w:w="100" w:type="dxa"/>
+              <w:bottom w:w="40" w:type="dxa"/>
+              <w:right w:w="100" w:type="dxa"/>
+            </w:tcMar>
+            <w:vAlign w:val="center"/>
+          </w:tcPr>
+          <w:p>
+            <w:pPr>
+              <w:spacing w:before="20" w:after="20"/>
+              <w:jc w:val="right"/>
+            </w:pPr>
+            <w:r>
+              <w:rPr>
+                <w:color w:val="1A1A1A"/>
+                <w:sz w:val="18"/>
+                <w:szCs w:val="18"/>
+              </w:rPr>
+              <w:t>Baa1/Stable</w:t>
+            </w:r>
+          </w:p>
+        </w:tc>
+        <w:tc>
+          <w:tcPr>
+            <w:tcW w:w="1440" w:type="dxa"/>
+            <w:shd w:val="clear" w:color="auto" w:fill="FFFFFF"/>
+            <w:tcMar>
+              <w:top w:w="40" w:type="dxa"/>
+              <w:left w:w="100" w:type="dxa"/>
+              <w:bottom w:w="40" w:type="dxa"/>
+              <w:right w:w="100" w:type="dxa"/>
+            </w:tcMar>
+            <w:vAlign w:val="center"/>
+          </w:tcPr>
+          <w:p>
+            <w:pPr>
+              <w:spacing w:before="20" w:after="20"/>
+              <w:jc w:val="right"/>
+            </w:pPr>
+            <w:r>
+              <w:rPr>
+                <w:color w:val="1A1A1A"/>
+                <w:sz w:val="18"/>
+                <w:szCs w:val="18"/>
+              </w:rPr>
+              <w:t>Baa3/Stable</w:t>
             </w:r>
           </w:p>
         </w:tc>
@@ -13485,7 +14567,7 @@
       <w:tr>
         <w:tc>
           <w:tcPr>
-            <w:tcW w:w="3480" w:type="dxa"/>
+            <w:tcW w:w="2880" w:type="dxa"/>
             <w:shd w:val="clear" w:color="auto" w:fill="FFFFFF"/>
             <w:tcMar>
               <w:top w:w="40" w:type="dxa"/>
@@ -13511,7 +14593,7 @@
         </w:tc>
         <w:tc>
           <w:tcPr>
-            <w:tcW w:w="2200" w:type="dxa"/>
+            <w:tcW w:w="1440" w:type="dxa"/>
             <w:shd w:val="clear" w:color="auto" w:fill="FFFFFF"/>
             <w:tcMar>
               <w:top w:w="40" w:type="dxa"/>
@@ -13540,7 +14622,7 @@
         </w:tc>
         <w:tc>
           <w:tcPr>
-            <w:tcW w:w="2200" w:type="dxa"/>
+            <w:tcW w:w="1440" w:type="dxa"/>
             <w:shd w:val="clear" w:color="auto" w:fill="FFFFFF"/>
             <w:tcMar>
               <w:top w:w="40" w:type="dxa"/>
@@ -13567,7 +14649,7 @@
         </w:tc>
         <w:tc>
           <w:tcPr>
-            <w:tcW w:w="2200" w:type="dxa"/>
+            <w:tcW w:w="1440" w:type="dxa"/>
             <w:shd w:val="clear" w:color="auto" w:fill="FFFFFF"/>
             <w:tcMar>
               <w:top w:w="40" w:type="dxa"/>
@@ -13589,6 +14671,60 @@
                 <w:szCs w:val="18"/>
               </w:rPr>
               <w:t>BB/Stable</w:t>
+            </w:r>
+          </w:p>
+        </w:tc>
+        <w:tc>
+          <w:tcPr>
+            <w:tcW w:w="1440" w:type="dxa"/>
+            <w:shd w:val="clear" w:color="auto" w:fill="FFFFFF"/>
+            <w:tcMar>
+              <w:top w:w="40" w:type="dxa"/>
+              <w:left w:w="100" w:type="dxa"/>
+              <w:bottom w:w="40" w:type="dxa"/>
+              <w:right w:w="100" w:type="dxa"/>
+            </w:tcMar>
+            <w:vAlign w:val="center"/>
+          </w:tcPr>
+          <w:p>
+            <w:pPr>
+              <w:spacing w:before="20" w:after="20"/>
+              <w:jc w:val="right"/>
+            </w:pPr>
+            <w:r>
+              <w:rPr>
+                <w:color w:val="1A1A1A"/>
+                <w:sz w:val="18"/>
+                <w:szCs w:val="18"/>
+              </w:rPr>
+              <w:t>BBB-/Stable</w:t>
+            </w:r>
+          </w:p>
+        </w:tc>
+        <w:tc>
+          <w:tcPr>
+            <w:tcW w:w="1440" w:type="dxa"/>
+            <w:shd w:val="clear" w:color="auto" w:fill="FFFFFF"/>
+            <w:tcMar>
+              <w:top w:w="40" w:type="dxa"/>
+              <w:left w:w="100" w:type="dxa"/>
+              <w:bottom w:w="40" w:type="dxa"/>
+              <w:right w:w="100" w:type="dxa"/>
+            </w:tcMar>
+            <w:vAlign w:val="center"/>
+          </w:tcPr>
+          <w:p>
+            <w:pPr>
+              <w:spacing w:before="20" w:after="20"/>
+              <w:jc w:val="right"/>
+            </w:pPr>
+            <w:r>
+              <w:rPr>
+                <w:color w:val="1A1A1A"/>
+                <w:sz w:val="18"/>
+                <w:szCs w:val="18"/>
+              </w:rPr>
+              <w:t>BBB-/Stable</w:t>
             </w:r>
           </w:p>
         </w:tc>
@@ -13596,7 +14732,7 @@
       <w:tr>
         <w:tc>
           <w:tcPr>
-            <w:tcW w:w="3480" w:type="dxa"/>
+            <w:tcW w:w="2880" w:type="dxa"/>
             <w:shd w:val="clear" w:color="auto" w:fill="FFFFFF"/>
             <w:tcMar>
               <w:top w:w="40" w:type="dxa"/>
@@ -13622,7 +14758,7 @@
         </w:tc>
         <w:tc>
           <w:tcPr>
-            <w:tcW w:w="2200" w:type="dxa"/>
+            <w:tcW w:w="1440" w:type="dxa"/>
             <w:shd w:val="clear" w:color="auto" w:fill="FFFFFF"/>
             <w:tcMar>
               <w:top w:w="40" w:type="dxa"/>
@@ -13651,7 +14787,7 @@
         </w:tc>
         <w:tc>
           <w:tcPr>
-            <w:tcW w:w="2200" w:type="dxa"/>
+            <w:tcW w:w="1440" w:type="dxa"/>
             <w:shd w:val="clear" w:color="auto" w:fill="FFFFFF"/>
             <w:tcMar>
               <w:top w:w="40" w:type="dxa"/>
@@ -13678,7 +14814,61 @@
         </w:tc>
         <w:tc>
           <w:tcPr>
-            <w:tcW w:w="2200" w:type="dxa"/>
+            <w:tcW w:w="1440" w:type="dxa"/>
+            <w:shd w:val="clear" w:color="auto" w:fill="FFFFFF"/>
+            <w:tcMar>
+              <w:top w:w="40" w:type="dxa"/>
+              <w:left w:w="100" w:type="dxa"/>
+              <w:bottom w:w="40" w:type="dxa"/>
+              <w:right w:w="100" w:type="dxa"/>
+            </w:tcMar>
+            <w:vAlign w:val="center"/>
+          </w:tcPr>
+          <w:p>
+            <w:pPr>
+              <w:spacing w:before="20" w:after="20"/>
+              <w:jc w:val="right"/>
+            </w:pPr>
+            <w:r>
+              <w:rPr>
+                <w:color w:val="1A1A1A"/>
+                <w:sz w:val="18"/>
+                <w:szCs w:val="18"/>
+              </w:rPr>
+              <w:t>—</w:t>
+            </w:r>
+          </w:p>
+        </w:tc>
+        <w:tc>
+          <w:tcPr>
+            <w:tcW w:w="1440" w:type="dxa"/>
+            <w:shd w:val="clear" w:color="auto" w:fill="FFFFFF"/>
+            <w:tcMar>
+              <w:top w:w="40" w:type="dxa"/>
+              <w:left w:w="100" w:type="dxa"/>
+              <w:bottom w:w="40" w:type="dxa"/>
+              <w:right w:w="100" w:type="dxa"/>
+            </w:tcMar>
+            <w:vAlign w:val="center"/>
+          </w:tcPr>
+          <w:p>
+            <w:pPr>
+              <w:spacing w:before="20" w:after="20"/>
+              <w:jc w:val="right"/>
+            </w:pPr>
+            <w:r>
+              <w:rPr>
+                <w:color w:val="1A1A1A"/>
+                <w:sz w:val="18"/>
+                <w:szCs w:val="18"/>
+              </w:rPr>
+              <w:t>BBB-/Stable</w:t>
+            </w:r>
+          </w:p>
+        </w:tc>
+        <w:tc>
+          <w:tcPr>
+            <w:tcW w:w="1440" w:type="dxa"/>
             <w:shd w:val="clear" w:color="auto" w:fill="FFFFFF"/>
             <w:tcMar>
               <w:top w:w="40" w:type="dxa"/>
@@ -13711,13 +14901,11 @@
       </w:pPr>
       <w:r>
         <w:rPr>
-          <w:i/>
-          <w:iCs/>
-          <w:color w:val="777777"/>
+          <w:color w:val="595959"/>
           <w:sz w:val="16"/>
           <w:szCs w:val="16"/>
         </w:rPr>
-        <w:t>¹ NBU NPL is shown on the IFRS Stage 3 / gross-loans basis (4.2%) for comparability with peers; NBU’s regulatory NPL reported to the CBU is 2.8%, and the 5.6% figure cited elsewhere is the provision-to-gross-loans coverage ratio (not an NPL ratio). ² Agrobank reported-period net interest income is not reliably disclosed and is marked n.a. * LCR/NSFR are FID estimates derived from maturity-analysis disclosures; actual CBU-calculated ratios may differ. Basis: all three banks are shown on a 2025 1H basis as at 30 June 2025 — NBU = reviewed interim IFRS FS (six months to 30 June 2025); SQB = 2025 H1 (internal accounting); Agrobank = 2025 H1 IFRS (EY-reviewed, 30 Jun 2025). NBU net profit and net interest income are six-month figures; the annualised net-profit line and the ROE, ROA and NIM ratios annualise the six-month result (×2) for a like-for-like comparison with the peers’ annualised figures. NBU’s YoY loan portfolio growth is shown as the movement over the six months from 31 December 2024. FX uniform at USD/UZS = 12,150. Source: attached Peer Comparison KPI workbook; Central Bank of Uzbekistan; banks’ financial statements.</w:t>
+        <w:t>All five banks are shown on a 2025 1H basis as at 30 June 2025; monetary KPIs in USD million, ratios in per cent. Only ROE and ROA are annualised (six-month result × 2); net profit and net interest income are six-month (1H 2025) figures and NIM is each bank’s published period margin. FX uniform at USD/UZS = 12,150 and USD/KZT = 519.73 (period-end, 30 June 2025). ¹ NBU NPL is shown on the IFRS Stage 3 / gross-loans basis (4.2%); NBU’s regulatory NPL reported to the CBU is 2.8%, and the 5.6% figure cited elsewhere is the provision-to-gross-loans coverage ratio (not an NPL ratio). ² Agrobank reported-period net interest income is not reliably disclosed and is marked n.a. ³ Kaspi.kz reports as a diversified payments/marketplace/fintech group and does not disclose NIM, cost-to-income, ROE, ROA, regulatory capital or NPL coverage on a comparable banking basis (marked n.a.); its 1H 2025 net profit of about USD 987 million (KZT 513 billion) is the consolidated figure including the Hepsiburada/Türkiye operations. Figures marked “~” for Halyk and Kaspi (net interest income, ROA, capital, LDR, and the balance-sheet scale lines) are FID estimates derived from each bank’s 1H 2025 results releases, disclosed growth rates and period-end positions, pending the full interim IFRS statements; SQB and Agrobank figures, and the NBU LCR/NSFR marked *, are FID estimates as in Section 2.4. Sources: Halyk Bank 1H 2025 results (19 August 2025) and Kaspi.kz 2Q &amp; 1H 2025 results (4 August 2025); Central Bank of Uzbekistan; and Moody’s, Fitch and S&amp;P rating publications. Halyk: Moody’s Baa1, Fitch BBB-, S&amp;P BBB- (all Stable). Kaspi.kz: Moody’s Baa3, Fitch BBB- (Stable); not rated by S&amp;P.</w:t>
       </w:r>
     </w:p>
     <w:p>

</xml_diff>

<commit_message>
Surface covenants/credit enhancement and Almaty pending status in Transaction Summary
- Note ICBC Almaty Branch's internal rating and credit limit approval for
  NBU remain internally in progress (ref Section 1.4)
- Confirm the Facility is senior unsecured with no third-party guarantee,
  SBLC or security package; risk mitigated via quasi-sovereign status and
  the covenant/monitoring package (ref Sections 7.2 and 7.3)
</commit_message>
<xml_diff>
--- a/NBU_Credit_Limit_Report_Jun_26.docx
+++ b/NBU_Credit_Limit_Report_Jun_26.docx
@@ -500,7 +500,7 @@
         <w:rPr>
           <w:color w:val="1A1A1A"/>
         </w:rPr>
-        <w:t>NBU has mandated Mashreqbank psc ("Mashreq") and Bank of China (Dubai) Branch ("BOC Dubai"), together the Initial Mandated Lead Arrangers and Bookrunners (the "IMLABs"), to arrange and coordinate the syndication of a CNH-denominated senior unsecured term loan facility of up to CNH 2.0 billion (the "Facility"), launching at CNH 1.0 billion with a green-shoe option. The Facility has a three-year tenor, carries a fixed interest rate of 3.8% per annum and a 0.6% flat upfront fee, and is being documented on LMA terms. FID proposes that ICBC (DIFC Branch) participate in the Facility as a lender. ICBC Almaty Branch is the client management branch for NBU; however, under Kazakhstan law ICBC Almaty Branch may sign the commitment letter only on its own behalf and cannot extend its commitment to other ICBC branches. Accordingly, and given the larger commitment amount in this syndicated loan, ICBC (DIFC Branch) will act as the Face Lender as between ICBC (DIFC Branch) and ICBC (Asia), with ICBC (DIFC Branch) applying for a CNH 300 million commitment and the remaining CNH 100 million committed by ICBC (Asia). Bank of China (Dubai) Branch, as coordinator, is expected to commit CNH 500 million (understood to have been approved within Bank of China (Dubai)); the ICBC Group, with an aggregate commitment of CNH 400 million, will therefore not be the largest lender in the syndicate. To our knowledge, no other Chinese bank will participate in the syndication.</w:t>
+        <w:t>NBU has mandated Mashreqbank psc ("Mashreq") and Bank of China (Dubai) Branch ("BOC Dubai"), together the Initial Mandated Lead Arrangers and Bookrunners (the "IMLABs"), to arrange and coordinate the syndication of a CNH-denominated senior unsecured term loan facility of up to CNH 2.0 billion (the "Facility"), launching at CNH 1.0 billion with a green-shoe option. The Facility has a three-year tenor, carries a fixed interest rate of 3.8% per annum and a 0.6% flat upfront fee, and is being documented on LMA terms. FID proposes that ICBC (DIFC Branch) participate in the Facility as a lender. ICBC Almaty Branch is the client management branch for NBU; however, under Kazakhstan law ICBC Almaty Branch may sign the commitment letter only on its own behalf and cannot extend its commitment to other ICBC branches; ICBC Almaty Branch's internal rating and credit limit approval for NBU also remain internally in progress (see Section 1.4). Accordingly, and given the larger commitment amount in this syndicated loan, ICBC (DIFC Branch) will act as the Face Lender as between ICBC (DIFC Branch) and ICBC (Asia), with ICBC (DIFC Branch) applying for a CNH 300 million commitment and the remaining CNH 100 million committed by ICBC (Asia). Bank of China (Dubai) Branch, as coordinator, is expected to commit CNH 500 million (understood to have been approved within Bank of China (Dubai)); the ICBC Group, with an aggregate commitment of CNH 400 million, will therefore not be the largest lender in the syndicate. To our knowledge, no other Chinese bank will participate in the syndication.</w:t>
       </w:r>
     </w:p>
     <w:p>
@@ -1607,7 +1607,7 @@
         <w:rPr>
           <w:color w:val="1A1A1A"/>
         </w:rPr>
-        <w:t>ICBC (DIFC Branch)'s participation is proposed at CNH 300 million, subject to FID approval, and is within the maximum supportable limit assessed in Section 6 (USD 51.4 million). The economics of the proposed participation are set out in Section 8 (Cost-Income Analysis), and the credit terms, financial covenants and risk mitigants in Section 7. The Facility includes binding financial covenants - a minimum Capital Adequacy Ratio of the higher of 13% or the CBU-prescribed minimum, and an NPL ratio not exceeding 7% - together with the customary LMA mandatory-prepayment triggers (including a two-notch downgrade of the sovereign or the Borrower, change of control, and sanctions events).</w:t>
+        <w:t>ICBC (DIFC Branch)'s participation is proposed at CNH 300 million, subject to FID approval, and is within the maximum supportable limit assessed in Section 6 (USD 51.4 million). The economics of the proposed participation are set out in Section 8 (Cost-Income Analysis), and the credit terms, financial covenants and risk mitigants in Section 7. The Facility is senior unsecured and, in the base case, is not supported by any third-party guarantee, standby letter of credit (SBLC) or dedicated security package; credit risk is mitigated through NBU's quasi-sovereign status and the covenant and monitoring package described in Section 7 (see Sections 7.2 and 7.3). The Facility includes binding financial covenants - a minimum Capital Adequacy Ratio of the higher of 13% or the CBU-prescribed minimum, and an NPL ratio not exceeding 7% - together with the customary LMA mandatory-prepayment triggers (including a two-notch downgrade of the sovereign or the Borrower, change of control, and sanctions events).</w:t>
       </w:r>
     </w:p>
     <w:p>

</xml_diff>